<commit_message>
Update user guide and pricing help copy
</commit_message>
<xml_diff>
--- a/TOAN_AAS_HUONG_DAN_SU_DUNG_CHO_KHACH_V2.docx
+++ b/TOAN_AAS_HUONG_DAN_SU_DUNG_CHO_KHACH_V2.docx
@@ -97,7 +97,7 @@
                 <w:color w:val="182420"/>
                 <w:sz w:val="20"/>
               </w:rPr>
-              <w:t>V2 - cập nhật 13/06/2026</w:t>
+              <w:t>V2 - cập nhật 23/06/2026</w:t>
             </w:r>
           </w:p>
         </w:tc>
@@ -272,7 +272,7 @@
           <w:color w:val="182420"/>
           <w:sz w:val="22"/>
         </w:rPr>
-        <w:t>TOAN AAS là hệ thống AI Automation System vận hành chủ yếu qua Telegram. Hệ thống hỗ trợ tạo nội dung, ảnh, video, voice, phụ đề, xử lý tài liệu, hỗ trợ khách hàng/ticket và các dịch vụ Premium hoặc bot riêng.</w:t>
+        <w:t>TOAN AAS là hệ thống AI vận hành chủ yếu qua Telegram. Hệ thống hỗ trợ tạo ảnh, video, âm thanh, phụ đề, dịch, lồng tiếng, xử lý tài liệu, nội dung AI và hỗ trợ khách hàng theo từng bước rõ ràng.</w:t>
       </w:r>
     </w:p>
     <w:p>
@@ -282,7 +282,7 @@
           <w:color w:val="182420"/>
           <w:sz w:val="22"/>
         </w:rPr>
-        <w:t>TOAN AAS không chỉ là bot tạo video pack. Mục tiêu của hệ thống là kết nối nhiều công cụ thành quy trình rõ ràng, giúp cá nhân, shop, affiliate và doanh nghiệp hoàn thành công việc với ít thao tác hơn.</w:t>
+        <w:t>Bạn không cần tự nhớ nhiều lệnh phức tạp. Hãy mở menu, chọn tính năng, gửi mô tả, xem chi phí nếu có và xác nhận trước khi hệ thống xử lý.</w:t>
       </w:r>
     </w:p>
     <w:p>
@@ -292,7 +292,7 @@
           <w:color w:val="182420"/>
           <w:sz w:val="22"/>
         </w:rPr>
-        <w:t>Một số tính năng phụ thuộc nhà cung cấp AI hoặc Local Worker và có thể được mở dần. Nếu công cụ chưa sẵn sàng, bot sẽ báo rõ và không trừ Xu.</w:t>
+        <w:t>TOAN AAS không yêu cầu người dùng gửi mật khẩu mạng xã hội, thông tin thẻ thanh toán, mã OTP hoặc dữ liệu bảo mật cá nhân qua bot.</w:t>
       </w:r>
     </w:p>
     <w:p>
@@ -305,7 +305,7 @@
           <w:color w:val="182420"/>
           <w:sz w:val="22"/>
         </w:rPr>
-        <w:t>2. Bắt đầu sử dụng</w:t>
+        <w:t>2. Bắt đầu nhanh</w:t>
       </w:r>
     </w:p>
     <w:p>
@@ -318,24 +318,7 @@
           <w:color w:val="182420"/>
           <w:sz w:val="22"/>
         </w:rPr>
-        <w:t xml:space="preserve">Mở Telegram và tìm </w:t>
-      </w:r>
-      <w:r>
-        <w:rPr>
-          <w:rFonts w:ascii="Calibri" w:hAnsi="Calibri"/>
-          <w:b/>
-          <w:color w:val="08734F"/>
-          <w:sz w:val="22"/>
-        </w:rPr>
-        <w:t>@toanaasbot (https://t.me/toanaasbot)</w:t>
-      </w:r>
-      <w:r>
-        <w:rPr>
-          <w:rFonts w:ascii="Calibri" w:hAnsi="Calibri"/>
-          <w:color w:val="182420"/>
-          <w:sz w:val="22"/>
-        </w:rPr>
-        <w:t>.</w:t>
+        <w:t>Mở Telegram và tìm @toanaasbot.</w:t>
       </w:r>
     </w:p>
     <w:p>
@@ -348,24 +331,7 @@
           <w:color w:val="182420"/>
           <w:sz w:val="22"/>
         </w:rPr>
-        <w:t xml:space="preserve">Bấm </w:t>
-      </w:r>
-      <w:r>
-        <w:rPr>
-          <w:rFonts w:ascii="Calibri" w:hAnsi="Calibri"/>
-          <w:b/>
-          <w:color w:val="182420"/>
-          <w:sz w:val="22"/>
-        </w:rPr>
-        <w:t>Start</w:t>
-      </w:r>
-      <w:r>
-        <w:rPr>
-          <w:rFonts w:ascii="Calibri" w:hAnsi="Calibri"/>
-          <w:color w:val="182420"/>
-          <w:sz w:val="22"/>
-        </w:rPr>
-        <w:t xml:space="preserve"> hoặc gửi </w:t>
+        <w:t xml:space="preserve">Bấm Start hoặc gửi </w:t>
       </w:r>
       <w:r>
         <w:rPr>
@@ -394,7 +360,7 @@
           <w:color w:val="182420"/>
           <w:sz w:val="22"/>
         </w:rPr>
-        <w:t>Chọn ngôn ngữ nếu bot yêu cầu.</w:t>
+        <w:t>Chọn tính năng muốn dùng: Tạo ảnh, Tạo video, Âm thanh, Tài liệu hoặc Dịch thuật.</w:t>
       </w:r>
     </w:p>
     <w:p>
@@ -407,7 +373,7 @@
           <w:color w:val="182420"/>
           <w:sz w:val="22"/>
         </w:rPr>
-        <w:t>Xem menu chính và chọn nhóm công cụ phù hợp.</w:t>
+        <w:t>Gửi mô tả rõ mục tiêu, sản phẩm, phong cách, nền tảng đăng và yêu cầu riêng.</w:t>
       </w:r>
     </w:p>
     <w:p>
@@ -420,7 +386,7 @@
           <w:color w:val="182420"/>
           <w:sz w:val="22"/>
         </w:rPr>
-        <w:t>Mở mục tài khoản để kiểm tra số dư Xu.</w:t>
+        <w:t>Chọn gói phù hợp nếu tính năng có nhiều mức giá.</w:t>
       </w:r>
     </w:p>
     <w:p>
@@ -433,7 +399,180 @@
           <w:color w:val="182420"/>
           <w:sz w:val="22"/>
         </w:rPr>
-        <w:t>Đọc màn xác nhận chi phí trước khi chạy tác vụ có tính phí.</w:t>
+        <w:t>Kiểm tra bản xem trước, bảng giá và thông tin xác nhận.</w:t>
+      </w:r>
+    </w:p>
+    <w:p>
+      <w:pPr>
+        <w:pStyle w:val="ListNumber"/>
+      </w:pPr>
+      <w:r>
+        <w:rPr>
+          <w:rFonts w:ascii="Calibri" w:hAnsi="Calibri"/>
+          <w:color w:val="182420"/>
+          <w:sz w:val="22"/>
+        </w:rPr>
+        <w:t>Chỉ khi bạn xác nhận, hệ thống mới xử lý và mới trừ Xu nếu bước đó có phí.</w:t>
+      </w:r>
+    </w:p>
+    <w:p>
+      <w:pPr>
+        <w:pStyle w:val="ListNumber"/>
+      </w:pPr>
+      <w:r>
+        <w:rPr>
+          <w:rFonts w:ascii="Calibri" w:hAnsi="Calibri"/>
+          <w:color w:val="182420"/>
+          <w:sz w:val="22"/>
+        </w:rPr>
+        <w:t>Nhận kết quả trong bot, tải về hoặc tiếp tục bước kế tiếp.</w:t>
+      </w:r>
+    </w:p>
+    <w:p>
+      <w:r>
+        <w:rPr>
+          <w:rFonts w:ascii="Calibri" w:hAnsi="Calibri"/>
+          <w:color w:val="182420"/>
+          <w:sz w:val="22"/>
+        </w:rPr>
+        <w:t>Lệnh hữu ích:</w:t>
+      </w:r>
+    </w:p>
+    <w:p>
+      <w:pPr>
+        <w:pStyle w:val="ListBullet"/>
+      </w:pPr>
+      <w:r>
+        <w:rPr>
+          <w:rFonts w:ascii="Consolas" w:hAnsi="Consolas"/>
+          <w:color w:val="053B2B"/>
+          <w:sz w:val="20"/>
+        </w:rPr>
+        <w:t>/help</w:t>
+      </w:r>
+      <w:r>
+        <w:rPr>
+          <w:rFonts w:ascii="Calibri" w:hAnsi="Calibri"/>
+          <w:color w:val="182420"/>
+          <w:sz w:val="22"/>
+        </w:rPr>
+        <w:t xml:space="preserve"> - xem hướng dẫn nhanh.</w:t>
+      </w:r>
+    </w:p>
+    <w:p>
+      <w:pPr>
+        <w:pStyle w:val="ListBullet"/>
+      </w:pPr>
+      <w:r>
+        <w:rPr>
+          <w:rFonts w:ascii="Consolas" w:hAnsi="Consolas"/>
+          <w:color w:val="053B2B"/>
+          <w:sz w:val="20"/>
+        </w:rPr>
+        <w:t>/huongdan</w:t>
+      </w:r>
+      <w:r>
+        <w:rPr>
+          <w:rFonts w:ascii="Calibri" w:hAnsi="Calibri"/>
+          <w:color w:val="182420"/>
+          <w:sz w:val="22"/>
+        </w:rPr>
+        <w:t xml:space="preserve"> hoặc </w:t>
+      </w:r>
+      <w:r>
+        <w:rPr>
+          <w:rFonts w:ascii="Consolas" w:hAnsi="Consolas"/>
+          <w:color w:val="053B2B"/>
+          <w:sz w:val="20"/>
+        </w:rPr>
+        <w:t>/guide</w:t>
+      </w:r>
+      <w:r>
+        <w:rPr>
+          <w:rFonts w:ascii="Calibri" w:hAnsi="Calibri"/>
+          <w:color w:val="182420"/>
+          <w:sz w:val="22"/>
+        </w:rPr>
+        <w:t xml:space="preserve"> - mở hướng dẫn chi tiết.</w:t>
+      </w:r>
+    </w:p>
+    <w:p>
+      <w:pPr>
+        <w:pStyle w:val="ListBullet"/>
+      </w:pPr>
+      <w:r>
+        <w:rPr>
+          <w:rFonts w:ascii="Consolas" w:hAnsi="Consolas"/>
+          <w:color w:val="053B2B"/>
+          <w:sz w:val="20"/>
+        </w:rPr>
+        <w:t>/profile</w:t>
+      </w:r>
+      <w:r>
+        <w:rPr>
+          <w:rFonts w:ascii="Calibri" w:hAnsi="Calibri"/>
+          <w:color w:val="182420"/>
+          <w:sz w:val="22"/>
+        </w:rPr>
+        <w:t xml:space="preserve"> - xem số dư Xu.</w:t>
+      </w:r>
+    </w:p>
+    <w:p>
+      <w:pPr>
+        <w:pStyle w:val="ListBullet"/>
+      </w:pPr>
+      <w:r>
+        <w:rPr>
+          <w:rFonts w:ascii="Consolas" w:hAnsi="Consolas"/>
+          <w:color w:val="053B2B"/>
+          <w:sz w:val="20"/>
+        </w:rPr>
+        <w:t>/pricing</w:t>
+      </w:r>
+      <w:r>
+        <w:rPr>
+          <w:rFonts w:ascii="Calibri" w:hAnsi="Calibri"/>
+          <w:color w:val="182420"/>
+          <w:sz w:val="22"/>
+        </w:rPr>
+        <w:t xml:space="preserve"> hoặc </w:t>
+      </w:r>
+      <w:r>
+        <w:rPr>
+          <w:rFonts w:ascii="Consolas" w:hAnsi="Consolas"/>
+          <w:color w:val="053B2B"/>
+          <w:sz w:val="20"/>
+        </w:rPr>
+        <w:t>/banggia</w:t>
+      </w:r>
+      <w:r>
+        <w:rPr>
+          <w:rFonts w:ascii="Calibri" w:hAnsi="Calibri"/>
+          <w:color w:val="182420"/>
+          <w:sz w:val="22"/>
+        </w:rPr>
+        <w:t xml:space="preserve"> - xem bảng giá.</w:t>
+      </w:r>
+    </w:p>
+    <w:p>
+      <w:pPr>
+        <w:pStyle w:val="ListBullet"/>
+      </w:pPr>
+      <w:r>
+        <w:rPr>
+          <w:rFonts w:ascii="Consolas" w:hAnsi="Consolas"/>
+          <w:color w:val="053B2B"/>
+          <w:sz w:val="20"/>
+        </w:rPr>
+        <w:t>/naptien</w:t>
+      </w:r>
+      <w:r>
+        <w:rPr>
+          <w:rFonts w:ascii="Calibri" w:hAnsi="Calibri"/>
+          <w:color w:val="182420"/>
+          <w:sz w:val="22"/>
+        </w:rPr>
+        <w:t xml:space="preserve"> - nạp Xu.</w:t>
       </w:r>
     </w:p>
     <w:p>
@@ -446,13 +585,1036 @@
           <w:color w:val="182420"/>
           <w:sz w:val="22"/>
         </w:rPr>
-        <w:t>3. Xu là gì?</w:t>
+        <w:t>3. Tạo ảnh AI</w:t>
+      </w:r>
+    </w:p>
+    <w:p>
+      <w:r>
+        <w:rPr>
+          <w:rFonts w:ascii="Calibri" w:hAnsi="Calibri"/>
+          <w:color w:val="182420"/>
+          <w:sz w:val="22"/>
+        </w:rPr>
+        <w:t>Quy trình tạo ảnh:</w:t>
+      </w:r>
+    </w:p>
+    <w:p>
+      <w:pPr>
+        <w:pStyle w:val="ListNumber"/>
+      </w:pPr>
+      <w:r>
+        <w:rPr>
+          <w:rFonts w:ascii="Calibri" w:hAnsi="Calibri"/>
+          <w:color w:val="182420"/>
+          <w:sz w:val="22"/>
+        </w:rPr>
+        <w:t>Mở mục Tạo ảnh.</w:t>
+      </w:r>
+    </w:p>
+    <w:p>
+      <w:pPr>
+        <w:pStyle w:val="ListNumber"/>
+      </w:pPr>
+      <w:r>
+        <w:rPr>
+          <w:rFonts w:ascii="Calibri" w:hAnsi="Calibri"/>
+          <w:color w:val="182420"/>
+          <w:sz w:val="22"/>
+        </w:rPr>
+        <w:t>Gửi mô tả ảnh: sản phẩm, bối cảnh, ánh sáng, màu sắc, bố cục, tỉ lệ và phong cách.</w:t>
+      </w:r>
+    </w:p>
+    <w:p>
+      <w:pPr>
+        <w:pStyle w:val="ListNumber"/>
+      </w:pPr>
+      <w:r>
+        <w:rPr>
+          <w:rFonts w:ascii="Calibri" w:hAnsi="Calibri"/>
+          <w:color w:val="182420"/>
+          <w:sz w:val="22"/>
+        </w:rPr>
+        <w:t>Chọn gói ảnh theo nhu cầu.</w:t>
+      </w:r>
+    </w:p>
+    <w:p>
+      <w:pPr>
+        <w:pStyle w:val="ListNumber"/>
+      </w:pPr>
+      <w:r>
+        <w:rPr>
+          <w:rFonts w:ascii="Calibri" w:hAnsi="Calibri"/>
+          <w:color w:val="182420"/>
+          <w:sz w:val="22"/>
+        </w:rPr>
+        <w:t>Xem giá Xu và xác nhận.</w:t>
+      </w:r>
+    </w:p>
+    <w:p>
+      <w:pPr>
+        <w:pStyle w:val="ListNumber"/>
+      </w:pPr>
+      <w:r>
+        <w:rPr>
+          <w:rFonts w:ascii="Calibri" w:hAnsi="Calibri"/>
+          <w:color w:val="182420"/>
+          <w:sz w:val="22"/>
+        </w:rPr>
+        <w:t>Hệ thống xử lý ảnh sau khi bạn xác nhận.</w:t>
+      </w:r>
+    </w:p>
+    <w:p>
+      <w:pPr>
+        <w:pStyle w:val="ListNumber"/>
+      </w:pPr>
+      <w:r>
+        <w:rPr>
+          <w:rFonts w:ascii="Calibri" w:hAnsi="Calibri"/>
+          <w:color w:val="182420"/>
+          <w:sz w:val="22"/>
+        </w:rPr>
+        <w:t>Nhận ảnh trong bot, tải về hoặc dùng tiếp để tạo video.</w:t>
+      </w:r>
+    </w:p>
+    <w:p>
+      <w:r>
+        <w:rPr>
+          <w:rFonts w:ascii="Calibri" w:hAnsi="Calibri"/>
+          <w:color w:val="182420"/>
+          <w:sz w:val="22"/>
+        </w:rPr>
+        <w:t>Ví dụ mô tả tốt:</w:t>
+      </w:r>
+    </w:p>
+    <w:p>
+      <w:r>
+        <w:rPr>
+          <w:rFonts w:ascii="Consolas" w:hAnsi="Consolas"/>
+          <w:color w:val="053B2B"/>
+          <w:sz w:val="20"/>
+        </w:rPr>
+        <w:t>Ảnh sản phẩm máy xay sinh tố mini màu xanh ngọc trên bàn bếp sáng, ánh sáng tự nhiên, phong cách quảng cáo thương mại, không thêm chữ, không watermark.</w:t>
+      </w:r>
+    </w:p>
+    <w:p>
+      <w:r>
+        <w:rPr>
+          <w:rFonts w:ascii="Calibri" w:hAnsi="Calibri"/>
+          <w:color w:val="182420"/>
+          <w:sz w:val="22"/>
+        </w:rPr>
+        <w:t>Bảng giá tạo ảnh:</w:t>
       </w:r>
     </w:p>
     <w:p>
       <w:pPr>
         <w:pStyle w:val="ListBullet"/>
       </w:pPr>
+      <w:r>
+        <w:rPr>
+          <w:rFonts w:ascii="Calibri" w:hAnsi="Calibri"/>
+          <w:color w:val="182420"/>
+          <w:sz w:val="22"/>
+        </w:rPr>
+        <w:t>Tiết kiệm: 50 Xu.</w:t>
+      </w:r>
+    </w:p>
+    <w:p>
+      <w:pPr>
+        <w:pStyle w:val="ListBullet"/>
+      </w:pPr>
+      <w:r>
+        <w:rPr>
+          <w:rFonts w:ascii="Calibri" w:hAnsi="Calibri"/>
+          <w:color w:val="182420"/>
+          <w:sz w:val="22"/>
+        </w:rPr>
+        <w:t>Chuẩn: 150 Xu.</w:t>
+      </w:r>
+    </w:p>
+    <w:p>
+      <w:pPr>
+        <w:pStyle w:val="ListBullet"/>
+      </w:pPr>
+      <w:r>
+        <w:rPr>
+          <w:rFonts w:ascii="Calibri" w:hAnsi="Calibri"/>
+          <w:color w:val="182420"/>
+          <w:sz w:val="22"/>
+        </w:rPr>
+        <w:t>Chuẩn + bảo hành: 200 Xu.</w:t>
+      </w:r>
+    </w:p>
+    <w:p>
+      <w:pPr>
+        <w:pStyle w:val="ListBullet"/>
+      </w:pPr>
+      <w:r>
+        <w:rPr>
+          <w:rFonts w:ascii="Calibri" w:hAnsi="Calibri"/>
+          <w:color w:val="182420"/>
+          <w:sz w:val="22"/>
+        </w:rPr>
+        <w:t>Phổ thông: 300 Xu.</w:t>
+      </w:r>
+    </w:p>
+    <w:p>
+      <w:pPr>
+        <w:pStyle w:val="ListBullet"/>
+      </w:pPr>
+      <w:r>
+        <w:rPr>
+          <w:rFonts w:ascii="Calibri" w:hAnsi="Calibri"/>
+          <w:color w:val="182420"/>
+          <w:sz w:val="22"/>
+        </w:rPr>
+        <w:t>Phổ thông + bảo hành: 400 Xu.</w:t>
+      </w:r>
+    </w:p>
+    <w:p>
+      <w:pPr>
+        <w:pStyle w:val="ListBullet"/>
+      </w:pPr>
+      <w:r>
+        <w:rPr>
+          <w:rFonts w:ascii="Calibri" w:hAnsi="Calibri"/>
+          <w:color w:val="182420"/>
+          <w:sz w:val="22"/>
+        </w:rPr>
+        <w:t>Cao: 500 Xu.</w:t>
+      </w:r>
+    </w:p>
+    <w:p>
+      <w:pPr>
+        <w:pStyle w:val="ListBullet"/>
+      </w:pPr>
+      <w:r>
+        <w:rPr>
+          <w:rFonts w:ascii="Calibri" w:hAnsi="Calibri"/>
+          <w:color w:val="182420"/>
+          <w:sz w:val="22"/>
+        </w:rPr>
+        <w:t>Cao + bảo hành: 600 Xu.</w:t>
+      </w:r>
+    </w:p>
+    <w:p>
+      <w:r>
+        <w:rPr>
+          <w:rFonts w:ascii="Calibri" w:hAnsi="Calibri"/>
+          <w:color w:val="182420"/>
+          <w:sz w:val="22"/>
+        </w:rPr>
+        <w:t>Gói có bảo hành phù hợp khi bạn cần ảnh ổn định hơn. Nếu kết quả chưa sát yêu cầu trong cùng mô tả, bạn có thể yêu cầu hỗ trợ tạo lại theo chính sách của gói.</w:t>
+      </w:r>
+    </w:p>
+    <w:p>
+      <w:r>
+        <w:rPr>
+          <w:rFonts w:ascii="Calibri" w:hAnsi="Calibri"/>
+          <w:color w:val="182420"/>
+          <w:sz w:val="22"/>
+        </w:rPr>
+        <w:t>Lưu ý: hãy kiểm tra kỹ chữ, logo, khuôn mặt, bàn tay, chi tiết sản phẩm và thông tin thương mại trước khi dùng ảnh để đăng bán hàng.</w:t>
+      </w:r>
+    </w:p>
+    <w:p>
+      <w:pPr>
+        <w:pStyle w:val="Heading1"/>
+      </w:pPr>
+      <w:r>
+        <w:rPr>
+          <w:rFonts w:ascii="Calibri" w:hAnsi="Calibri"/>
+          <w:color w:val="182420"/>
+          <w:sz w:val="22"/>
+        </w:rPr>
+        <w:t>4. Tạo video AI</w:t>
+      </w:r>
+    </w:p>
+    <w:p>
+      <w:r>
+        <w:rPr>
+          <w:rFonts w:ascii="Calibri" w:hAnsi="Calibri"/>
+          <w:color w:val="182420"/>
+          <w:sz w:val="22"/>
+        </w:rPr>
+        <w:t>Quy trình tạo video:</w:t>
+      </w:r>
+    </w:p>
+    <w:p>
+      <w:pPr>
+        <w:pStyle w:val="ListNumber"/>
+      </w:pPr>
+      <w:r>
+        <w:rPr>
+          <w:rFonts w:ascii="Calibri" w:hAnsi="Calibri"/>
+          <w:color w:val="182420"/>
+          <w:sz w:val="22"/>
+        </w:rPr>
+        <w:t>Mở mục Tạo video.</w:t>
+      </w:r>
+    </w:p>
+    <w:p>
+      <w:pPr>
+        <w:pStyle w:val="ListNumber"/>
+      </w:pPr>
+      <w:r>
+        <w:rPr>
+          <w:rFonts w:ascii="Calibri" w:hAnsi="Calibri"/>
+          <w:color w:val="182420"/>
+          <w:sz w:val="22"/>
+        </w:rPr>
+        <w:t>Chọn tạo video từ mô tả hoặc tạo video từ ảnh đã có.</w:t>
+      </w:r>
+    </w:p>
+    <w:p>
+      <w:pPr>
+        <w:pStyle w:val="ListNumber"/>
+      </w:pPr>
+      <w:r>
+        <w:rPr>
+          <w:rFonts w:ascii="Calibri" w:hAnsi="Calibri"/>
+          <w:color w:val="182420"/>
+          <w:sz w:val="22"/>
+        </w:rPr>
+        <w:t>Gửi mô tả video: chủ thể, chuyển động, bối cảnh, ánh sáng, tỉ lệ, thời lượng và cảm xúc.</w:t>
+      </w:r>
+    </w:p>
+    <w:p>
+      <w:pPr>
+        <w:pStyle w:val="ListNumber"/>
+      </w:pPr>
+      <w:r>
+        <w:rPr>
+          <w:rFonts w:ascii="Calibri" w:hAnsi="Calibri"/>
+          <w:color w:val="182420"/>
+          <w:sz w:val="22"/>
+        </w:rPr>
+        <w:t>Chọn gói video.</w:t>
+      </w:r>
+    </w:p>
+    <w:p>
+      <w:pPr>
+        <w:pStyle w:val="ListNumber"/>
+      </w:pPr>
+      <w:r>
+        <w:rPr>
+          <w:rFonts w:ascii="Calibri" w:hAnsi="Calibri"/>
+          <w:color w:val="182420"/>
+          <w:sz w:val="22"/>
+        </w:rPr>
+        <w:t>Chọn số cảnh nếu muốn làm video dài hơn.</w:t>
+      </w:r>
+    </w:p>
+    <w:p>
+      <w:pPr>
+        <w:pStyle w:val="ListNumber"/>
+      </w:pPr>
+      <w:r>
+        <w:rPr>
+          <w:rFonts w:ascii="Calibri" w:hAnsi="Calibri"/>
+          <w:color w:val="182420"/>
+          <w:sz w:val="22"/>
+        </w:rPr>
+        <w:t>Xem tổng chi phí, kiểm tra nội dung và xác nhận.</w:t>
+      </w:r>
+    </w:p>
+    <w:p>
+      <w:pPr>
+        <w:pStyle w:val="ListNumber"/>
+      </w:pPr>
+      <w:r>
+        <w:rPr>
+          <w:rFonts w:ascii="Calibri" w:hAnsi="Calibri"/>
+          <w:color w:val="182420"/>
+          <w:sz w:val="22"/>
+        </w:rPr>
+        <w:t>Hệ thống xử lý và gửi video về bot khi hoàn tất.</w:t>
+      </w:r>
+    </w:p>
+    <w:p>
+      <w:pPr>
+        <w:pStyle w:val="ListNumber"/>
+      </w:pPr>
+      <w:r>
+        <w:rPr>
+          <w:rFonts w:ascii="Calibri" w:hAnsi="Calibri"/>
+          <w:color w:val="182420"/>
+          <w:sz w:val="22"/>
+        </w:rPr>
+        <w:t>Sau khi có video, bạn có thể dùng thêm Âm thanh hoặc Phụ đề / Dịch / Lồng tiếng nếu cần.</w:t>
+      </w:r>
+    </w:p>
+    <w:p>
+      <w:r>
+        <w:rPr>
+          <w:rFonts w:ascii="Calibri" w:hAnsi="Calibri"/>
+          <w:color w:val="182420"/>
+          <w:sz w:val="22"/>
+        </w:rPr>
+        <w:t>Bảng giá video theo gói:</w:t>
+      </w:r>
+    </w:p>
+    <w:p>
+      <w:pPr>
+        <w:pStyle w:val="ListBullet"/>
+      </w:pPr>
+      <w:r>
+        <w:rPr>
+          <w:rFonts w:ascii="Calibri" w:hAnsi="Calibri"/>
+          <w:color w:val="182420"/>
+          <w:sz w:val="22"/>
+        </w:rPr>
+        <w:t>Trải nghiệm: 200 Xu.</w:t>
+      </w:r>
+    </w:p>
+    <w:p>
+      <w:pPr>
+        <w:pStyle w:val="ListBullet"/>
+      </w:pPr>
+      <w:r>
+        <w:rPr>
+          <w:rFonts w:ascii="Calibri" w:hAnsi="Calibri"/>
+          <w:color w:val="182420"/>
+          <w:sz w:val="22"/>
+        </w:rPr>
+        <w:t>Cơ bản: 300 Xu.</w:t>
+      </w:r>
+    </w:p>
+    <w:p>
+      <w:pPr>
+        <w:pStyle w:val="ListBullet"/>
+      </w:pPr>
+      <w:r>
+        <w:rPr>
+          <w:rFonts w:ascii="Calibri" w:hAnsi="Calibri"/>
+          <w:color w:val="182420"/>
+          <w:sz w:val="22"/>
+        </w:rPr>
+        <w:t>Phổ thông: 400 Xu.</w:t>
+      </w:r>
+    </w:p>
+    <w:p>
+      <w:pPr>
+        <w:pStyle w:val="ListBullet"/>
+      </w:pPr>
+      <w:r>
+        <w:rPr>
+          <w:rFonts w:ascii="Calibri" w:hAnsi="Calibri"/>
+          <w:color w:val="182420"/>
+          <w:sz w:val="22"/>
+        </w:rPr>
+        <w:t>Nâng cao: 500 Xu.</w:t>
+      </w:r>
+    </w:p>
+    <w:p>
+      <w:pPr>
+        <w:pStyle w:val="ListBullet"/>
+      </w:pPr>
+      <w:r>
+        <w:rPr>
+          <w:rFonts w:ascii="Calibri" w:hAnsi="Calibri"/>
+          <w:color w:val="182420"/>
+          <w:sz w:val="22"/>
+        </w:rPr>
+        <w:t>Bán hàng: 600 Xu.</w:t>
+      </w:r>
+    </w:p>
+    <w:p>
+      <w:pPr>
+        <w:pStyle w:val="ListBullet"/>
+      </w:pPr>
+      <w:r>
+        <w:rPr>
+          <w:rFonts w:ascii="Calibri" w:hAnsi="Calibri"/>
+          <w:color w:val="182420"/>
+          <w:sz w:val="22"/>
+        </w:rPr>
+        <w:t>Cao cấp: 800 Xu.</w:t>
+      </w:r>
+    </w:p>
+    <w:p>
+      <w:pPr>
+        <w:pStyle w:val="ListBullet"/>
+      </w:pPr>
+      <w:r>
+        <w:rPr>
+          <w:rFonts w:ascii="Calibri" w:hAnsi="Calibri"/>
+          <w:color w:val="182420"/>
+          <w:sz w:val="22"/>
+        </w:rPr>
+        <w:t>Chuyên nghiệp: 1000 Xu.</w:t>
+      </w:r>
+    </w:p>
+    <w:p>
+      <w:pPr>
+        <w:pStyle w:val="ListBullet"/>
+      </w:pPr>
+      <w:r>
+        <w:rPr>
+          <w:rFonts w:ascii="Calibri" w:hAnsi="Calibri"/>
+          <w:color w:val="182420"/>
+          <w:sz w:val="22"/>
+        </w:rPr>
+        <w:t>Pro Plus: 1200 Xu.</w:t>
+      </w:r>
+    </w:p>
+    <w:p>
+      <w:pPr>
+        <w:pStyle w:val="ListBullet"/>
+      </w:pPr>
+      <w:r>
+        <w:rPr>
+          <w:rFonts w:ascii="Calibri" w:hAnsi="Calibri"/>
+          <w:color w:val="182420"/>
+          <w:sz w:val="22"/>
+        </w:rPr>
+        <w:t>Premium: 1500 Xu.</w:t>
+      </w:r>
+    </w:p>
+    <w:p>
+      <w:r>
+        <w:rPr>
+          <w:rFonts w:ascii="Calibri" w:hAnsi="Calibri"/>
+          <w:color w:val="182420"/>
+          <w:sz w:val="22"/>
+        </w:rPr>
+        <w:t>Gói Trải nghiệm 200 Xu phù hợp để test ý tưởng nhanh, xem hướng chuyển động, kiểm tra concept hoặc tạo bản nháp ngắn trước khi dùng gói cao hơn.</w:t>
+      </w:r>
+    </w:p>
+    <w:p>
+      <w:r>
+        <w:rPr>
+          <w:rFonts w:ascii="Calibri" w:hAnsi="Calibri"/>
+          <w:color w:val="182420"/>
+          <w:sz w:val="22"/>
+        </w:rPr>
+        <w:t>Cách tính theo cảnh:</w:t>
+      </w:r>
+    </w:p>
+    <w:p>
+      <w:pPr>
+        <w:pStyle w:val="ListBullet"/>
+      </w:pPr>
+      <w:r>
+        <w:rPr>
+          <w:rFonts w:ascii="Calibri" w:hAnsi="Calibri"/>
+          <w:color w:val="182420"/>
+          <w:sz w:val="22"/>
+        </w:rPr>
+        <w:t>1 cảnh khoảng 6 giây.</w:t>
+      </w:r>
+    </w:p>
+    <w:p>
+      <w:pPr>
+        <w:pStyle w:val="ListBullet"/>
+      </w:pPr>
+      <w:r>
+        <w:rPr>
+          <w:rFonts w:ascii="Calibri" w:hAnsi="Calibri"/>
+          <w:color w:val="182420"/>
+          <w:sz w:val="22"/>
+        </w:rPr>
+        <w:t>3 cảnh khoảng 18 giây.</w:t>
+      </w:r>
+    </w:p>
+    <w:p>
+      <w:pPr>
+        <w:pStyle w:val="ListBullet"/>
+      </w:pPr>
+      <w:r>
+        <w:rPr>
+          <w:rFonts w:ascii="Calibri" w:hAnsi="Calibri"/>
+          <w:color w:val="182420"/>
+          <w:sz w:val="22"/>
+        </w:rPr>
+        <w:t>5 cảnh khoảng 30 giây.</w:t>
+      </w:r>
+    </w:p>
+    <w:p>
+      <w:pPr>
+        <w:pStyle w:val="ListBullet"/>
+      </w:pPr>
+      <w:r>
+        <w:rPr>
+          <w:rFonts w:ascii="Calibri" w:hAnsi="Calibri"/>
+          <w:color w:val="182420"/>
+          <w:sz w:val="22"/>
+        </w:rPr>
+        <w:t>10 cảnh khoảng 60 giây.</w:t>
+      </w:r>
+    </w:p>
+    <w:p>
+      <w:pPr>
+        <w:pStyle w:val="ListBullet"/>
+      </w:pPr>
+      <w:r>
+        <w:rPr>
+          <w:rFonts w:ascii="Calibri" w:hAnsi="Calibri"/>
+          <w:color w:val="182420"/>
+          <w:sz w:val="22"/>
+        </w:rPr>
+        <w:t>20 cảnh khoảng 120 giây.</w:t>
+      </w:r>
+    </w:p>
+    <w:p>
+      <w:r>
+        <w:rPr>
+          <w:rFonts w:ascii="Calibri" w:hAnsi="Calibri"/>
+          <w:color w:val="182420"/>
+          <w:sz w:val="22"/>
+        </w:rPr>
+        <w:t>Ưu đãi theo số cảnh:</w:t>
+      </w:r>
+    </w:p>
+    <w:p>
+      <w:pPr>
+        <w:pStyle w:val="ListBullet"/>
+      </w:pPr>
+      <w:r>
+        <w:rPr>
+          <w:rFonts w:ascii="Calibri" w:hAnsi="Calibri"/>
+          <w:color w:val="182420"/>
+          <w:sz w:val="22"/>
+        </w:rPr>
+        <w:t>1 cảnh: giá gốc.</w:t>
+      </w:r>
+    </w:p>
+    <w:p>
+      <w:pPr>
+        <w:pStyle w:val="ListBullet"/>
+      </w:pPr>
+      <w:r>
+        <w:rPr>
+          <w:rFonts w:ascii="Calibri" w:hAnsi="Calibri"/>
+          <w:color w:val="182420"/>
+          <w:sz w:val="22"/>
+        </w:rPr>
+        <w:t>2-9 cảnh: giảm 10%.</w:t>
+      </w:r>
+    </w:p>
+    <w:p>
+      <w:pPr>
+        <w:pStyle w:val="ListBullet"/>
+      </w:pPr>
+      <w:r>
+        <w:rPr>
+          <w:rFonts w:ascii="Calibri" w:hAnsi="Calibri"/>
+          <w:color w:val="182420"/>
+          <w:sz w:val="22"/>
+        </w:rPr>
+        <w:t>10-19 cảnh: giảm 15%.</w:t>
+      </w:r>
+    </w:p>
+    <w:p>
+      <w:pPr>
+        <w:pStyle w:val="ListBullet"/>
+      </w:pPr>
+      <w:r>
+        <w:rPr>
+          <w:rFonts w:ascii="Calibri" w:hAnsi="Calibri"/>
+          <w:color w:val="182420"/>
+          <w:sz w:val="22"/>
+        </w:rPr>
+        <w:t>20 cảnh: giảm 20%.</w:t>
+      </w:r>
+    </w:p>
+    <w:p>
+      <w:r>
+        <w:rPr>
+          <w:rFonts w:ascii="Calibri" w:hAnsi="Calibri"/>
+          <w:color w:val="182420"/>
+          <w:sz w:val="22"/>
+        </w:rPr>
+        <w:t>Ví dụ: gói Cơ bản 300 Xu, làm 3 cảnh: 300 x 90% = 270 Xu/cảnh, tổng 270 x 3 = 810 Xu.</w:t>
+      </w:r>
+    </w:p>
+    <w:p>
+      <w:r>
+        <w:rPr>
+          <w:rFonts w:ascii="Calibri" w:hAnsi="Calibri"/>
+          <w:color w:val="182420"/>
+          <w:sz w:val="22"/>
+        </w:rPr>
+        <w:t>Nếu hệ thống đang bảo trì/nâng cấp, TOAN AAS chưa xử lý và chưa trừ Xu. Vui lòng thử lại sau.</w:t>
+      </w:r>
+    </w:p>
+    <w:p>
+      <w:pPr>
+        <w:pStyle w:val="Heading1"/>
+      </w:pPr>
+      <w:r>
+        <w:rPr>
+          <w:rFonts w:ascii="Calibri" w:hAnsi="Calibri"/>
+          <w:color w:val="182420"/>
+          <w:sz w:val="22"/>
+        </w:rPr>
+        <w:t>5. Âm thanh</w:t>
+      </w:r>
+    </w:p>
+    <w:p>
+      <w:r>
+        <w:rPr>
+          <w:rFonts w:ascii="Calibri" w:hAnsi="Calibri"/>
+          <w:color w:val="182420"/>
+          <w:sz w:val="22"/>
+        </w:rPr>
+        <w:t>Âm thanh giúp video dễ nghe, dễ bán hàng và chuyên nghiệp hơn.</w:t>
+      </w:r>
+    </w:p>
+    <w:p>
+      <w:r>
+        <w:rPr>
+          <w:rFonts w:ascii="Calibri" w:hAnsi="Calibri"/>
+          <w:color w:val="182420"/>
+          <w:sz w:val="22"/>
+        </w:rPr>
+        <w:t>Bạn có thể dùng:</w:t>
+      </w:r>
+    </w:p>
+    <w:p>
+      <w:pPr>
+        <w:pStyle w:val="ListBullet"/>
+      </w:pPr>
+      <w:r>
+        <w:rPr>
+          <w:rFonts w:ascii="Calibri" w:hAnsi="Calibri"/>
+          <w:color w:val="182420"/>
+          <w:sz w:val="22"/>
+        </w:rPr>
+        <w:t>Tạo giọng đọc từ nội dung đã viết.</w:t>
+      </w:r>
+    </w:p>
+    <w:p>
+      <w:pPr>
+        <w:pStyle w:val="ListBullet"/>
+      </w:pPr>
+      <w:r>
+        <w:rPr>
+          <w:rFonts w:ascii="Calibri" w:hAnsi="Calibri"/>
+          <w:color w:val="182420"/>
+          <w:sz w:val="22"/>
+        </w:rPr>
+        <w:t>Tạo nhạc nền theo phong cách mong muốn.</w:t>
+      </w:r>
+    </w:p>
+    <w:p>
+      <w:pPr>
+        <w:pStyle w:val="ListBullet"/>
+      </w:pPr>
+      <w:r>
+        <w:rPr>
+          <w:rFonts w:ascii="Calibri" w:hAnsi="Calibri"/>
+          <w:color w:val="182420"/>
+          <w:sz w:val="22"/>
+        </w:rPr>
+        <w:t>Tạo bài hát ngắn cho thương hiệu, sản phẩm hoặc chiến dịch.</w:t>
+      </w:r>
+    </w:p>
+    <w:p>
+      <w:pPr>
+        <w:pStyle w:val="ListBullet"/>
+      </w:pPr>
+      <w:r>
+        <w:rPr>
+          <w:rFonts w:ascii="Calibri" w:hAnsi="Calibri"/>
+          <w:color w:val="182420"/>
+          <w:sz w:val="22"/>
+        </w:rPr>
+        <w:t>Tìm ý tưởng nhạc, hiệu ứng âm thanh hoặc đoạn mở đầu phù hợp video.</w:t>
+      </w:r>
+    </w:p>
+    <w:p>
+      <w:r>
+        <w:rPr>
+          <w:rFonts w:ascii="Calibri" w:hAnsi="Calibri"/>
+          <w:color w:val="182420"/>
+          <w:sz w:val="22"/>
+        </w:rPr>
+        <w:t>Quy trình:</w:t>
+      </w:r>
+    </w:p>
+    <w:p>
+      <w:pPr>
+        <w:pStyle w:val="ListNumber"/>
+      </w:pPr>
+      <w:r>
+        <w:rPr>
+          <w:rFonts w:ascii="Calibri" w:hAnsi="Calibri"/>
+          <w:color w:val="182420"/>
+          <w:sz w:val="22"/>
+        </w:rPr>
+        <w:t>Mở mục Âm thanh.</w:t>
+      </w:r>
+    </w:p>
+    <w:p>
+      <w:pPr>
+        <w:pStyle w:val="ListNumber"/>
+      </w:pPr>
+      <w:r>
+        <w:rPr>
+          <w:rFonts w:ascii="Calibri" w:hAnsi="Calibri"/>
+          <w:color w:val="182420"/>
+          <w:sz w:val="22"/>
+        </w:rPr>
+        <w:t>Chọn giọng đọc, nhạc nền hoặc bài hát.</w:t>
+      </w:r>
+    </w:p>
+    <w:p>
+      <w:pPr>
+        <w:pStyle w:val="ListNumber"/>
+      </w:pPr>
+      <w:r>
+        <w:rPr>
+          <w:rFonts w:ascii="Calibri" w:hAnsi="Calibri"/>
+          <w:color w:val="182420"/>
+          <w:sz w:val="22"/>
+        </w:rPr>
+        <w:t>Gửi nội dung hoặc mô tả phong cách.</w:t>
+      </w:r>
+    </w:p>
+    <w:p>
+      <w:pPr>
+        <w:pStyle w:val="ListNumber"/>
+      </w:pPr>
+      <w:r>
+        <w:rPr>
+          <w:rFonts w:ascii="Calibri" w:hAnsi="Calibri"/>
+          <w:color w:val="182420"/>
+          <w:sz w:val="22"/>
+        </w:rPr>
+        <w:t>Kiểm tra chi phí nếu bước đó có phí.</w:t>
+      </w:r>
+    </w:p>
+    <w:p>
+      <w:pPr>
+        <w:pStyle w:val="ListNumber"/>
+      </w:pPr>
+      <w:r>
+        <w:rPr>
+          <w:rFonts w:ascii="Calibri" w:hAnsi="Calibri"/>
+          <w:color w:val="182420"/>
+          <w:sz w:val="22"/>
+        </w:rPr>
+        <w:t>Xác nhận rồi nhận kết quả trong bot.</w:t>
+      </w:r>
+    </w:p>
+    <w:p>
+      <w:r>
+        <w:rPr>
+          <w:rFonts w:ascii="Calibri" w:hAnsi="Calibri"/>
+          <w:color w:val="182420"/>
+          <w:sz w:val="22"/>
+        </w:rPr>
+        <w:t>Mẹo: nội dung đọc nên ngắn, câu rõ, ít từ khó và có nhịp nghỉ tự nhiên.</w:t>
+      </w:r>
+    </w:p>
+    <w:p>
+      <w:r>
+        <w:rPr>
+          <w:rFonts w:ascii="Calibri" w:hAnsi="Calibri"/>
+          <w:color w:val="182420"/>
+          <w:sz w:val="22"/>
+        </w:rPr>
+        <w:t>Nếu hệ thống đang bảo trì/nâng cấp, TOAN AAS chưa xử lý và chưa trừ Xu. Vui lòng thử lại sau.</w:t>
+      </w:r>
+    </w:p>
+    <w:p>
+      <w:pPr>
+        <w:pStyle w:val="Heading1"/>
+      </w:pPr>
+      <w:r>
+        <w:rPr>
+          <w:rFonts w:ascii="Calibri" w:hAnsi="Calibri"/>
+          <w:color w:val="182420"/>
+          <w:sz w:val="22"/>
+        </w:rPr>
+        <w:t>6. Phụ đề / Dịch / Lồng tiếng</w:t>
+      </w:r>
+    </w:p>
+    <w:p>
+      <w:r>
+        <w:rPr>
+          <w:rFonts w:ascii="Calibri" w:hAnsi="Calibri"/>
+          <w:color w:val="182420"/>
+          <w:sz w:val="22"/>
+        </w:rPr>
+        <w:t>Bạn có thể dùng:</w:t>
+      </w:r>
+    </w:p>
+    <w:p>
+      <w:pPr>
+        <w:pStyle w:val="ListBullet"/>
+      </w:pPr>
+      <w:r>
+        <w:rPr>
+          <w:rFonts w:ascii="Calibri" w:hAnsi="Calibri"/>
+          <w:color w:val="182420"/>
+          <w:sz w:val="22"/>
+        </w:rPr>
+        <w:t>Tạo phụ đề từ video hoặc audio.</w:t>
+      </w:r>
+    </w:p>
+    <w:p>
+      <w:pPr>
+        <w:pStyle w:val="ListBullet"/>
+      </w:pPr>
+      <w:r>
+        <w:rPr>
+          <w:rFonts w:ascii="Calibri" w:hAnsi="Calibri"/>
+          <w:color w:val="182420"/>
+          <w:sz w:val="22"/>
+        </w:rPr>
+        <w:t>Dịch nội dung sang ngôn ngữ khác.</w:t>
+      </w:r>
+    </w:p>
+    <w:p>
+      <w:pPr>
+        <w:pStyle w:val="ListBullet"/>
+      </w:pPr>
+      <w:r>
+        <w:rPr>
+          <w:rFonts w:ascii="Calibri" w:hAnsi="Calibri"/>
+          <w:color w:val="182420"/>
+          <w:sz w:val="22"/>
+        </w:rPr>
+        <w:t>Lồng tiếng lại video bằng giọng phù hợp.</w:t>
+      </w:r>
+    </w:p>
+    <w:p>
+      <w:pPr>
+        <w:pStyle w:val="ListBullet"/>
+      </w:pPr>
+      <w:r>
+        <w:rPr>
+          <w:rFonts w:ascii="Calibri" w:hAnsi="Calibri"/>
+          <w:color w:val="182420"/>
+          <w:sz w:val="22"/>
+        </w:rPr>
+        <w:t>Chuẩn bị bản phụ đề để đăng TikTok, Reels, Shorts hoặc YouTube.</w:t>
+      </w:r>
+    </w:p>
+    <w:p>
+      <w:r>
+        <w:rPr>
+          <w:rFonts w:ascii="Calibri" w:hAnsi="Calibri"/>
+          <w:color w:val="182420"/>
+          <w:sz w:val="22"/>
+        </w:rPr>
+        <w:t>Quy trình:</w:t>
+      </w:r>
+    </w:p>
+    <w:p>
+      <w:pPr>
+        <w:pStyle w:val="ListNumber"/>
+      </w:pPr>
+      <w:r>
+        <w:rPr>
+          <w:rFonts w:ascii="Calibri" w:hAnsi="Calibri"/>
+          <w:color w:val="182420"/>
+          <w:sz w:val="22"/>
+        </w:rPr>
+        <w:t>Mở mục Phụ đề / Dịch / Lồng tiếng.</w:t>
+      </w:r>
+    </w:p>
+    <w:p>
+      <w:pPr>
+        <w:pStyle w:val="ListNumber"/>
+      </w:pPr>
+      <w:r>
+        <w:rPr>
+          <w:rFonts w:ascii="Calibri" w:hAnsi="Calibri"/>
+          <w:color w:val="182420"/>
+          <w:sz w:val="22"/>
+        </w:rPr>
+        <w:t>Gửi video, audio hoặc nội dung cần xử lý.</w:t>
+      </w:r>
+    </w:p>
+    <w:p>
+      <w:pPr>
+        <w:pStyle w:val="ListNumber"/>
+      </w:pPr>
+      <w:r>
+        <w:rPr>
+          <w:rFonts w:ascii="Calibri" w:hAnsi="Calibri"/>
+          <w:color w:val="182420"/>
+          <w:sz w:val="22"/>
+        </w:rPr>
+        <w:t>Chọn tạo phụ đề, dịch hoặc lồng tiếng.</w:t>
+      </w:r>
+    </w:p>
+    <w:p>
+      <w:pPr>
+        <w:pStyle w:val="ListNumber"/>
+      </w:pPr>
+      <w:r>
+        <w:rPr>
+          <w:rFonts w:ascii="Calibri" w:hAnsi="Calibri"/>
+          <w:color w:val="182420"/>
+          <w:sz w:val="22"/>
+        </w:rPr>
+        <w:t>Chọn ngôn ngữ đích nếu cần.</w:t>
+      </w:r>
+    </w:p>
+    <w:p>
+      <w:pPr>
+        <w:pStyle w:val="ListNumber"/>
+      </w:pPr>
+      <w:r>
+        <w:rPr>
+          <w:rFonts w:ascii="Calibri" w:hAnsi="Calibri"/>
+          <w:color w:val="182420"/>
+          <w:sz w:val="22"/>
+        </w:rPr>
+        <w:t>Kiểm tra nội dung, chi phí và xác nhận.</w:t>
+      </w:r>
+    </w:p>
+    <w:p>
+      <w:pPr>
+        <w:pStyle w:val="ListNumber"/>
+      </w:pPr>
+      <w:r>
+        <w:rPr>
+          <w:rFonts w:ascii="Calibri" w:hAnsi="Calibri"/>
+          <w:color w:val="182420"/>
+          <w:sz w:val="22"/>
+        </w:rPr>
+        <w:t>Nhận kết quả, xem lại tên riêng, thuật ngữ sản phẩm và câu bán hàng trước khi đăng.</w:t>
+      </w:r>
+    </w:p>
+    <w:p>
+      <w:r>
+        <w:rPr>
+          <w:rFonts w:ascii="Calibri" w:hAnsi="Calibri"/>
+          <w:color w:val="182420"/>
+          <w:sz w:val="22"/>
+        </w:rPr>
+        <w:t>Mẹo: video có âm thanh rõ, ít tạp âm và ít người nói cùng lúc sẽ cho kết quả tốt hơn.</w:t>
+      </w:r>
+    </w:p>
+    <w:p>
+      <w:r>
+        <w:rPr>
+          <w:rFonts w:ascii="Calibri" w:hAnsi="Calibri"/>
+          <w:color w:val="182420"/>
+          <w:sz w:val="22"/>
+        </w:rPr>
+        <w:t>Nếu hệ thống đang bảo trì/nâng cấp, TOAN AAS chưa xử lý và chưa trừ Xu. Vui lòng thử lại sau.</w:t>
+      </w:r>
+    </w:p>
+    <w:p>
+      <w:pPr>
+        <w:pStyle w:val="Heading1"/>
+      </w:pPr>
+      <w:r>
+        <w:rPr>
+          <w:rFonts w:ascii="Calibri" w:hAnsi="Calibri"/>
+          <w:color w:val="182420"/>
+          <w:sz w:val="22"/>
+        </w:rPr>
+        <w:t>7. Xu &amp; bảng giá</w:t>
+      </w:r>
+    </w:p>
+    <w:p>
       <w:r>
         <w:rPr>
           <w:rFonts w:ascii="Calibri" w:hAnsi="Calibri"/>
@@ -469,7 +1631,6 @@
       <w:r>
         <w:rPr>
           <w:rFonts w:ascii="Calibri" w:hAnsi="Calibri"/>
-          <w:b/>
           <w:color w:val="182420"/>
           <w:sz w:val="22"/>
         </w:rPr>
@@ -483,11 +1644,10 @@
       <w:r>
         <w:rPr>
           <w:rFonts w:ascii="Calibri" w:hAnsi="Calibri"/>
-          <w:b/>
           <w:color w:val="182420"/>
           <w:sz w:val="22"/>
         </w:rPr>
-        <w:t>1.000 Xu = 100.000đ.</w:t>
+        <w:t>1.000 Xu = 100.000đ giá trị sử dụng nội bộ.</w:t>
       </w:r>
     </w:p>
     <w:p>
@@ -517,8 +1677,18 @@
       </w:r>
     </w:p>
     <w:p>
+      <w:r>
+        <w:rPr>
+          <w:rFonts w:ascii="Calibri" w:hAnsi="Calibri"/>
+          <w:color w:val="182420"/>
+          <w:sz w:val="22"/>
+        </w:rPr>
+        <w:t>Nạp Xu:</w:t>
+      </w:r>
+    </w:p>
+    <w:p>
       <w:pPr>
-        <w:pStyle w:val="Heading1"/>
+        <w:pStyle w:val="ListNumber"/>
       </w:pPr>
       <w:r>
         <w:rPr>
@@ -526,7 +1696,78 @@
           <w:color w:val="182420"/>
           <w:sz w:val="22"/>
         </w:rPr>
-        <w:t>4. Nạp Xu nội địa Việt Nam</w:t>
+        <w:t xml:space="preserve">Gõ </w:t>
+      </w:r>
+      <w:r>
+        <w:rPr>
+          <w:rFonts w:ascii="Consolas" w:hAnsi="Consolas"/>
+          <w:color w:val="053B2B"/>
+          <w:sz w:val="20"/>
+        </w:rPr>
+        <w:t>/naptien</w:t>
+      </w:r>
+      <w:r>
+        <w:rPr>
+          <w:rFonts w:ascii="Calibri" w:hAnsi="Calibri"/>
+          <w:color w:val="182420"/>
+          <w:sz w:val="22"/>
+        </w:rPr>
+        <w:t>.</w:t>
+      </w:r>
+    </w:p>
+    <w:p>
+      <w:pPr>
+        <w:pStyle w:val="ListNumber"/>
+      </w:pPr>
+      <w:r>
+        <w:rPr>
+          <w:rFonts w:ascii="Calibri" w:hAnsi="Calibri"/>
+          <w:color w:val="182420"/>
+          <w:sz w:val="22"/>
+        </w:rPr>
+        <w:t>Chọn mệnh giá.</w:t>
+      </w:r>
+    </w:p>
+    <w:p>
+      <w:pPr>
+        <w:pStyle w:val="ListNumber"/>
+      </w:pPr>
+      <w:r>
+        <w:rPr>
+          <w:rFonts w:ascii="Calibri" w:hAnsi="Calibri"/>
+          <w:color w:val="182420"/>
+          <w:sz w:val="22"/>
+        </w:rPr>
+        <w:t>Thanh toán theo hướng dẫn trong bot.</w:t>
+      </w:r>
+    </w:p>
+    <w:p>
+      <w:pPr>
+        <w:pStyle w:val="ListNumber"/>
+      </w:pPr>
+      <w:r>
+        <w:rPr>
+          <w:rFonts w:ascii="Calibri" w:hAnsi="Calibri"/>
+          <w:color w:val="182420"/>
+          <w:sz w:val="22"/>
+        </w:rPr>
+        <w:t xml:space="preserve">Gõ </w:t>
+      </w:r>
+      <w:r>
+        <w:rPr>
+          <w:rFonts w:ascii="Consolas" w:hAnsi="Consolas"/>
+          <w:color w:val="053B2B"/>
+          <w:sz w:val="20"/>
+        </w:rPr>
+        <w:t>/profile</w:t>
+      </w:r>
+      <w:r>
+        <w:rPr>
+          <w:rFonts w:ascii="Calibri" w:hAnsi="Calibri"/>
+          <w:color w:val="182420"/>
+          <w:sz w:val="22"/>
+        </w:rPr>
+        <w:t xml:space="preserve"> để kiểm tra số dư.</w:t>
       </w:r>
     </w:p>
     <w:p>
@@ -536,7 +1777,7 @@
           <w:color w:val="182420"/>
           <w:sz w:val="22"/>
         </w:rPr>
-        <w:t>TOAN AAS hỗ trợ các phương thức VND sau:</w:t>
+        <w:t>Khuyến mãi nạp:</w:t>
       </w:r>
     </w:p>
     <w:p>
@@ -549,7 +1790,7 @@
           <w:color w:val="182420"/>
           <w:sz w:val="22"/>
         </w:rPr>
-        <w:t>PayOS QR tự động.</w:t>
+        <w:t>Khuyến mãi nạp tiền chỉ áp dụng cho PayOS hoặc chuyển khoản ngân hàng Việt Nam nếu chương trình đang mở.</w:t>
       </w:r>
     </w:p>
     <w:p>
@@ -562,7 +1803,7 @@
           <w:color w:val="182420"/>
           <w:sz w:val="22"/>
         </w:rPr>
-        <w:t>QR ngân hàng ACB/VietQR thủ công.</w:t>
+        <w:t>Không áp dụng cho Zalo/MoMo hoặc kênh nạp quốc tế.</w:t>
       </w:r>
     </w:p>
     <w:p>
@@ -575,7 +1816,191 @@
           <w:color w:val="182420"/>
           <w:sz w:val="22"/>
         </w:rPr>
-        <w:t>ZaloPay cá nhân hoặc cửa hàng theo cấu hình hiện hành.</w:t>
+        <w:t>Người dùng quốc tế vẫn có thể nhận quyền lợi hạng thành viên, chiết khấu theo hạng hoặc ưu đãi không gắn với nạp nội địa nếu đủ điều kiện.</w:t>
+      </w:r>
+    </w:p>
+    <w:p>
+      <w:pPr>
+        <w:pStyle w:val="Heading1"/>
+      </w:pPr>
+      <w:r>
+        <w:rPr>
+          <w:rFonts w:ascii="Calibri" w:hAnsi="Calibri"/>
+          <w:color w:val="182420"/>
+          <w:sz w:val="22"/>
+        </w:rPr>
+        <w:t>8. FAQ / Hoàn Xu</w:t>
+      </w:r>
+    </w:p>
+    <w:p>
+      <w:r>
+        <w:rPr>
+          <w:rFonts w:ascii="Calibri" w:hAnsi="Calibri"/>
+          <w:b/>
+          <w:color w:val="182420"/>
+          <w:sz w:val="22"/>
+        </w:rPr>
+        <w:t>1. Tôi chỉ mở menu có bị trừ Xu không?</w:t>
+      </w:r>
+    </w:p>
+    <w:p>
+      <w:r>
+        <w:rPr>
+          <w:rFonts w:ascii="Calibri" w:hAnsi="Calibri"/>
+          <w:color w:val="182420"/>
+          <w:sz w:val="22"/>
+        </w:rPr>
+        <w:t>Không. Xem menu, hướng dẫn, bảng giá hoặc thử nhập mô tả chưa làm mất Xu nếu chưa đến bước xác nhận có phí.</w:t>
+      </w:r>
+    </w:p>
+    <w:p>
+      <w:r>
+        <w:rPr>
+          <w:rFonts w:ascii="Calibri" w:hAnsi="Calibri"/>
+          <w:b/>
+          <w:color w:val="182420"/>
+          <w:sz w:val="22"/>
+        </w:rPr>
+        <w:t>2. Khi nào TOAN AAS trừ Xu?</w:t>
+      </w:r>
+    </w:p>
+    <w:p>
+      <w:r>
+        <w:rPr>
+          <w:rFonts w:ascii="Calibri" w:hAnsi="Calibri"/>
+          <w:color w:val="182420"/>
+          <w:sz w:val="22"/>
+        </w:rPr>
+        <w:t>TOAN AAS chỉ trừ Xu khi bạn chọn bước có phí, xem giá và xác nhận xử lý.</w:t>
+      </w:r>
+    </w:p>
+    <w:p>
+      <w:r>
+        <w:rPr>
+          <w:rFonts w:ascii="Calibri" w:hAnsi="Calibri"/>
+          <w:b/>
+          <w:color w:val="182420"/>
+          <w:sz w:val="22"/>
+        </w:rPr>
+        <w:t>3. Khi nào được hoàn Xu?</w:t>
+      </w:r>
+    </w:p>
+    <w:p>
+      <w:r>
+        <w:rPr>
+          <w:rFonts w:ascii="Calibri" w:hAnsi="Calibri"/>
+          <w:color w:val="182420"/>
+          <w:sz w:val="22"/>
+        </w:rPr>
+        <w:t>Nếu đã trừ Xu nhưng hệ thống lỗi trước khi có kết quả hợp lệ theo chính sách, phần Xu của bước lỗi sẽ được hoàn lại.</w:t>
+      </w:r>
+    </w:p>
+    <w:p>
+      <w:r>
+        <w:rPr>
+          <w:rFonts w:ascii="Calibri" w:hAnsi="Calibri"/>
+          <w:b/>
+          <w:color w:val="182420"/>
+          <w:sz w:val="22"/>
+        </w:rPr>
+        <w:t>4. Thiếu Xu thì sao?</w:t>
+      </w:r>
+    </w:p>
+    <w:p>
+      <w:r>
+        <w:rPr>
+          <w:rFonts w:ascii="Calibri" w:hAnsi="Calibri"/>
+          <w:color w:val="182420"/>
+          <w:sz w:val="22"/>
+        </w:rPr>
+        <w:t xml:space="preserve">Bot sẽ báo thiếu Xu và hướng dẫn nạp thêm. Bạn có thể dùng </w:t>
+      </w:r>
+      <w:r>
+        <w:rPr>
+          <w:rFonts w:ascii="Consolas" w:hAnsi="Consolas"/>
+          <w:color w:val="053B2B"/>
+          <w:sz w:val="20"/>
+        </w:rPr>
+        <w:t>/naptien</w:t>
+      </w:r>
+      <w:r>
+        <w:rPr>
+          <w:rFonts w:ascii="Calibri" w:hAnsi="Calibri"/>
+          <w:color w:val="182420"/>
+          <w:sz w:val="22"/>
+        </w:rPr>
+        <w:t xml:space="preserve"> hoặc xem số dư bằng </w:t>
+      </w:r>
+      <w:r>
+        <w:rPr>
+          <w:rFonts w:ascii="Consolas" w:hAnsi="Consolas"/>
+          <w:color w:val="053B2B"/>
+          <w:sz w:val="20"/>
+        </w:rPr>
+        <w:t>/profile</w:t>
+      </w:r>
+      <w:r>
+        <w:rPr>
+          <w:rFonts w:ascii="Calibri" w:hAnsi="Calibri"/>
+          <w:color w:val="182420"/>
+          <w:sz w:val="22"/>
+        </w:rPr>
+        <w:t>.</w:t>
+      </w:r>
+    </w:p>
+    <w:p>
+      <w:r>
+        <w:rPr>
+          <w:rFonts w:ascii="Calibri" w:hAnsi="Calibri"/>
+          <w:b/>
+          <w:color w:val="182420"/>
+          <w:sz w:val="22"/>
+        </w:rPr>
+        <w:t>5. Có nên bấm tạo nhiều lần khi đang chờ không?</w:t>
+      </w:r>
+    </w:p>
+    <w:p>
+      <w:r>
+        <w:rPr>
+          <w:rFonts w:ascii="Calibri" w:hAnsi="Calibri"/>
+          <w:color w:val="182420"/>
+          <w:sz w:val="22"/>
+        </w:rPr>
+        <w:t>Không nên. Hãy chờ kết quả hoặc dùng nút kiểm tra trạng thái nếu bot hiển thị, để tránh tạo trùng yêu cầu.</w:t>
+      </w:r>
+    </w:p>
+    <w:p>
+      <w:r>
+        <w:rPr>
+          <w:rFonts w:ascii="Calibri" w:hAnsi="Calibri"/>
+          <w:b/>
+          <w:color w:val="182420"/>
+          <w:sz w:val="22"/>
+        </w:rPr>
+        <w:t>6. Cần hỗ trợ thì gửi gì?</w:t>
+      </w:r>
+    </w:p>
+    <w:p>
+      <w:r>
+        <w:rPr>
+          <w:rFonts w:ascii="Calibri" w:hAnsi="Calibri"/>
+          <w:color w:val="182420"/>
+          <w:sz w:val="22"/>
+        </w:rPr>
+        <w:t>Hãy gửi ID Telegram, ảnh chụp màn hình, thời gian giao dịch hoặc nội dung yêu cầu gần nhất để TOAN AAS kiểm tra nhanh hơn.</w:t>
+      </w:r>
+    </w:p>
+    <w:p>
+      <w:pPr>
+        <w:pStyle w:val="Heading1"/>
+      </w:pPr>
+      <w:r>
+        <w:rPr>
+          <w:rFonts w:ascii="Calibri" w:hAnsi="Calibri"/>
+          <w:color w:val="182420"/>
+          <w:sz w:val="22"/>
+        </w:rPr>
+        <w:t>9. Liên hệ</w:t>
       </w:r>
     </w:p>
     <w:p>
@@ -588,50 +2013,7 @@
           <w:color w:val="182420"/>
           <w:sz w:val="22"/>
         </w:rPr>
-        <w:t>MoMo/Túi Thần Tài theo cấu hình hiện hành.</w:t>
-      </w:r>
-    </w:p>
-    <w:p>
-      <w:r>
-        <w:rPr>
-          <w:rFonts w:ascii="Calibri" w:hAnsi="Calibri"/>
-          <w:color w:val="182420"/>
-          <w:sz w:val="22"/>
-        </w:rPr>
-        <w:t>PayOS có thể cộng Xu tự động khi webhook hợp lệ. Với nạp thủ công, ảnh bill hoặc nội dung người dùng gửi không tự động xác nhận giao dịch. Admin chỉ cộng Xu sau khi đối soát tiền thật.</w:t>
-      </w:r>
-    </w:p>
-    <w:p>
-      <w:r>
-        <w:rPr>
-          <w:rFonts w:ascii="Calibri" w:hAnsi="Calibri"/>
-          <w:color w:val="182420"/>
-          <w:sz w:val="22"/>
-        </w:rPr>
-        <w:t>Giao dịch VND nội địa có thể được hưởng ưu đãi nếu đáp ứng đúng điều kiện của chương trình đang áp dụng.</w:t>
-      </w:r>
-    </w:p>
-    <w:p>
-      <w:pPr>
-        <w:pStyle w:val="Heading1"/>
-      </w:pPr>
-      <w:r>
-        <w:rPr>
-          <w:rFonts w:ascii="Calibri" w:hAnsi="Calibri"/>
-          <w:color w:val="182420"/>
-          <w:sz w:val="22"/>
-        </w:rPr>
-        <w:t>5. Nạp Xu quốc tế</w:t>
-      </w:r>
-    </w:p>
-    <w:p>
-      <w:r>
-        <w:rPr>
-          <w:rFonts w:ascii="Calibri" w:hAnsi="Calibri"/>
-          <w:color w:val="182420"/>
-          <w:sz w:val="22"/>
-        </w:rPr>
-        <w:t>TOAN AAS hỗ trợ nạp thủ công bằng USD, CNY hoặc USDT theo cấu hình đang mở.</w:t>
+        <w:t>Admin: @toanaas</w:t>
       </w:r>
     </w:p>
     <w:p>
@@ -644,24 +2026,7 @@
           <w:color w:val="182420"/>
           <w:sz w:val="22"/>
         </w:rPr>
-        <w:t xml:space="preserve">Tỉ giá nội bộ USD: </w:t>
-      </w:r>
-      <w:r>
-        <w:rPr>
-          <w:rFonts w:ascii="Calibri" w:hAnsi="Calibri"/>
-          <w:b/>
-          <w:color w:val="182420"/>
-          <w:sz w:val="22"/>
-        </w:rPr>
-        <w:t>1 USD = 25.000đ</w:t>
-      </w:r>
-      <w:r>
-        <w:rPr>
-          <w:rFonts w:ascii="Calibri" w:hAnsi="Calibri"/>
-          <w:color w:val="182420"/>
-          <w:sz w:val="22"/>
-        </w:rPr>
-        <w:t>.</w:t>
+        <w:t>Bot: @toanaasbot</w:t>
       </w:r>
     </w:p>
     <w:p>
@@ -674,24 +2039,7 @@
           <w:color w:val="182420"/>
           <w:sz w:val="22"/>
         </w:rPr>
-        <w:t xml:space="preserve">Tỉ giá nội bộ CNY: </w:t>
-      </w:r>
-      <w:r>
-        <w:rPr>
-          <w:rFonts w:ascii="Calibri" w:hAnsi="Calibri"/>
-          <w:b/>
-          <w:color w:val="182420"/>
-          <w:sz w:val="22"/>
-        </w:rPr>
-        <w:t>1 CNY = 3.800đ</w:t>
-      </w:r>
-      <w:r>
-        <w:rPr>
-          <w:rFonts w:ascii="Calibri" w:hAnsi="Calibri"/>
-          <w:color w:val="182420"/>
-          <w:sz w:val="22"/>
-        </w:rPr>
-        <w:t>.</w:t>
+        <w:t>Website: www.toanaas.vn</w:t>
       </w:r>
     </w:p>
     <w:p>
@@ -704,1273 +2052,7 @@
           <w:color w:val="182420"/>
           <w:sz w:val="22"/>
         </w:rPr>
-        <w:t xml:space="preserve">Ví dụ: </w:t>
-      </w:r>
-      <w:r>
-        <w:rPr>
-          <w:rFonts w:ascii="Calibri" w:hAnsi="Calibri"/>
-          <w:b/>
-          <w:color w:val="182420"/>
-          <w:sz w:val="22"/>
-        </w:rPr>
-        <w:t>10 USD = 250.000đ = 2.500 Xu</w:t>
-      </w:r>
-      <w:r>
-        <w:rPr>
-          <w:rFonts w:ascii="Calibri" w:hAnsi="Calibri"/>
-          <w:color w:val="182420"/>
-          <w:sz w:val="22"/>
-        </w:rPr>
-        <w:t>.</w:t>
-      </w:r>
-    </w:p>
-    <w:p>
-      <w:pPr>
-        <w:pStyle w:val="ListBullet"/>
-      </w:pPr>
-      <w:r>
-        <w:rPr>
-          <w:rFonts w:ascii="Calibri" w:hAnsi="Calibri"/>
-          <w:color w:val="182420"/>
-          <w:sz w:val="22"/>
-        </w:rPr>
-        <w:t xml:space="preserve">Ví dụ: </w:t>
-      </w:r>
-      <w:r>
-        <w:rPr>
-          <w:rFonts w:ascii="Calibri" w:hAnsi="Calibri"/>
-          <w:b/>
-          <w:color w:val="182420"/>
-          <w:sz w:val="22"/>
-        </w:rPr>
-        <w:t>10 CNY = 38.000đ = 380 Xu</w:t>
-      </w:r>
-      <w:r>
-        <w:rPr>
-          <w:rFonts w:ascii="Calibri" w:hAnsi="Calibri"/>
-          <w:color w:val="182420"/>
-          <w:sz w:val="22"/>
-        </w:rPr>
-        <w:t>.</w:t>
-      </w:r>
-    </w:p>
-    <w:p>
-      <w:pPr>
-        <w:pStyle w:val="ListBullet"/>
-      </w:pPr>
-      <w:r>
-        <w:rPr>
-          <w:rFonts w:ascii="Calibri" w:hAnsi="Calibri"/>
-          <w:color w:val="182420"/>
-          <w:sz w:val="22"/>
-        </w:rPr>
-        <w:t>USDT TRC20 là phương thức dự phòng cuối cùng khi không dùng được phương thức khác.</w:t>
-      </w:r>
-    </w:p>
-    <w:p>
-      <w:r>
-        <w:rPr>
-          <w:rFonts w:ascii="Calibri" w:hAnsi="Calibri"/>
-          <w:color w:val="182420"/>
-          <w:sz w:val="22"/>
-        </w:rPr>
-        <w:t>Người dùng phải kiểm tra đúng địa chỉ ví và đúng mạng TRC20 trước khi chuyển. Gửi sai mạng có thể làm mất tiền và TOAN AAS không thể tự khôi phục giao dịch. TXID hoặc ảnh bill chỉ là dữ liệu để admin đối soát, không phải xác nhận tự động.</w:t>
-      </w:r>
-    </w:p>
-    <w:p>
-      <w:pPr>
-        <w:pStyle w:val="Heading1"/>
-      </w:pPr>
-      <w:r>
-        <w:rPr>
-          <w:rFonts w:ascii="Calibri" w:hAnsi="Calibri"/>
-          <w:color w:val="182420"/>
-          <w:sz w:val="22"/>
-        </w:rPr>
-        <w:t>6. Chính sách ưu đãi</w:t>
-      </w:r>
-    </w:p>
-    <w:p>
-      <w:pPr>
-        <w:pStyle w:val="ListBullet"/>
-      </w:pPr>
-      <w:r>
-        <w:rPr>
-          <w:rFonts w:ascii="Calibri" w:hAnsi="Calibri"/>
-          <w:color w:val="182420"/>
-          <w:sz w:val="22"/>
-        </w:rPr>
-        <w:t>Ưu đãi nạp lần đầu, Launch Bonus mệnh giá 50k/100k/200k/500k và các ưu đãi cộng thêm Xu chỉ áp dụng cho khách nội địa Việt Nam hoặc giao dịch VND qua PayOS, QR ngân hàng Việt Nam, ZaloPay hoặc MoMo.</w:t>
-      </w:r>
-    </w:p>
-    <w:p>
-      <w:pPr>
-        <w:pStyle w:val="ListBullet"/>
-      </w:pPr>
-      <w:r>
-        <w:rPr>
-          <w:rFonts w:ascii="Calibri" w:hAnsi="Calibri"/>
-          <w:color w:val="182420"/>
-          <w:sz w:val="22"/>
-        </w:rPr>
-        <w:t>Nạp quốc tế USD/CNY/USDT không áp dụng bonus cộng Xu.</w:t>
-      </w:r>
-    </w:p>
-    <w:p>
-      <w:pPr>
-        <w:pStyle w:val="ListBullet"/>
-      </w:pPr>
-      <w:r>
-        <w:rPr>
-          <w:rFonts w:ascii="Calibri" w:hAnsi="Calibri"/>
-          <w:color w:val="182420"/>
-          <w:sz w:val="22"/>
-        </w:rPr>
-        <w:t>Khách quốc tế vẫn có thể hưởng chiết khấu phần trăm theo hạng thành viên khi đủ điều kiện.</w:t>
-      </w:r>
-    </w:p>
-    <w:p>
-      <w:pPr>
-        <w:pStyle w:val="ListBullet"/>
-      </w:pPr>
-      <w:r>
-        <w:rPr>
-          <w:rFonts w:ascii="Calibri" w:hAnsi="Calibri"/>
-          <w:color w:val="182420"/>
-          <w:sz w:val="22"/>
-        </w:rPr>
-        <w:t>Nếu admin tặng thêm Xu cho khách quốc tế, khoản tặng phải được thực hiện bằng admin grant riêng và có lý do.</w:t>
-      </w:r>
-    </w:p>
-    <w:p>
-      <w:pPr>
-        <w:pStyle w:val="Heading1"/>
-      </w:pPr>
-      <w:r>
-        <w:rPr>
-          <w:rFonts w:ascii="Calibri" w:hAnsi="Calibri"/>
-          <w:color w:val="182420"/>
-          <w:sz w:val="22"/>
-        </w:rPr>
-        <w:t>7. Menu chính TOAN AAS</w:t>
-      </w:r>
-    </w:p>
-    <w:p>
-      <w:r>
-        <w:rPr>
-          <w:rFonts w:ascii="Calibri" w:hAnsi="Calibri"/>
-          <w:color w:val="182420"/>
-          <w:sz w:val="22"/>
-        </w:rPr>
-        <w:t>Các nhóm chức năng chính có thể gồm:</w:t>
-      </w:r>
-    </w:p>
-    <w:p>
-      <w:pPr>
-        <w:pStyle w:val="ListBullet"/>
-      </w:pPr>
-      <w:r>
-        <w:rPr>
-          <w:rFonts w:ascii="Calibri" w:hAnsi="Calibri"/>
-          <w:b/>
-          <w:color w:val="182420"/>
-          <w:sz w:val="22"/>
-        </w:rPr>
-        <w:t>Hỏi AI / Viết nội dung:</w:t>
-      </w:r>
-      <w:r>
-        <w:rPr>
-          <w:rFonts w:ascii="Calibri" w:hAnsi="Calibri"/>
-          <w:color w:val="182420"/>
-          <w:sz w:val="22"/>
-        </w:rPr>
-        <w:t xml:space="preserve"> hỏi đáp, phân tích, viết nội dung và hỗ trợ ý tưởng.</w:t>
-      </w:r>
-    </w:p>
-    <w:p>
-      <w:pPr>
-        <w:pStyle w:val="ListBullet"/>
-      </w:pPr>
-      <w:r>
-        <w:rPr>
-          <w:rFonts w:ascii="Calibri" w:hAnsi="Calibri"/>
-          <w:b/>
-          <w:color w:val="182420"/>
-          <w:sz w:val="22"/>
-        </w:rPr>
-        <w:t>Ảnh / Media Studio:</w:t>
-      </w:r>
-      <w:r>
-        <w:rPr>
-          <w:rFonts w:ascii="Calibri" w:hAnsi="Calibri"/>
-          <w:color w:val="182420"/>
-          <w:sz w:val="22"/>
-        </w:rPr>
-        <w:t xml:space="preserve"> tạo ảnh, prompt ảnh và công cụ xử lý ảnh.</w:t>
-      </w:r>
-    </w:p>
-    <w:p>
-      <w:pPr>
-        <w:pStyle w:val="ListBullet"/>
-      </w:pPr>
-      <w:r>
-        <w:rPr>
-          <w:rFonts w:ascii="Calibri" w:hAnsi="Calibri"/>
-          <w:b/>
-          <w:color w:val="182420"/>
-          <w:sz w:val="22"/>
-        </w:rPr>
-        <w:t>Video / Content Factory:</w:t>
-      </w:r>
-      <w:r>
-        <w:rPr>
-          <w:rFonts w:ascii="Calibri" w:hAnsi="Calibri"/>
-          <w:color w:val="182420"/>
-          <w:sz w:val="22"/>
-        </w:rPr>
-        <w:t xml:space="preserve"> ý tưởng, kịch bản, storyboard, prompt và tạo video theo công cụ đang mở.</w:t>
-      </w:r>
-    </w:p>
-    <w:p>
-      <w:pPr>
-        <w:pStyle w:val="ListBullet"/>
-      </w:pPr>
-      <w:r>
-        <w:rPr>
-          <w:rFonts w:ascii="Calibri" w:hAnsi="Calibri"/>
-          <w:b/>
-          <w:color w:val="182420"/>
-          <w:sz w:val="22"/>
-        </w:rPr>
-        <w:t>Voice / Phụ đề / Lồng tiếng:</w:t>
-      </w:r>
-      <w:r>
-        <w:rPr>
-          <w:rFonts w:ascii="Calibri" w:hAnsi="Calibri"/>
-          <w:color w:val="182420"/>
-          <w:sz w:val="22"/>
-        </w:rPr>
-        <w:t xml:space="preserve"> TTS, ASR, phụ đề, dịch và ghép giọng.</w:t>
-      </w:r>
-    </w:p>
-    <w:p>
-      <w:pPr>
-        <w:pStyle w:val="ListBullet"/>
-      </w:pPr>
-      <w:r>
-        <w:rPr>
-          <w:rFonts w:ascii="Calibri" w:hAnsi="Calibri"/>
-          <w:b/>
-          <w:color w:val="182420"/>
-          <w:sz w:val="22"/>
-        </w:rPr>
-        <w:t>PDF / Word / Tài liệu:</w:t>
-      </w:r>
-      <w:r>
-        <w:rPr>
-          <w:rFonts w:ascii="Calibri" w:hAnsi="Calibri"/>
-          <w:color w:val="182420"/>
-          <w:sz w:val="22"/>
-        </w:rPr>
-        <w:t xml:space="preserve"> chuyển đổi, nén, tách, gộp hoặc lưu tài liệu theo tính năng đang bật.</w:t>
-      </w:r>
-    </w:p>
-    <w:p>
-      <w:pPr>
-        <w:pStyle w:val="ListBullet"/>
-      </w:pPr>
-      <w:r>
-        <w:rPr>
-          <w:rFonts w:ascii="Calibri" w:hAnsi="Calibri"/>
-          <w:b/>
-          <w:color w:val="182420"/>
-          <w:sz w:val="22"/>
-        </w:rPr>
-        <w:t>Hỗ trợ / Ticket / Đối soát:</w:t>
-      </w:r>
-      <w:r>
-        <w:rPr>
-          <w:rFonts w:ascii="Calibri" w:hAnsi="Calibri"/>
-          <w:color w:val="182420"/>
-          <w:sz w:val="22"/>
-        </w:rPr>
-        <w:t xml:space="preserve"> hỏi đáp, tạo ticket và bổ sung dữ liệu cho admin kiểm tra.</w:t>
-      </w:r>
-    </w:p>
-    <w:p>
-      <w:pPr>
-        <w:pStyle w:val="ListBullet"/>
-      </w:pPr>
-      <w:r>
-        <w:rPr>
-          <w:rFonts w:ascii="Calibri" w:hAnsi="Calibri"/>
-          <w:b/>
-          <w:color w:val="182420"/>
-          <w:sz w:val="22"/>
-        </w:rPr>
-        <w:t>Premium / Bot riêng / Dịch vụ:</w:t>
-      </w:r>
-      <w:r>
-        <w:rPr>
-          <w:rFonts w:ascii="Calibri" w:hAnsi="Calibri"/>
-          <w:color w:val="182420"/>
-          <w:sz w:val="22"/>
-        </w:rPr>
-        <w:t xml:space="preserve"> tư vấn triển khai theo nhu cầu.</w:t>
-      </w:r>
-    </w:p>
-    <w:p>
-      <w:pPr>
-        <w:pStyle w:val="ListBullet"/>
-      </w:pPr>
-      <w:r>
-        <w:rPr>
-          <w:rFonts w:ascii="Calibri" w:hAnsi="Calibri"/>
-          <w:b/>
-          <w:color w:val="182420"/>
-          <w:sz w:val="22"/>
-        </w:rPr>
-        <w:t>Bảng giá / Nạp Xu / Thanh toán:</w:t>
-      </w:r>
-      <w:r>
-        <w:rPr>
-          <w:rFonts w:ascii="Calibri" w:hAnsi="Calibri"/>
-          <w:color w:val="182420"/>
-          <w:sz w:val="22"/>
-        </w:rPr>
-        <w:t xml:space="preserve"> xem giá, số dư và phương thức thanh toán.</w:t>
-      </w:r>
-    </w:p>
-    <w:p>
-      <w:pPr>
-        <w:pStyle w:val="Heading1"/>
-      </w:pPr>
-      <w:r>
-        <w:rPr>
-          <w:rFonts w:ascii="Calibri" w:hAnsi="Calibri"/>
-          <w:color w:val="182420"/>
-          <w:sz w:val="22"/>
-        </w:rPr>
-        <w:t>8. Ảnh / Media Studio</w:t>
-      </w:r>
-    </w:p>
-    <w:p>
-      <w:r>
-        <w:rPr>
-          <w:rFonts w:ascii="Calibri" w:hAnsi="Calibri"/>
-          <w:color w:val="182420"/>
-          <w:sz w:val="22"/>
-        </w:rPr>
-        <w:t>TOAN AAS có thể hỗ trợ:</w:t>
-      </w:r>
-    </w:p>
-    <w:p>
-      <w:pPr>
-        <w:pStyle w:val="ListBullet"/>
-      </w:pPr>
-      <w:r>
-        <w:rPr>
-          <w:rFonts w:ascii="Calibri" w:hAnsi="Calibri"/>
-          <w:color w:val="182420"/>
-          <w:sz w:val="22"/>
-        </w:rPr>
-        <w:t>Tạo ảnh AI theo prompt hoặc gợi ý.</w:t>
-      </w:r>
-    </w:p>
-    <w:p>
-      <w:pPr>
-        <w:pStyle w:val="ListBullet"/>
-      </w:pPr>
-      <w:r>
-        <w:rPr>
-          <w:rFonts w:ascii="Calibri" w:hAnsi="Calibri"/>
-          <w:color w:val="182420"/>
-          <w:sz w:val="22"/>
-        </w:rPr>
-        <w:t>Viết prompt ảnh theo sản phẩm, thương hiệu hoặc nền tảng.</w:t>
-      </w:r>
-    </w:p>
-    <w:p>
-      <w:pPr>
-        <w:pStyle w:val="ListBullet"/>
-      </w:pPr>
-      <w:r>
-        <w:rPr>
-          <w:rFonts w:ascii="Calibri" w:hAnsi="Calibri"/>
-          <w:color w:val="182420"/>
-          <w:sz w:val="22"/>
-        </w:rPr>
-        <w:t>Tạo ảnh sản phẩm, banner và nội dung truyền thông.</w:t>
-      </w:r>
-    </w:p>
-    <w:p>
-      <w:pPr>
-        <w:pStyle w:val="ListBullet"/>
-      </w:pPr>
-      <w:r>
-        <w:rPr>
-          <w:rFonts w:ascii="Calibri" w:hAnsi="Calibri"/>
-          <w:color w:val="182420"/>
-          <w:sz w:val="22"/>
-        </w:rPr>
-        <w:t>Chỉnh màu, nâng nét, crop, resize, thêm chữ/logo khi công cụ tương ứng được mở.</w:t>
-      </w:r>
-    </w:p>
-    <w:p>
-      <w:r>
-        <w:rPr>
-          <w:rFonts w:ascii="Calibri" w:hAnsi="Calibri"/>
-          <w:color w:val="182420"/>
-          <w:sz w:val="22"/>
-        </w:rPr>
-        <w:t>Ảnh có chữ, logo, bàn tay hoặc khuôn mặt có thể cần kiểm tra và tạo lại. Tính năng chưa mở sẽ có guard; bot không gọi provider và không trừ Xu.</w:t>
-      </w:r>
-    </w:p>
-    <w:p>
-      <w:pPr>
-        <w:pStyle w:val="Heading1"/>
-      </w:pPr>
-      <w:r>
-        <w:rPr>
-          <w:rFonts w:ascii="Calibri" w:hAnsi="Calibri"/>
-          <w:color w:val="182420"/>
-          <w:sz w:val="22"/>
-        </w:rPr>
-        <w:t>9. Video / Content Factory</w:t>
-      </w:r>
-    </w:p>
-    <w:p>
-      <w:r>
-        <w:rPr>
-          <w:rFonts w:ascii="Calibri" w:hAnsi="Calibri"/>
-          <w:color w:val="182420"/>
-          <w:sz w:val="22"/>
-        </w:rPr>
-        <w:t>Các quy trình video có thể gồm:</w:t>
-      </w:r>
-    </w:p>
-    <w:p>
-      <w:pPr>
-        <w:pStyle w:val="ListBullet"/>
-      </w:pPr>
-      <w:r>
-        <w:rPr>
-          <w:rFonts w:ascii="Calibri" w:hAnsi="Calibri"/>
-          <w:color w:val="182420"/>
-          <w:sz w:val="22"/>
-        </w:rPr>
-        <w:t>Ý tưởng video và video theo trend.</w:t>
-      </w:r>
-    </w:p>
-    <w:p>
-      <w:pPr>
-        <w:pStyle w:val="ListBullet"/>
-      </w:pPr>
-      <w:r>
-        <w:rPr>
-          <w:rFonts w:ascii="Calibri" w:hAnsi="Calibri"/>
-          <w:color w:val="182420"/>
-          <w:sz w:val="22"/>
-        </w:rPr>
-        <w:t>Ý tưởng quảng cáo hoặc concept cinematic.</w:t>
-      </w:r>
-    </w:p>
-    <w:p>
-      <w:pPr>
-        <w:pStyle w:val="ListBullet"/>
-      </w:pPr>
-      <w:r>
-        <w:rPr>
-          <w:rFonts w:ascii="Calibri" w:hAnsi="Calibri"/>
-          <w:color w:val="182420"/>
-          <w:sz w:val="22"/>
-        </w:rPr>
-        <w:t>Kịch bản -&gt; ảnh -&gt; video.</w:t>
-      </w:r>
-    </w:p>
-    <w:p>
-      <w:pPr>
-        <w:pStyle w:val="ListBullet"/>
-      </w:pPr>
-      <w:r>
-        <w:rPr>
-          <w:rFonts w:ascii="Calibri" w:hAnsi="Calibri"/>
-          <w:color w:val="182420"/>
-          <w:sz w:val="22"/>
-        </w:rPr>
-        <w:t>Ghép ảnh thành video bằng Local Worker/FFmpeg.</w:t>
-      </w:r>
-    </w:p>
-    <w:p>
-      <w:pPr>
-        <w:pStyle w:val="ListBullet"/>
-      </w:pPr>
-      <w:r>
-        <w:rPr>
-          <w:rFonts w:ascii="Calibri" w:hAnsi="Calibri"/>
-          <w:color w:val="182420"/>
-          <w:sz w:val="22"/>
-        </w:rPr>
-        <w:t>Video AI chân thật khi provider sẵn sàng.</w:t>
-      </w:r>
-    </w:p>
-    <w:p>
-      <w:pPr>
-        <w:pStyle w:val="ListBullet"/>
-      </w:pPr>
-      <w:r>
-        <w:rPr>
-          <w:rFonts w:ascii="Calibri" w:hAnsi="Calibri"/>
-          <w:color w:val="182420"/>
-          <w:sz w:val="22"/>
-        </w:rPr>
-        <w:t>Video dài chia đoạn để giảm lỗi và kiểm soát chi phí.</w:t>
-      </w:r>
-    </w:p>
-    <w:p>
-      <w:pPr>
-        <w:pStyle w:val="ListBullet"/>
-      </w:pPr>
-      <w:r>
-        <w:rPr>
-          <w:rFonts w:ascii="Calibri" w:hAnsi="Calibri"/>
-          <w:color w:val="182420"/>
-          <w:sz w:val="22"/>
-        </w:rPr>
-        <w:t>Prompt video, camera motion và hành động theo từng cảnh.</w:t>
-      </w:r>
-    </w:p>
-    <w:p>
-      <w:pPr>
-        <w:pStyle w:val="Heading1"/>
-      </w:pPr>
-      <w:r>
-        <w:rPr>
-          <w:rFonts w:ascii="Calibri" w:hAnsi="Calibri"/>
-          <w:color w:val="182420"/>
-          <w:sz w:val="22"/>
-        </w:rPr>
-        <w:t>10. Giá video</w:t>
-      </w:r>
-    </w:p>
-    <w:p>
-      <w:r>
-        <w:rPr>
-          <w:rFonts w:ascii="Calibri" w:hAnsi="Calibri"/>
-          <w:color w:val="182420"/>
-          <w:sz w:val="22"/>
-        </w:rPr>
-        <w:t>Video không dùng một mức giá chung cho mọi trường hợp. Chi phí có thể phụ thuộc:</w:t>
-      </w:r>
-    </w:p>
-    <w:p>
-      <w:pPr>
-        <w:pStyle w:val="ListBullet"/>
-      </w:pPr>
-      <w:r>
-        <w:rPr>
-          <w:rFonts w:ascii="Calibri" w:hAnsi="Calibri"/>
-          <w:color w:val="182420"/>
-          <w:sz w:val="22"/>
-        </w:rPr>
-        <w:t>Số giây và số đoạn.</w:t>
-      </w:r>
-    </w:p>
-    <w:p>
-      <w:pPr>
-        <w:pStyle w:val="ListBullet"/>
-      </w:pPr>
-      <w:r>
-        <w:rPr>
-          <w:rFonts w:ascii="Calibri" w:hAnsi="Calibri"/>
-          <w:color w:val="182420"/>
-          <w:sz w:val="22"/>
-        </w:rPr>
-        <w:t>Loại xử lý hoặc model/provider.</w:t>
-      </w:r>
-    </w:p>
-    <w:p>
-      <w:pPr>
-        <w:pStyle w:val="ListBullet"/>
-      </w:pPr>
-      <w:r>
-        <w:rPr>
-          <w:rFonts w:ascii="Calibri" w:hAnsi="Calibri"/>
-          <w:color w:val="182420"/>
-          <w:sz w:val="22"/>
-        </w:rPr>
-        <w:t>Chất lượng đầu ra.</w:t>
-      </w:r>
-    </w:p>
-    <w:p>
-      <w:pPr>
-        <w:pStyle w:val="ListBullet"/>
-      </w:pPr>
-      <w:r>
-        <w:rPr>
-          <w:rFonts w:ascii="Calibri" w:hAnsi="Calibri"/>
-          <w:color w:val="182420"/>
-          <w:sz w:val="22"/>
-        </w:rPr>
-        <w:t>Số cảnh hoặc số ảnh đầu vào.</w:t>
-      </w:r>
-    </w:p>
-    <w:p>
-      <w:pPr>
-        <w:pStyle w:val="ListBullet"/>
-      </w:pPr>
-      <w:r>
-        <w:rPr>
-          <w:rFonts w:ascii="Calibri" w:hAnsi="Calibri"/>
-          <w:color w:val="182420"/>
-          <w:sz w:val="22"/>
-        </w:rPr>
-        <w:t>Phụ đề, dịch và lồng tiếng add-on.</w:t>
-      </w:r>
-    </w:p>
-    <w:p>
-      <w:r>
-        <w:rPr>
-          <w:rFonts w:ascii="Calibri" w:hAnsi="Calibri"/>
-          <w:color w:val="182420"/>
-          <w:sz w:val="22"/>
-        </w:rPr>
-        <w:t>Ghép ảnh thành video bằng công cụ local thường rẻ hơn Video AI chân thật. Bot chỉ chạy tác vụ thật sau khi người dùng xem và xác nhận chi phí. Nếu provider chưa sẵn sàng, bot báo rõ và không trừ Xu.</w:t>
-      </w:r>
-    </w:p>
-    <w:p>
-      <w:pPr>
-        <w:pStyle w:val="Heading1"/>
-      </w:pPr>
-      <w:r>
-        <w:rPr>
-          <w:rFonts w:ascii="Calibri" w:hAnsi="Calibri"/>
-          <w:color w:val="182420"/>
-          <w:sz w:val="22"/>
-        </w:rPr>
-        <w:t>11. Voice / Phụ đề / Lồng tiếng</w:t>
-      </w:r>
-    </w:p>
-    <w:p>
-      <w:r>
-        <w:rPr>
-          <w:rFonts w:ascii="Calibri" w:hAnsi="Calibri"/>
-          <w:color w:val="182420"/>
-          <w:sz w:val="22"/>
-        </w:rPr>
-        <w:t>TOAN AAS có thể hỗ trợ:</w:t>
-      </w:r>
-    </w:p>
-    <w:p>
-      <w:pPr>
-        <w:pStyle w:val="ListBullet"/>
-      </w:pPr>
-      <w:r>
-        <w:rPr>
-          <w:rFonts w:ascii="Calibri" w:hAnsi="Calibri"/>
-          <w:color w:val="182420"/>
-          <w:sz w:val="22"/>
-        </w:rPr>
-        <w:t>Tạo giọng đọc TTS.</w:t>
-      </w:r>
-    </w:p>
-    <w:p>
-      <w:pPr>
-        <w:pStyle w:val="ListBullet"/>
-      </w:pPr>
-      <w:r>
-        <w:rPr>
-          <w:rFonts w:ascii="Calibri" w:hAnsi="Calibri"/>
-          <w:color w:val="182420"/>
-          <w:sz w:val="22"/>
-        </w:rPr>
-        <w:t>Tạo phụ đề từ audio/video.</w:t>
-      </w:r>
-    </w:p>
-    <w:p>
-      <w:pPr>
-        <w:pStyle w:val="ListBullet"/>
-      </w:pPr>
-      <w:r>
-        <w:rPr>
-          <w:rFonts w:ascii="Calibri" w:hAnsi="Calibri"/>
-          <w:color w:val="182420"/>
-          <w:sz w:val="22"/>
-        </w:rPr>
-        <w:t>Dịch phụ đề.</w:t>
-      </w:r>
-    </w:p>
-    <w:p>
-      <w:pPr>
-        <w:pStyle w:val="ListBullet"/>
-      </w:pPr>
-      <w:r>
-        <w:rPr>
-          <w:rFonts w:ascii="Calibri" w:hAnsi="Calibri"/>
-          <w:color w:val="182420"/>
-          <w:sz w:val="22"/>
-        </w:rPr>
-        <w:t>Lồng tiếng.</w:t>
-      </w:r>
-    </w:p>
-    <w:p>
-      <w:pPr>
-        <w:pStyle w:val="ListBullet"/>
-      </w:pPr>
-      <w:r>
-        <w:rPr>
-          <w:rFonts w:ascii="Calibri" w:hAnsi="Calibri"/>
-          <w:color w:val="182420"/>
-          <w:sz w:val="22"/>
-        </w:rPr>
-        <w:t>Pipeline phụ đề + dịch + lồng tiếng + ghép audio/video.</w:t>
-      </w:r>
-    </w:p>
-    <w:p>
-      <w:r>
-        <w:rPr>
-          <w:rFonts w:ascii="Calibri" w:hAnsi="Calibri"/>
-          <w:color w:val="182420"/>
-          <w:sz w:val="22"/>
-        </w:rPr>
-        <w:t>Kết quả có thể cần kiểm tra lại nếu âm thanh khó nghe, video dài hoặc có nhiều người nói. Nếu provider hoặc worker chưa sẵn sàng, hệ thống không gọi API và không trừ Xu.</w:t>
-      </w:r>
-    </w:p>
-    <w:p>
-      <w:pPr>
-        <w:pStyle w:val="Heading1"/>
-      </w:pPr>
-      <w:r>
-        <w:rPr>
-          <w:rFonts w:ascii="Calibri" w:hAnsi="Calibri"/>
-          <w:color w:val="182420"/>
-          <w:sz w:val="22"/>
-        </w:rPr>
-        <w:t>12. PDF / Word / Tài liệu</w:t>
-      </w:r>
-    </w:p>
-    <w:p>
-      <w:r>
-        <w:rPr>
-          <w:rFonts w:ascii="Calibri" w:hAnsi="Calibri"/>
-          <w:color w:val="182420"/>
-          <w:sz w:val="22"/>
-        </w:rPr>
-        <w:t>Các công cụ tài liệu có thể gồm xử lý PDF, Word, chuyển đổi, nén, tách, gộp và lưu tài liệu. Công cụ local miễn phí sẽ hiển thị 0 Xu khi chính sách đó đang áp dụng. Người dùng nên gửi từng file một để giảm lỗi; nếu gửi nhiều file, bot sẽ xử lý theo khả năng của công cụ đang mở.</w:t>
-      </w:r>
-    </w:p>
-    <w:p>
-      <w:pPr>
-        <w:pStyle w:val="Heading1"/>
-      </w:pPr>
-      <w:r>
-        <w:rPr>
-          <w:rFonts w:ascii="Calibri" w:hAnsi="Calibri"/>
-          <w:color w:val="182420"/>
-          <w:sz w:val="22"/>
-        </w:rPr>
-        <w:t>13. Hỗ trợ / Ticket / Đối soát</w:t>
-      </w:r>
-    </w:p>
-    <w:p>
-      <w:r>
-        <w:rPr>
-          <w:rFonts w:ascii="Calibri" w:hAnsi="Calibri"/>
-          <w:color w:val="182420"/>
-          <w:sz w:val="22"/>
-        </w:rPr>
-        <w:t>Người dùng có thể:</w:t>
-      </w:r>
-    </w:p>
-    <w:p>
-      <w:pPr>
-        <w:pStyle w:val="ListBullet"/>
-      </w:pPr>
-      <w:r>
-        <w:rPr>
-          <w:rFonts w:ascii="Calibri" w:hAnsi="Calibri"/>
-          <w:color w:val="182420"/>
-          <w:sz w:val="22"/>
-        </w:rPr>
-        <w:t>Hỏi cách sử dụng hoặc cách nạp Xu và nhận trả lời ngay.</w:t>
-      </w:r>
-    </w:p>
-    <w:p>
-      <w:pPr>
-        <w:pStyle w:val="ListBullet"/>
-      </w:pPr>
-      <w:r>
-        <w:rPr>
-          <w:rFonts w:ascii="Calibri" w:hAnsi="Calibri"/>
-          <w:color w:val="182420"/>
-          <w:sz w:val="22"/>
-        </w:rPr>
-        <w:t>Tạo ticket khi cần admin kiểm tra sâu hơn.</w:t>
-      </w:r>
-    </w:p>
-    <w:p>
-      <w:pPr>
-        <w:pStyle w:val="ListBullet"/>
-      </w:pPr>
-      <w:r>
-        <w:rPr>
-          <w:rFonts w:ascii="Calibri" w:hAnsi="Calibri"/>
-          <w:color w:val="182420"/>
-          <w:sz w:val="22"/>
-        </w:rPr>
-        <w:t>Xem ticket của mình và gửi thêm nội dung.</w:t>
-      </w:r>
-    </w:p>
-    <w:p>
-      <w:pPr>
-        <w:pStyle w:val="ListBullet"/>
-      </w:pPr>
-      <w:r>
-        <w:rPr>
-          <w:rFonts w:ascii="Calibri" w:hAnsi="Calibri"/>
-          <w:color w:val="182420"/>
-          <w:sz w:val="22"/>
-        </w:rPr>
-        <w:t>Đối soát nạp thủ công.</w:t>
-      </w:r>
-    </w:p>
-    <w:p>
-      <w:pPr>
-        <w:pStyle w:val="ListBullet"/>
-      </w:pPr>
-      <w:r>
-        <w:rPr>
-          <w:rFonts w:ascii="Calibri" w:hAnsi="Calibri"/>
-          <w:color w:val="182420"/>
-          <w:sz w:val="22"/>
-        </w:rPr>
-        <w:t>Báo lỗi ảnh, video, voice hoặc tài liệu.</w:t>
-      </w:r>
-    </w:p>
-    <w:p>
-      <w:pPr>
-        <w:pStyle w:val="ListBullet"/>
-      </w:pPr>
-      <w:r>
-        <w:rPr>
-          <w:rFonts w:ascii="Calibri" w:hAnsi="Calibri"/>
-          <w:color w:val="182420"/>
-          <w:sz w:val="22"/>
-        </w:rPr>
-        <w:t>Yêu cầu kiểm tra hoàn Xu/refund.</w:t>
-      </w:r>
-    </w:p>
-    <w:p>
-      <w:r>
-        <w:rPr>
-          <w:rFonts w:ascii="Calibri" w:hAnsi="Calibri"/>
-          <w:color w:val="182420"/>
-          <w:sz w:val="22"/>
-        </w:rPr>
-        <w:t xml:space="preserve">Khi cần kiểm tra thanh toán hoặc job, hãy tạo ticket trong bot và cung cấp mã giao dịch/job liên quan. Admin chính thức: </w:t>
-      </w:r>
-      <w:r>
-        <w:rPr>
-          <w:rFonts w:ascii="Calibri" w:hAnsi="Calibri"/>
-          <w:b/>
-          <w:color w:val="08734F"/>
-          <w:sz w:val="22"/>
-        </w:rPr>
-        <w:t>@toanaas (https://t.me/toanaas)</w:t>
-      </w:r>
-      <w:r>
-        <w:rPr>
-          <w:rFonts w:ascii="Calibri" w:hAnsi="Calibri"/>
-          <w:color w:val="182420"/>
-          <w:sz w:val="22"/>
-        </w:rPr>
-        <w:t>.</w:t>
-      </w:r>
-    </w:p>
-    <w:p>
-      <w:pPr>
-        <w:pStyle w:val="Heading1"/>
-      </w:pPr>
-      <w:r>
-        <w:rPr>
-          <w:rFonts w:ascii="Calibri" w:hAnsi="Calibri"/>
-          <w:color w:val="182420"/>
-          <w:sz w:val="22"/>
-        </w:rPr>
-        <w:t>14. Premium / Bot riêng / Dịch vụ</w:t>
-      </w:r>
-    </w:p>
-    <w:p>
-      <w:r>
-        <w:rPr>
-          <w:rFonts w:ascii="Calibri" w:hAnsi="Calibri"/>
-          <w:color w:val="182420"/>
-          <w:sz w:val="22"/>
-        </w:rPr>
-        <w:t>TOAN AAS có thể tư vấn và triển khai:</w:t>
-      </w:r>
-    </w:p>
-    <w:p>
-      <w:pPr>
-        <w:pStyle w:val="ListBullet"/>
-      </w:pPr>
-      <w:r>
-        <w:rPr>
-          <w:rFonts w:ascii="Calibri" w:hAnsi="Calibri"/>
-          <w:color w:val="182420"/>
-          <w:sz w:val="22"/>
-        </w:rPr>
-        <w:t>Premium theo chính sách đang mở.</w:t>
-      </w:r>
-    </w:p>
-    <w:p>
-      <w:pPr>
-        <w:pStyle w:val="ListBullet"/>
-      </w:pPr>
-      <w:r>
-        <w:rPr>
-          <w:rFonts w:ascii="Calibri" w:hAnsi="Calibri"/>
-          <w:color w:val="182420"/>
-          <w:sz w:val="22"/>
-        </w:rPr>
-        <w:t>Bot CSKH/ticket.</w:t>
-      </w:r>
-    </w:p>
-    <w:p>
-      <w:pPr>
-        <w:pStyle w:val="ListBullet"/>
-      </w:pPr>
-      <w:r>
-        <w:rPr>
-          <w:rFonts w:ascii="Calibri" w:hAnsi="Calibri"/>
-          <w:color w:val="182420"/>
-          <w:sz w:val="22"/>
-        </w:rPr>
-        <w:t>Bot bán hàng hoặc shop online.</w:t>
-      </w:r>
-    </w:p>
-    <w:p>
-      <w:pPr>
-        <w:pStyle w:val="ListBullet"/>
-      </w:pPr>
-      <w:r>
-        <w:rPr>
-          <w:rFonts w:ascii="Calibri" w:hAnsi="Calibri"/>
-          <w:color w:val="182420"/>
-          <w:sz w:val="22"/>
-        </w:rPr>
-        <w:t>Bot content/marketing.</w:t>
-      </w:r>
-    </w:p>
-    <w:p>
-      <w:pPr>
-        <w:pStyle w:val="ListBullet"/>
-      </w:pPr>
-      <w:r>
-        <w:rPr>
-          <w:rFonts w:ascii="Calibri" w:hAnsi="Calibri"/>
-          <w:color w:val="182420"/>
-          <w:sz w:val="22"/>
-        </w:rPr>
-        <w:t>Bot nội bộ doanh nghiệp.</w:t>
-      </w:r>
-    </w:p>
-    <w:p>
-      <w:pPr>
-        <w:pStyle w:val="ListBullet"/>
-      </w:pPr>
-      <w:r>
-        <w:rPr>
-          <w:rFonts w:ascii="Calibri" w:hAnsi="Calibri"/>
-          <w:color w:val="182420"/>
-          <w:sz w:val="22"/>
-        </w:rPr>
-        <w:t>Workflow tự động hóa riêng.</w:t>
-      </w:r>
-    </w:p>
-    <w:p>
-      <w:r>
-        <w:rPr>
-          <w:rFonts w:ascii="Calibri" w:hAnsi="Calibri"/>
-          <w:color w:val="182420"/>
-          <w:sz w:val="22"/>
-        </w:rPr>
-        <w:t>Giá và phạm vi triển khai phụ thuộc nhu cầu, quy mô, tích hợp và ngân sách thực tế.</w:t>
-      </w:r>
-    </w:p>
-    <w:p>
-      <w:pPr>
-        <w:pStyle w:val="Heading1"/>
-      </w:pPr>
-      <w:r>
-        <w:rPr>
-          <w:rFonts w:ascii="Calibri" w:hAnsi="Calibri"/>
-          <w:color w:val="182420"/>
-          <w:sz w:val="22"/>
-        </w:rPr>
-        <w:t>15. Mẹo sử dụng hiệu quả</w:t>
-      </w:r>
-    </w:p>
-    <w:p>
-      <w:pPr>
-        <w:pStyle w:val="ListBullet"/>
-      </w:pPr>
-      <w:r>
-        <w:rPr>
-          <w:rFonts w:ascii="Calibri" w:hAnsi="Calibri"/>
-          <w:color w:val="182420"/>
-          <w:sz w:val="22"/>
-        </w:rPr>
-        <w:t>Mô tả rõ sản phẩm, ngách, nền tảng, mục tiêu và thời lượng.</w:t>
-      </w:r>
-    </w:p>
-    <w:p>
-      <w:pPr>
-        <w:pStyle w:val="ListBullet"/>
-      </w:pPr>
-      <w:r>
-        <w:rPr>
-          <w:rFonts w:ascii="Calibri" w:hAnsi="Calibri"/>
-          <w:color w:val="182420"/>
-          <w:sz w:val="22"/>
-        </w:rPr>
-        <w:t>Gửi ảnh/video mẫu nếu bạn có quyền sử dụng.</w:t>
-      </w:r>
-    </w:p>
-    <w:p>
-      <w:pPr>
-        <w:pStyle w:val="ListBullet"/>
-      </w:pPr>
-      <w:r>
-        <w:rPr>
-          <w:rFonts w:ascii="Calibri" w:hAnsi="Calibri"/>
-          <w:color w:val="182420"/>
-          <w:sz w:val="22"/>
-        </w:rPr>
-        <w:t>Kiểm tra prompt trước khi render tác vụ tốn phí.</w:t>
-      </w:r>
-    </w:p>
-    <w:p>
-      <w:pPr>
-        <w:pStyle w:val="ListBullet"/>
-      </w:pPr>
-      <w:r>
-        <w:rPr>
-          <w:rFonts w:ascii="Calibri" w:hAnsi="Calibri"/>
-          <w:color w:val="182420"/>
-          <w:sz w:val="22"/>
-        </w:rPr>
-        <w:t>Với video dài, nên chia đoạn.</w:t>
-      </w:r>
-    </w:p>
-    <w:p>
-      <w:pPr>
-        <w:pStyle w:val="ListBullet"/>
-      </w:pPr>
-      <w:r>
-        <w:rPr>
-          <w:rFonts w:ascii="Calibri" w:hAnsi="Calibri"/>
-          <w:color w:val="182420"/>
-          <w:sz w:val="22"/>
-        </w:rPr>
-        <w:t>Không bấm tạo nhiều lần khi bot đang xử lý.</w:t>
-      </w:r>
-    </w:p>
-    <w:p>
-      <w:pPr>
-        <w:pStyle w:val="ListBullet"/>
-      </w:pPr>
-      <w:r>
-        <w:rPr>
-          <w:rFonts w:ascii="Calibri" w:hAnsi="Calibri"/>
-          <w:color w:val="182420"/>
-          <w:sz w:val="22"/>
-        </w:rPr>
-        <w:t>Nếu bot báo “chưa trừ Xu”, tác vụ đó chưa được tính phí.</w:t>
-      </w:r>
-    </w:p>
-    <w:p>
-      <w:pPr>
-        <w:pStyle w:val="Heading1"/>
-      </w:pPr>
-      <w:r>
-        <w:rPr>
-          <w:rFonts w:ascii="Calibri" w:hAnsi="Calibri"/>
-          <w:color w:val="182420"/>
-          <w:sz w:val="22"/>
-        </w:rPr>
-        <w:t>16. Những gì TOAN AAS chưa cam kết</w:t>
-      </w:r>
-    </w:p>
-    <w:p>
-      <w:pPr>
-        <w:pStyle w:val="ListBullet"/>
-      </w:pPr>
-      <w:r>
-        <w:rPr>
-          <w:rFonts w:ascii="Calibri" w:hAnsi="Calibri"/>
-          <w:color w:val="182420"/>
-          <w:sz w:val="22"/>
-        </w:rPr>
-        <w:t>Không cam kết nội dung sẽ viral hoặc tạo doanh thu.</w:t>
-      </w:r>
-    </w:p>
-    <w:p>
-      <w:pPr>
-        <w:pStyle w:val="ListBullet"/>
-      </w:pPr>
-      <w:r>
-        <w:rPr>
-          <w:rFonts w:ascii="Calibri" w:hAnsi="Calibri"/>
-          <w:color w:val="182420"/>
-          <w:sz w:val="22"/>
-        </w:rPr>
-        <w:t>Không cam kết provider bên thứ ba luôn hoạt động liên tục.</w:t>
-      </w:r>
-    </w:p>
-    <w:p>
-      <w:pPr>
-        <w:pStyle w:val="ListBullet"/>
-      </w:pPr>
-      <w:r>
-        <w:rPr>
-          <w:rFonts w:ascii="Calibri" w:hAnsi="Calibri"/>
-          <w:color w:val="182420"/>
-          <w:sz w:val="22"/>
-        </w:rPr>
-        <w:t>Không tự đăng bài hoặc chạy quảng cáo công khai nếu chưa có quy trình riêng được xác nhận.</w:t>
-      </w:r>
-    </w:p>
-    <w:p>
-      <w:pPr>
-        <w:pStyle w:val="ListBullet"/>
-      </w:pPr>
-      <w:r>
-        <w:rPr>
-          <w:rFonts w:ascii="Calibri" w:hAnsi="Calibri"/>
-          <w:color w:val="182420"/>
-          <w:sz w:val="22"/>
-        </w:rPr>
-        <w:t>Không yêu cầu người dùng gửi mật khẩu mạng xã hội hoặc thông tin thẻ thanh toán qua bot.</w:t>
-      </w:r>
-    </w:p>
-    <w:p>
-      <w:pPr>
-        <w:pStyle w:val="Heading1"/>
-      </w:pPr>
-      <w:r>
-        <w:rPr>
-          <w:rFonts w:ascii="Calibri" w:hAnsi="Calibri"/>
-          <w:color w:val="182420"/>
-          <w:sz w:val="22"/>
-        </w:rPr>
-        <w:t>17. Liên hệ</w:t>
-      </w:r>
-    </w:p>
-    <w:p>
-      <w:pPr>
-        <w:pStyle w:val="ListBullet"/>
-      </w:pPr>
-      <w:r>
-        <w:rPr>
-          <w:rFonts w:ascii="Calibri" w:hAnsi="Calibri"/>
-          <w:b/>
-          <w:color w:val="182420"/>
-          <w:sz w:val="22"/>
-        </w:rPr>
-        <w:t>Admin:</w:t>
-      </w:r>
-      <w:r>
-        <w:rPr>
-          <w:rFonts w:ascii="Calibri" w:hAnsi="Calibri"/>
-          <w:color w:val="182420"/>
-          <w:sz w:val="22"/>
-        </w:rPr>
-        <w:t xml:space="preserve"> </w:t>
-      </w:r>
-      <w:r>
-        <w:rPr>
-          <w:rFonts w:ascii="Calibri" w:hAnsi="Calibri"/>
-          <w:b/>
-          <w:color w:val="08734F"/>
-          <w:sz w:val="22"/>
-        </w:rPr>
-        <w:t>@toanaas (https://t.me/toanaas)</w:t>
-      </w:r>
-    </w:p>
-    <w:p>
-      <w:pPr>
-        <w:pStyle w:val="ListBullet"/>
-      </w:pPr>
-      <w:r>
-        <w:rPr>
-          <w:rFonts w:ascii="Calibri" w:hAnsi="Calibri"/>
-          <w:b/>
-          <w:color w:val="182420"/>
-          <w:sz w:val="22"/>
-        </w:rPr>
-        <w:t>Bot:</w:t>
-      </w:r>
-      <w:r>
-        <w:rPr>
-          <w:rFonts w:ascii="Calibri" w:hAnsi="Calibri"/>
-          <w:color w:val="182420"/>
-          <w:sz w:val="22"/>
-        </w:rPr>
-        <w:t xml:space="preserve"> </w:t>
-      </w:r>
-      <w:r>
-        <w:rPr>
-          <w:rFonts w:ascii="Calibri" w:hAnsi="Calibri"/>
-          <w:b/>
-          <w:color w:val="08734F"/>
-          <w:sz w:val="22"/>
-        </w:rPr>
-        <w:t>@toanaasbot (https://t.me/toanaasbot)</w:t>
-      </w:r>
-    </w:p>
-    <w:p>
-      <w:pPr>
-        <w:pStyle w:val="ListBullet"/>
-      </w:pPr>
-      <w:r>
-        <w:rPr>
-          <w:rFonts w:ascii="Calibri" w:hAnsi="Calibri"/>
-          <w:b/>
-          <w:color w:val="182420"/>
-          <w:sz w:val="22"/>
-        </w:rPr>
-        <w:t>Website:</w:t>
-      </w:r>
-      <w:r>
-        <w:rPr>
-          <w:rFonts w:ascii="Calibri" w:hAnsi="Calibri"/>
-          <w:color w:val="182420"/>
-          <w:sz w:val="22"/>
-        </w:rPr>
-        <w:t xml:space="preserve"> </w:t>
-      </w:r>
-      <w:r>
-        <w:rPr>
-          <w:rFonts w:ascii="Calibri" w:hAnsi="Calibri"/>
-          <w:b/>
-          <w:color w:val="08734F"/>
-          <w:sz w:val="22"/>
-        </w:rPr>
-        <w:t>www.toanaas.vn (https://www.toanaas.vn/)</w:t>
-      </w:r>
-    </w:p>
-    <w:p>
-      <w:pPr>
-        <w:pStyle w:val="ListBullet"/>
-      </w:pPr>
-      <w:r>
-        <w:rPr>
-          <w:rFonts w:ascii="Calibri" w:hAnsi="Calibri"/>
-          <w:color w:val="182420"/>
-          <w:sz w:val="22"/>
-        </w:rPr>
-        <w:t>Khi cần hỗ trợ thanh toán hoặc lỗi job, nên tạo ticket trong bot để có dữ liệu đối soát.</w:t>
+        <w:t>Khi cần hỗ trợ thanh toán hoặc lỗi xử lý, hãy gửi thông tin rõ ràng để TOAN AAS kiểm tra nhanh hơn.</w:t>
       </w:r>
     </w:p>
     <w:sectPr>

</xml_diff>

<commit_message>
Update help guide copy after final release
</commit_message>
<xml_diff>
--- a/TOAN_AAS_HUONG_DAN_SU_DUNG_CHO_KHACH_V2.docx
+++ b/TOAN_AAS_HUONG_DAN_SU_DUNG_CHO_KHACH_V2.docx
@@ -97,7 +97,7 @@
                 <w:color w:val="182420"/>
                 <w:sz w:val="20"/>
               </w:rPr>
-              <w:t>V2 - cập nhật 13/06/2026</w:t>
+              <w:t>V2 - cập nhật 23/06/2026</w:t>
             </w:r>
           </w:p>
         </w:tc>
@@ -272,7 +272,7 @@
           <w:color w:val="182420"/>
           <w:sz w:val="22"/>
         </w:rPr>
-        <w:t>TOAN AAS là hệ thống AI Automation System vận hành chủ yếu qua Telegram. Hệ thống hỗ trợ tạo nội dung, ảnh, video, voice, phụ đề, xử lý tài liệu, hỗ trợ khách hàng/ticket và các dịch vụ Premium hoặc bot riêng.</w:t>
+        <w:t>TOAN AAS là hệ thống AI vận hành chủ yếu qua Telegram. Hệ thống hỗ trợ tạo ảnh, video, âm thanh, phụ đề, dịch, lồng tiếng, xử lý tài liệu, nội dung AI và hỗ trợ khách hàng theo từng bước rõ ràng.</w:t>
       </w:r>
     </w:p>
     <w:p>
@@ -282,7 +282,7 @@
           <w:color w:val="182420"/>
           <w:sz w:val="22"/>
         </w:rPr>
-        <w:t>TOAN AAS không chỉ là bot tạo video pack. Mục tiêu của hệ thống là kết nối nhiều công cụ thành quy trình rõ ràng, giúp cá nhân, shop, affiliate và doanh nghiệp hoàn thành công việc với ít thao tác hơn.</w:t>
+        <w:t>Bạn không cần tự nhớ nhiều lệnh phức tạp. Hãy mở menu, chọn tính năng, gửi mô tả, xem chi phí nếu có và xác nhận trước khi hệ thống xử lý.</w:t>
       </w:r>
     </w:p>
     <w:p>
@@ -292,7 +292,7 @@
           <w:color w:val="182420"/>
           <w:sz w:val="22"/>
         </w:rPr>
-        <w:t>Một số tính năng phụ thuộc nhà cung cấp AI hoặc Local Worker và có thể được mở dần. Nếu công cụ chưa sẵn sàng, bot sẽ báo rõ và không trừ Xu.</w:t>
+        <w:t>TOAN AAS không yêu cầu người dùng gửi mật khẩu mạng xã hội, thông tin thẻ thanh toán, mã OTP hoặc dữ liệu bảo mật cá nhân qua bot.</w:t>
       </w:r>
     </w:p>
     <w:p>
@@ -305,7 +305,7 @@
           <w:color w:val="182420"/>
           <w:sz w:val="22"/>
         </w:rPr>
-        <w:t>2. Bắt đầu sử dụng</w:t>
+        <w:t>2. Bắt đầu nhanh</w:t>
       </w:r>
     </w:p>
     <w:p>
@@ -318,24 +318,7 @@
           <w:color w:val="182420"/>
           <w:sz w:val="22"/>
         </w:rPr>
-        <w:t xml:space="preserve">Mở Telegram và tìm </w:t>
-      </w:r>
-      <w:r>
-        <w:rPr>
-          <w:rFonts w:ascii="Calibri" w:hAnsi="Calibri"/>
-          <w:b/>
-          <w:color w:val="08734F"/>
-          <w:sz w:val="22"/>
-        </w:rPr>
-        <w:t>@toanaasbot (https://t.me/toanaasbot)</w:t>
-      </w:r>
-      <w:r>
-        <w:rPr>
-          <w:rFonts w:ascii="Calibri" w:hAnsi="Calibri"/>
-          <w:color w:val="182420"/>
-          <w:sz w:val="22"/>
-        </w:rPr>
-        <w:t>.</w:t>
+        <w:t>Mở Telegram và tìm @toanaasbot.</w:t>
       </w:r>
     </w:p>
     <w:p>
@@ -348,24 +331,7 @@
           <w:color w:val="182420"/>
           <w:sz w:val="22"/>
         </w:rPr>
-        <w:t xml:space="preserve">Bấm </w:t>
-      </w:r>
-      <w:r>
-        <w:rPr>
-          <w:rFonts w:ascii="Calibri" w:hAnsi="Calibri"/>
-          <w:b/>
-          <w:color w:val="182420"/>
-          <w:sz w:val="22"/>
-        </w:rPr>
-        <w:t>Start</w:t>
-      </w:r>
-      <w:r>
-        <w:rPr>
-          <w:rFonts w:ascii="Calibri" w:hAnsi="Calibri"/>
-          <w:color w:val="182420"/>
-          <w:sz w:val="22"/>
-        </w:rPr>
-        <w:t xml:space="preserve"> hoặc gửi </w:t>
+        <w:t xml:space="preserve">Bấm Start hoặc gửi </w:t>
       </w:r>
       <w:r>
         <w:rPr>
@@ -394,7 +360,7 @@
           <w:color w:val="182420"/>
           <w:sz w:val="22"/>
         </w:rPr>
-        <w:t>Chọn ngôn ngữ nếu bot yêu cầu.</w:t>
+        <w:t>Chọn tính năng muốn dùng: Tạo ảnh, Tạo video, Âm thanh, Tài liệu hoặc Dịch thuật.</w:t>
       </w:r>
     </w:p>
     <w:p>
@@ -407,7 +373,7 @@
           <w:color w:val="182420"/>
           <w:sz w:val="22"/>
         </w:rPr>
-        <w:t>Xem menu chính và chọn nhóm công cụ phù hợp.</w:t>
+        <w:t>Gửi mô tả rõ mục tiêu, sản phẩm, phong cách, nền tảng đăng và yêu cầu riêng.</w:t>
       </w:r>
     </w:p>
     <w:p>
@@ -420,7 +386,7 @@
           <w:color w:val="182420"/>
           <w:sz w:val="22"/>
         </w:rPr>
-        <w:t>Mở mục tài khoản để kiểm tra số dư Xu.</w:t>
+        <w:t>Chọn gói phù hợp nếu tính năng có nhiều mức giá.</w:t>
       </w:r>
     </w:p>
     <w:p>
@@ -433,7 +399,180 @@
           <w:color w:val="182420"/>
           <w:sz w:val="22"/>
         </w:rPr>
-        <w:t>Đọc màn xác nhận chi phí trước khi chạy tác vụ có tính phí.</w:t>
+        <w:t>Kiểm tra bản xem trước, bảng giá và thông tin xác nhận.</w:t>
+      </w:r>
+    </w:p>
+    <w:p>
+      <w:pPr>
+        <w:pStyle w:val="ListNumber"/>
+      </w:pPr>
+      <w:r>
+        <w:rPr>
+          <w:rFonts w:ascii="Calibri" w:hAnsi="Calibri"/>
+          <w:color w:val="182420"/>
+          <w:sz w:val="22"/>
+        </w:rPr>
+        <w:t>Chỉ khi bạn xác nhận, hệ thống mới xử lý và mới trừ Xu nếu bước đó có phí.</w:t>
+      </w:r>
+    </w:p>
+    <w:p>
+      <w:pPr>
+        <w:pStyle w:val="ListNumber"/>
+      </w:pPr>
+      <w:r>
+        <w:rPr>
+          <w:rFonts w:ascii="Calibri" w:hAnsi="Calibri"/>
+          <w:color w:val="182420"/>
+          <w:sz w:val="22"/>
+        </w:rPr>
+        <w:t>Nhận kết quả trong bot, tải về hoặc tiếp tục bước kế tiếp.</w:t>
+      </w:r>
+    </w:p>
+    <w:p>
+      <w:r>
+        <w:rPr>
+          <w:rFonts w:ascii="Calibri" w:hAnsi="Calibri"/>
+          <w:color w:val="182420"/>
+          <w:sz w:val="22"/>
+        </w:rPr>
+        <w:t>Lệnh hữu ích:</w:t>
+      </w:r>
+    </w:p>
+    <w:p>
+      <w:pPr>
+        <w:pStyle w:val="ListBullet"/>
+      </w:pPr>
+      <w:r>
+        <w:rPr>
+          <w:rFonts w:ascii="Consolas" w:hAnsi="Consolas"/>
+          <w:color w:val="053B2B"/>
+          <w:sz w:val="20"/>
+        </w:rPr>
+        <w:t>/help</w:t>
+      </w:r>
+      <w:r>
+        <w:rPr>
+          <w:rFonts w:ascii="Calibri" w:hAnsi="Calibri"/>
+          <w:color w:val="182420"/>
+          <w:sz w:val="22"/>
+        </w:rPr>
+        <w:t xml:space="preserve"> - xem hướng dẫn nhanh.</w:t>
+      </w:r>
+    </w:p>
+    <w:p>
+      <w:pPr>
+        <w:pStyle w:val="ListBullet"/>
+      </w:pPr>
+      <w:r>
+        <w:rPr>
+          <w:rFonts w:ascii="Consolas" w:hAnsi="Consolas"/>
+          <w:color w:val="053B2B"/>
+          <w:sz w:val="20"/>
+        </w:rPr>
+        <w:t>/huongdan</w:t>
+      </w:r>
+      <w:r>
+        <w:rPr>
+          <w:rFonts w:ascii="Calibri" w:hAnsi="Calibri"/>
+          <w:color w:val="182420"/>
+          <w:sz w:val="22"/>
+        </w:rPr>
+        <w:t xml:space="preserve"> hoặc </w:t>
+      </w:r>
+      <w:r>
+        <w:rPr>
+          <w:rFonts w:ascii="Consolas" w:hAnsi="Consolas"/>
+          <w:color w:val="053B2B"/>
+          <w:sz w:val="20"/>
+        </w:rPr>
+        <w:t>/guide</w:t>
+      </w:r>
+      <w:r>
+        <w:rPr>
+          <w:rFonts w:ascii="Calibri" w:hAnsi="Calibri"/>
+          <w:color w:val="182420"/>
+          <w:sz w:val="22"/>
+        </w:rPr>
+        <w:t xml:space="preserve"> - mở hướng dẫn chi tiết.</w:t>
+      </w:r>
+    </w:p>
+    <w:p>
+      <w:pPr>
+        <w:pStyle w:val="ListBullet"/>
+      </w:pPr>
+      <w:r>
+        <w:rPr>
+          <w:rFonts w:ascii="Consolas" w:hAnsi="Consolas"/>
+          <w:color w:val="053B2B"/>
+          <w:sz w:val="20"/>
+        </w:rPr>
+        <w:t>/profile</w:t>
+      </w:r>
+      <w:r>
+        <w:rPr>
+          <w:rFonts w:ascii="Calibri" w:hAnsi="Calibri"/>
+          <w:color w:val="182420"/>
+          <w:sz w:val="22"/>
+        </w:rPr>
+        <w:t xml:space="preserve"> - xem số dư Xu.</w:t>
+      </w:r>
+    </w:p>
+    <w:p>
+      <w:pPr>
+        <w:pStyle w:val="ListBullet"/>
+      </w:pPr>
+      <w:r>
+        <w:rPr>
+          <w:rFonts w:ascii="Consolas" w:hAnsi="Consolas"/>
+          <w:color w:val="053B2B"/>
+          <w:sz w:val="20"/>
+        </w:rPr>
+        <w:t>/pricing</w:t>
+      </w:r>
+      <w:r>
+        <w:rPr>
+          <w:rFonts w:ascii="Calibri" w:hAnsi="Calibri"/>
+          <w:color w:val="182420"/>
+          <w:sz w:val="22"/>
+        </w:rPr>
+        <w:t xml:space="preserve"> hoặc </w:t>
+      </w:r>
+      <w:r>
+        <w:rPr>
+          <w:rFonts w:ascii="Consolas" w:hAnsi="Consolas"/>
+          <w:color w:val="053B2B"/>
+          <w:sz w:val="20"/>
+        </w:rPr>
+        <w:t>/banggia</w:t>
+      </w:r>
+      <w:r>
+        <w:rPr>
+          <w:rFonts w:ascii="Calibri" w:hAnsi="Calibri"/>
+          <w:color w:val="182420"/>
+          <w:sz w:val="22"/>
+        </w:rPr>
+        <w:t xml:space="preserve"> - xem bảng giá.</w:t>
+      </w:r>
+    </w:p>
+    <w:p>
+      <w:pPr>
+        <w:pStyle w:val="ListBullet"/>
+      </w:pPr>
+      <w:r>
+        <w:rPr>
+          <w:rFonts w:ascii="Consolas" w:hAnsi="Consolas"/>
+          <w:color w:val="053B2B"/>
+          <w:sz w:val="20"/>
+        </w:rPr>
+        <w:t>/naptien</w:t>
+      </w:r>
+      <w:r>
+        <w:rPr>
+          <w:rFonts w:ascii="Calibri" w:hAnsi="Calibri"/>
+          <w:color w:val="182420"/>
+          <w:sz w:val="22"/>
+        </w:rPr>
+        <w:t xml:space="preserve"> - nạp Xu.</w:t>
       </w:r>
     </w:p>
     <w:p>
@@ -446,13 +585,1036 @@
           <w:color w:val="182420"/>
           <w:sz w:val="22"/>
         </w:rPr>
-        <w:t>3. Xu là gì?</w:t>
+        <w:t>3. Tạo ảnh AI</w:t>
+      </w:r>
+    </w:p>
+    <w:p>
+      <w:r>
+        <w:rPr>
+          <w:rFonts w:ascii="Calibri" w:hAnsi="Calibri"/>
+          <w:color w:val="182420"/>
+          <w:sz w:val="22"/>
+        </w:rPr>
+        <w:t>Quy trình tạo ảnh:</w:t>
+      </w:r>
+    </w:p>
+    <w:p>
+      <w:pPr>
+        <w:pStyle w:val="ListNumber"/>
+      </w:pPr>
+      <w:r>
+        <w:rPr>
+          <w:rFonts w:ascii="Calibri" w:hAnsi="Calibri"/>
+          <w:color w:val="182420"/>
+          <w:sz w:val="22"/>
+        </w:rPr>
+        <w:t>Mở mục Tạo ảnh.</w:t>
+      </w:r>
+    </w:p>
+    <w:p>
+      <w:pPr>
+        <w:pStyle w:val="ListNumber"/>
+      </w:pPr>
+      <w:r>
+        <w:rPr>
+          <w:rFonts w:ascii="Calibri" w:hAnsi="Calibri"/>
+          <w:color w:val="182420"/>
+          <w:sz w:val="22"/>
+        </w:rPr>
+        <w:t>Gửi mô tả ảnh: sản phẩm, bối cảnh, ánh sáng, màu sắc, bố cục, tỉ lệ và phong cách.</w:t>
+      </w:r>
+    </w:p>
+    <w:p>
+      <w:pPr>
+        <w:pStyle w:val="ListNumber"/>
+      </w:pPr>
+      <w:r>
+        <w:rPr>
+          <w:rFonts w:ascii="Calibri" w:hAnsi="Calibri"/>
+          <w:color w:val="182420"/>
+          <w:sz w:val="22"/>
+        </w:rPr>
+        <w:t>Chọn gói ảnh theo nhu cầu.</w:t>
+      </w:r>
+    </w:p>
+    <w:p>
+      <w:pPr>
+        <w:pStyle w:val="ListNumber"/>
+      </w:pPr>
+      <w:r>
+        <w:rPr>
+          <w:rFonts w:ascii="Calibri" w:hAnsi="Calibri"/>
+          <w:color w:val="182420"/>
+          <w:sz w:val="22"/>
+        </w:rPr>
+        <w:t>Xem giá Xu và xác nhận.</w:t>
+      </w:r>
+    </w:p>
+    <w:p>
+      <w:pPr>
+        <w:pStyle w:val="ListNumber"/>
+      </w:pPr>
+      <w:r>
+        <w:rPr>
+          <w:rFonts w:ascii="Calibri" w:hAnsi="Calibri"/>
+          <w:color w:val="182420"/>
+          <w:sz w:val="22"/>
+        </w:rPr>
+        <w:t>Hệ thống xử lý ảnh sau khi bạn xác nhận.</w:t>
+      </w:r>
+    </w:p>
+    <w:p>
+      <w:pPr>
+        <w:pStyle w:val="ListNumber"/>
+      </w:pPr>
+      <w:r>
+        <w:rPr>
+          <w:rFonts w:ascii="Calibri" w:hAnsi="Calibri"/>
+          <w:color w:val="182420"/>
+          <w:sz w:val="22"/>
+        </w:rPr>
+        <w:t>Nhận ảnh trong bot, tải về hoặc dùng tiếp để tạo video.</w:t>
+      </w:r>
+    </w:p>
+    <w:p>
+      <w:r>
+        <w:rPr>
+          <w:rFonts w:ascii="Calibri" w:hAnsi="Calibri"/>
+          <w:color w:val="182420"/>
+          <w:sz w:val="22"/>
+        </w:rPr>
+        <w:t>Ví dụ mô tả tốt:</w:t>
+      </w:r>
+    </w:p>
+    <w:p>
+      <w:r>
+        <w:rPr>
+          <w:rFonts w:ascii="Consolas" w:hAnsi="Consolas"/>
+          <w:color w:val="053B2B"/>
+          <w:sz w:val="20"/>
+        </w:rPr>
+        <w:t>Ảnh sản phẩm máy xay sinh tố mini màu xanh ngọc trên bàn bếp sáng, ánh sáng tự nhiên, phong cách quảng cáo thương mại, không thêm chữ, không watermark.</w:t>
+      </w:r>
+    </w:p>
+    <w:p>
+      <w:r>
+        <w:rPr>
+          <w:rFonts w:ascii="Calibri" w:hAnsi="Calibri"/>
+          <w:color w:val="182420"/>
+          <w:sz w:val="22"/>
+        </w:rPr>
+        <w:t>Bảng giá tạo ảnh:</w:t>
       </w:r>
     </w:p>
     <w:p>
       <w:pPr>
         <w:pStyle w:val="ListBullet"/>
       </w:pPr>
+      <w:r>
+        <w:rPr>
+          <w:rFonts w:ascii="Calibri" w:hAnsi="Calibri"/>
+          <w:color w:val="182420"/>
+          <w:sz w:val="22"/>
+        </w:rPr>
+        <w:t>Tiết kiệm: 50 Xu.</w:t>
+      </w:r>
+    </w:p>
+    <w:p>
+      <w:pPr>
+        <w:pStyle w:val="ListBullet"/>
+      </w:pPr>
+      <w:r>
+        <w:rPr>
+          <w:rFonts w:ascii="Calibri" w:hAnsi="Calibri"/>
+          <w:color w:val="182420"/>
+          <w:sz w:val="22"/>
+        </w:rPr>
+        <w:t>Chuẩn: 150 Xu.</w:t>
+      </w:r>
+    </w:p>
+    <w:p>
+      <w:pPr>
+        <w:pStyle w:val="ListBullet"/>
+      </w:pPr>
+      <w:r>
+        <w:rPr>
+          <w:rFonts w:ascii="Calibri" w:hAnsi="Calibri"/>
+          <w:color w:val="182420"/>
+          <w:sz w:val="22"/>
+        </w:rPr>
+        <w:t>Chuẩn + bảo hành: 200 Xu.</w:t>
+      </w:r>
+    </w:p>
+    <w:p>
+      <w:pPr>
+        <w:pStyle w:val="ListBullet"/>
+      </w:pPr>
+      <w:r>
+        <w:rPr>
+          <w:rFonts w:ascii="Calibri" w:hAnsi="Calibri"/>
+          <w:color w:val="182420"/>
+          <w:sz w:val="22"/>
+        </w:rPr>
+        <w:t>Phổ thông: 300 Xu.</w:t>
+      </w:r>
+    </w:p>
+    <w:p>
+      <w:pPr>
+        <w:pStyle w:val="ListBullet"/>
+      </w:pPr>
+      <w:r>
+        <w:rPr>
+          <w:rFonts w:ascii="Calibri" w:hAnsi="Calibri"/>
+          <w:color w:val="182420"/>
+          <w:sz w:val="22"/>
+        </w:rPr>
+        <w:t>Phổ thông + bảo hành: 400 Xu.</w:t>
+      </w:r>
+    </w:p>
+    <w:p>
+      <w:pPr>
+        <w:pStyle w:val="ListBullet"/>
+      </w:pPr>
+      <w:r>
+        <w:rPr>
+          <w:rFonts w:ascii="Calibri" w:hAnsi="Calibri"/>
+          <w:color w:val="182420"/>
+          <w:sz w:val="22"/>
+        </w:rPr>
+        <w:t>Cao: 500 Xu.</w:t>
+      </w:r>
+    </w:p>
+    <w:p>
+      <w:pPr>
+        <w:pStyle w:val="ListBullet"/>
+      </w:pPr>
+      <w:r>
+        <w:rPr>
+          <w:rFonts w:ascii="Calibri" w:hAnsi="Calibri"/>
+          <w:color w:val="182420"/>
+          <w:sz w:val="22"/>
+        </w:rPr>
+        <w:t>Cao + bảo hành: 600 Xu.</w:t>
+      </w:r>
+    </w:p>
+    <w:p>
+      <w:r>
+        <w:rPr>
+          <w:rFonts w:ascii="Calibri" w:hAnsi="Calibri"/>
+          <w:color w:val="182420"/>
+          <w:sz w:val="22"/>
+        </w:rPr>
+        <w:t>Gói có bảo hành phù hợp khi bạn cần ảnh ổn định hơn. Nếu kết quả chưa sát yêu cầu trong cùng mô tả, bạn có thể yêu cầu hỗ trợ tạo lại theo chính sách của gói.</w:t>
+      </w:r>
+    </w:p>
+    <w:p>
+      <w:r>
+        <w:rPr>
+          <w:rFonts w:ascii="Calibri" w:hAnsi="Calibri"/>
+          <w:color w:val="182420"/>
+          <w:sz w:val="22"/>
+        </w:rPr>
+        <w:t>Lưu ý: hãy kiểm tra kỹ chữ, logo, khuôn mặt, bàn tay, chi tiết sản phẩm và thông tin thương mại trước khi dùng ảnh để đăng bán hàng.</w:t>
+      </w:r>
+    </w:p>
+    <w:p>
+      <w:pPr>
+        <w:pStyle w:val="Heading1"/>
+      </w:pPr>
+      <w:r>
+        <w:rPr>
+          <w:rFonts w:ascii="Calibri" w:hAnsi="Calibri"/>
+          <w:color w:val="182420"/>
+          <w:sz w:val="22"/>
+        </w:rPr>
+        <w:t>4. Tạo video AI</w:t>
+      </w:r>
+    </w:p>
+    <w:p>
+      <w:r>
+        <w:rPr>
+          <w:rFonts w:ascii="Calibri" w:hAnsi="Calibri"/>
+          <w:color w:val="182420"/>
+          <w:sz w:val="22"/>
+        </w:rPr>
+        <w:t>Quy trình tạo video:</w:t>
+      </w:r>
+    </w:p>
+    <w:p>
+      <w:pPr>
+        <w:pStyle w:val="ListNumber"/>
+      </w:pPr>
+      <w:r>
+        <w:rPr>
+          <w:rFonts w:ascii="Calibri" w:hAnsi="Calibri"/>
+          <w:color w:val="182420"/>
+          <w:sz w:val="22"/>
+        </w:rPr>
+        <w:t>Mở mục Tạo video.</w:t>
+      </w:r>
+    </w:p>
+    <w:p>
+      <w:pPr>
+        <w:pStyle w:val="ListNumber"/>
+      </w:pPr>
+      <w:r>
+        <w:rPr>
+          <w:rFonts w:ascii="Calibri" w:hAnsi="Calibri"/>
+          <w:color w:val="182420"/>
+          <w:sz w:val="22"/>
+        </w:rPr>
+        <w:t>Chọn tạo video từ mô tả hoặc tạo video từ ảnh đã có.</w:t>
+      </w:r>
+    </w:p>
+    <w:p>
+      <w:pPr>
+        <w:pStyle w:val="ListNumber"/>
+      </w:pPr>
+      <w:r>
+        <w:rPr>
+          <w:rFonts w:ascii="Calibri" w:hAnsi="Calibri"/>
+          <w:color w:val="182420"/>
+          <w:sz w:val="22"/>
+        </w:rPr>
+        <w:t>Gửi mô tả video: chủ thể, chuyển động, bối cảnh, ánh sáng, tỉ lệ, thời lượng và cảm xúc.</w:t>
+      </w:r>
+    </w:p>
+    <w:p>
+      <w:pPr>
+        <w:pStyle w:val="ListNumber"/>
+      </w:pPr>
+      <w:r>
+        <w:rPr>
+          <w:rFonts w:ascii="Calibri" w:hAnsi="Calibri"/>
+          <w:color w:val="182420"/>
+          <w:sz w:val="22"/>
+        </w:rPr>
+        <w:t>Chọn gói video.</w:t>
+      </w:r>
+    </w:p>
+    <w:p>
+      <w:pPr>
+        <w:pStyle w:val="ListNumber"/>
+      </w:pPr>
+      <w:r>
+        <w:rPr>
+          <w:rFonts w:ascii="Calibri" w:hAnsi="Calibri"/>
+          <w:color w:val="182420"/>
+          <w:sz w:val="22"/>
+        </w:rPr>
+        <w:t>Chọn số cảnh nếu muốn làm video dài hơn.</w:t>
+      </w:r>
+    </w:p>
+    <w:p>
+      <w:pPr>
+        <w:pStyle w:val="ListNumber"/>
+      </w:pPr>
+      <w:r>
+        <w:rPr>
+          <w:rFonts w:ascii="Calibri" w:hAnsi="Calibri"/>
+          <w:color w:val="182420"/>
+          <w:sz w:val="22"/>
+        </w:rPr>
+        <w:t>Xem tổng chi phí, kiểm tra nội dung và xác nhận.</w:t>
+      </w:r>
+    </w:p>
+    <w:p>
+      <w:pPr>
+        <w:pStyle w:val="ListNumber"/>
+      </w:pPr>
+      <w:r>
+        <w:rPr>
+          <w:rFonts w:ascii="Calibri" w:hAnsi="Calibri"/>
+          <w:color w:val="182420"/>
+          <w:sz w:val="22"/>
+        </w:rPr>
+        <w:t>Hệ thống xử lý và gửi video về bot khi hoàn tất.</w:t>
+      </w:r>
+    </w:p>
+    <w:p>
+      <w:pPr>
+        <w:pStyle w:val="ListNumber"/>
+      </w:pPr>
+      <w:r>
+        <w:rPr>
+          <w:rFonts w:ascii="Calibri" w:hAnsi="Calibri"/>
+          <w:color w:val="182420"/>
+          <w:sz w:val="22"/>
+        </w:rPr>
+        <w:t>Sau khi có video, bạn có thể dùng thêm Âm thanh hoặc Phụ đề / Dịch / Lồng tiếng nếu cần.</w:t>
+      </w:r>
+    </w:p>
+    <w:p>
+      <w:r>
+        <w:rPr>
+          <w:rFonts w:ascii="Calibri" w:hAnsi="Calibri"/>
+          <w:color w:val="182420"/>
+          <w:sz w:val="22"/>
+        </w:rPr>
+        <w:t>Bảng giá video theo gói:</w:t>
+      </w:r>
+    </w:p>
+    <w:p>
+      <w:pPr>
+        <w:pStyle w:val="ListBullet"/>
+      </w:pPr>
+      <w:r>
+        <w:rPr>
+          <w:rFonts w:ascii="Calibri" w:hAnsi="Calibri"/>
+          <w:color w:val="182420"/>
+          <w:sz w:val="22"/>
+        </w:rPr>
+        <w:t>Trải nghiệm: 200 Xu.</w:t>
+      </w:r>
+    </w:p>
+    <w:p>
+      <w:pPr>
+        <w:pStyle w:val="ListBullet"/>
+      </w:pPr>
+      <w:r>
+        <w:rPr>
+          <w:rFonts w:ascii="Calibri" w:hAnsi="Calibri"/>
+          <w:color w:val="182420"/>
+          <w:sz w:val="22"/>
+        </w:rPr>
+        <w:t>Cơ bản: 300 Xu.</w:t>
+      </w:r>
+    </w:p>
+    <w:p>
+      <w:pPr>
+        <w:pStyle w:val="ListBullet"/>
+      </w:pPr>
+      <w:r>
+        <w:rPr>
+          <w:rFonts w:ascii="Calibri" w:hAnsi="Calibri"/>
+          <w:color w:val="182420"/>
+          <w:sz w:val="22"/>
+        </w:rPr>
+        <w:t>Phổ thông: 400 Xu.</w:t>
+      </w:r>
+    </w:p>
+    <w:p>
+      <w:pPr>
+        <w:pStyle w:val="ListBullet"/>
+      </w:pPr>
+      <w:r>
+        <w:rPr>
+          <w:rFonts w:ascii="Calibri" w:hAnsi="Calibri"/>
+          <w:color w:val="182420"/>
+          <w:sz w:val="22"/>
+        </w:rPr>
+        <w:t>Nâng cao: 500 Xu.</w:t>
+      </w:r>
+    </w:p>
+    <w:p>
+      <w:pPr>
+        <w:pStyle w:val="ListBullet"/>
+      </w:pPr>
+      <w:r>
+        <w:rPr>
+          <w:rFonts w:ascii="Calibri" w:hAnsi="Calibri"/>
+          <w:color w:val="182420"/>
+          <w:sz w:val="22"/>
+        </w:rPr>
+        <w:t>Bán hàng: 600 Xu.</w:t>
+      </w:r>
+    </w:p>
+    <w:p>
+      <w:pPr>
+        <w:pStyle w:val="ListBullet"/>
+      </w:pPr>
+      <w:r>
+        <w:rPr>
+          <w:rFonts w:ascii="Calibri" w:hAnsi="Calibri"/>
+          <w:color w:val="182420"/>
+          <w:sz w:val="22"/>
+        </w:rPr>
+        <w:t>Cao cấp: 800 Xu.</w:t>
+      </w:r>
+    </w:p>
+    <w:p>
+      <w:pPr>
+        <w:pStyle w:val="ListBullet"/>
+      </w:pPr>
+      <w:r>
+        <w:rPr>
+          <w:rFonts w:ascii="Calibri" w:hAnsi="Calibri"/>
+          <w:color w:val="182420"/>
+          <w:sz w:val="22"/>
+        </w:rPr>
+        <w:t>Chuyên nghiệp: 1000 Xu.</w:t>
+      </w:r>
+    </w:p>
+    <w:p>
+      <w:pPr>
+        <w:pStyle w:val="ListBullet"/>
+      </w:pPr>
+      <w:r>
+        <w:rPr>
+          <w:rFonts w:ascii="Calibri" w:hAnsi="Calibri"/>
+          <w:color w:val="182420"/>
+          <w:sz w:val="22"/>
+        </w:rPr>
+        <w:t>Pro Plus: 1200 Xu.</w:t>
+      </w:r>
+    </w:p>
+    <w:p>
+      <w:pPr>
+        <w:pStyle w:val="ListBullet"/>
+      </w:pPr>
+      <w:r>
+        <w:rPr>
+          <w:rFonts w:ascii="Calibri" w:hAnsi="Calibri"/>
+          <w:color w:val="182420"/>
+          <w:sz w:val="22"/>
+        </w:rPr>
+        <w:t>Premium: 1500 Xu.</w:t>
+      </w:r>
+    </w:p>
+    <w:p>
+      <w:r>
+        <w:rPr>
+          <w:rFonts w:ascii="Calibri" w:hAnsi="Calibri"/>
+          <w:color w:val="182420"/>
+          <w:sz w:val="22"/>
+        </w:rPr>
+        <w:t>Gói Trải nghiệm 200 Xu phù hợp để test ý tưởng nhanh, xem hướng chuyển động, kiểm tra concept hoặc tạo bản nháp ngắn trước khi dùng gói cao hơn.</w:t>
+      </w:r>
+    </w:p>
+    <w:p>
+      <w:r>
+        <w:rPr>
+          <w:rFonts w:ascii="Calibri" w:hAnsi="Calibri"/>
+          <w:color w:val="182420"/>
+          <w:sz w:val="22"/>
+        </w:rPr>
+        <w:t>Cách tính theo cảnh:</w:t>
+      </w:r>
+    </w:p>
+    <w:p>
+      <w:pPr>
+        <w:pStyle w:val="ListBullet"/>
+      </w:pPr>
+      <w:r>
+        <w:rPr>
+          <w:rFonts w:ascii="Calibri" w:hAnsi="Calibri"/>
+          <w:color w:val="182420"/>
+          <w:sz w:val="22"/>
+        </w:rPr>
+        <w:t>1 cảnh khoảng 6 giây.</w:t>
+      </w:r>
+    </w:p>
+    <w:p>
+      <w:pPr>
+        <w:pStyle w:val="ListBullet"/>
+      </w:pPr>
+      <w:r>
+        <w:rPr>
+          <w:rFonts w:ascii="Calibri" w:hAnsi="Calibri"/>
+          <w:color w:val="182420"/>
+          <w:sz w:val="22"/>
+        </w:rPr>
+        <w:t>3 cảnh khoảng 18 giây.</w:t>
+      </w:r>
+    </w:p>
+    <w:p>
+      <w:pPr>
+        <w:pStyle w:val="ListBullet"/>
+      </w:pPr>
+      <w:r>
+        <w:rPr>
+          <w:rFonts w:ascii="Calibri" w:hAnsi="Calibri"/>
+          <w:color w:val="182420"/>
+          <w:sz w:val="22"/>
+        </w:rPr>
+        <w:t>5 cảnh khoảng 30 giây.</w:t>
+      </w:r>
+    </w:p>
+    <w:p>
+      <w:pPr>
+        <w:pStyle w:val="ListBullet"/>
+      </w:pPr>
+      <w:r>
+        <w:rPr>
+          <w:rFonts w:ascii="Calibri" w:hAnsi="Calibri"/>
+          <w:color w:val="182420"/>
+          <w:sz w:val="22"/>
+        </w:rPr>
+        <w:t>10 cảnh khoảng 60 giây.</w:t>
+      </w:r>
+    </w:p>
+    <w:p>
+      <w:pPr>
+        <w:pStyle w:val="ListBullet"/>
+      </w:pPr>
+      <w:r>
+        <w:rPr>
+          <w:rFonts w:ascii="Calibri" w:hAnsi="Calibri"/>
+          <w:color w:val="182420"/>
+          <w:sz w:val="22"/>
+        </w:rPr>
+        <w:t>20 cảnh khoảng 120 giây.</w:t>
+      </w:r>
+    </w:p>
+    <w:p>
+      <w:r>
+        <w:rPr>
+          <w:rFonts w:ascii="Calibri" w:hAnsi="Calibri"/>
+          <w:color w:val="182420"/>
+          <w:sz w:val="22"/>
+        </w:rPr>
+        <w:t>Ưu đãi theo số cảnh:</w:t>
+      </w:r>
+    </w:p>
+    <w:p>
+      <w:pPr>
+        <w:pStyle w:val="ListBullet"/>
+      </w:pPr>
+      <w:r>
+        <w:rPr>
+          <w:rFonts w:ascii="Calibri" w:hAnsi="Calibri"/>
+          <w:color w:val="182420"/>
+          <w:sz w:val="22"/>
+        </w:rPr>
+        <w:t>1 cảnh: giá gốc.</w:t>
+      </w:r>
+    </w:p>
+    <w:p>
+      <w:pPr>
+        <w:pStyle w:val="ListBullet"/>
+      </w:pPr>
+      <w:r>
+        <w:rPr>
+          <w:rFonts w:ascii="Calibri" w:hAnsi="Calibri"/>
+          <w:color w:val="182420"/>
+          <w:sz w:val="22"/>
+        </w:rPr>
+        <w:t>2-9 cảnh: giảm 10%.</w:t>
+      </w:r>
+    </w:p>
+    <w:p>
+      <w:pPr>
+        <w:pStyle w:val="ListBullet"/>
+      </w:pPr>
+      <w:r>
+        <w:rPr>
+          <w:rFonts w:ascii="Calibri" w:hAnsi="Calibri"/>
+          <w:color w:val="182420"/>
+          <w:sz w:val="22"/>
+        </w:rPr>
+        <w:t>10-19 cảnh: giảm 15%.</w:t>
+      </w:r>
+    </w:p>
+    <w:p>
+      <w:pPr>
+        <w:pStyle w:val="ListBullet"/>
+      </w:pPr>
+      <w:r>
+        <w:rPr>
+          <w:rFonts w:ascii="Calibri" w:hAnsi="Calibri"/>
+          <w:color w:val="182420"/>
+          <w:sz w:val="22"/>
+        </w:rPr>
+        <w:t>20 cảnh: giảm 20%.</w:t>
+      </w:r>
+    </w:p>
+    <w:p>
+      <w:r>
+        <w:rPr>
+          <w:rFonts w:ascii="Calibri" w:hAnsi="Calibri"/>
+          <w:color w:val="182420"/>
+          <w:sz w:val="22"/>
+        </w:rPr>
+        <w:t>Ví dụ: gói Cơ bản 300 Xu, làm 3 cảnh: 300 x 90% = 270 Xu/cảnh, tổng 270 x 3 = 810 Xu.</w:t>
+      </w:r>
+    </w:p>
+    <w:p>
+      <w:r>
+        <w:rPr>
+          <w:rFonts w:ascii="Calibri" w:hAnsi="Calibri"/>
+          <w:color w:val="182420"/>
+          <w:sz w:val="22"/>
+        </w:rPr>
+        <w:t>Nếu hệ thống đang bảo trì/nâng cấp, TOAN AAS chưa xử lý và chưa trừ Xu. Vui lòng thử lại sau.</w:t>
+      </w:r>
+    </w:p>
+    <w:p>
+      <w:pPr>
+        <w:pStyle w:val="Heading1"/>
+      </w:pPr>
+      <w:r>
+        <w:rPr>
+          <w:rFonts w:ascii="Calibri" w:hAnsi="Calibri"/>
+          <w:color w:val="182420"/>
+          <w:sz w:val="22"/>
+        </w:rPr>
+        <w:t>5. Âm thanh</w:t>
+      </w:r>
+    </w:p>
+    <w:p>
+      <w:r>
+        <w:rPr>
+          <w:rFonts w:ascii="Calibri" w:hAnsi="Calibri"/>
+          <w:color w:val="182420"/>
+          <w:sz w:val="22"/>
+        </w:rPr>
+        <w:t>Âm thanh giúp video dễ nghe, dễ bán hàng và chuyên nghiệp hơn.</w:t>
+      </w:r>
+    </w:p>
+    <w:p>
+      <w:r>
+        <w:rPr>
+          <w:rFonts w:ascii="Calibri" w:hAnsi="Calibri"/>
+          <w:color w:val="182420"/>
+          <w:sz w:val="22"/>
+        </w:rPr>
+        <w:t>Bạn có thể dùng:</w:t>
+      </w:r>
+    </w:p>
+    <w:p>
+      <w:pPr>
+        <w:pStyle w:val="ListBullet"/>
+      </w:pPr>
+      <w:r>
+        <w:rPr>
+          <w:rFonts w:ascii="Calibri" w:hAnsi="Calibri"/>
+          <w:color w:val="182420"/>
+          <w:sz w:val="22"/>
+        </w:rPr>
+        <w:t>Tạo giọng đọc từ nội dung đã viết.</w:t>
+      </w:r>
+    </w:p>
+    <w:p>
+      <w:pPr>
+        <w:pStyle w:val="ListBullet"/>
+      </w:pPr>
+      <w:r>
+        <w:rPr>
+          <w:rFonts w:ascii="Calibri" w:hAnsi="Calibri"/>
+          <w:color w:val="182420"/>
+          <w:sz w:val="22"/>
+        </w:rPr>
+        <w:t>Tạo nhạc nền theo phong cách mong muốn.</w:t>
+      </w:r>
+    </w:p>
+    <w:p>
+      <w:pPr>
+        <w:pStyle w:val="ListBullet"/>
+      </w:pPr>
+      <w:r>
+        <w:rPr>
+          <w:rFonts w:ascii="Calibri" w:hAnsi="Calibri"/>
+          <w:color w:val="182420"/>
+          <w:sz w:val="22"/>
+        </w:rPr>
+        <w:t>Tạo bài hát ngắn cho thương hiệu, sản phẩm hoặc chiến dịch.</w:t>
+      </w:r>
+    </w:p>
+    <w:p>
+      <w:pPr>
+        <w:pStyle w:val="ListBullet"/>
+      </w:pPr>
+      <w:r>
+        <w:rPr>
+          <w:rFonts w:ascii="Calibri" w:hAnsi="Calibri"/>
+          <w:color w:val="182420"/>
+          <w:sz w:val="22"/>
+        </w:rPr>
+        <w:t>Tìm ý tưởng nhạc, hiệu ứng âm thanh hoặc đoạn mở đầu phù hợp video.</w:t>
+      </w:r>
+    </w:p>
+    <w:p>
+      <w:r>
+        <w:rPr>
+          <w:rFonts w:ascii="Calibri" w:hAnsi="Calibri"/>
+          <w:color w:val="182420"/>
+          <w:sz w:val="22"/>
+        </w:rPr>
+        <w:t>Quy trình:</w:t>
+      </w:r>
+    </w:p>
+    <w:p>
+      <w:pPr>
+        <w:pStyle w:val="ListNumber"/>
+      </w:pPr>
+      <w:r>
+        <w:rPr>
+          <w:rFonts w:ascii="Calibri" w:hAnsi="Calibri"/>
+          <w:color w:val="182420"/>
+          <w:sz w:val="22"/>
+        </w:rPr>
+        <w:t>Mở mục Âm thanh.</w:t>
+      </w:r>
+    </w:p>
+    <w:p>
+      <w:pPr>
+        <w:pStyle w:val="ListNumber"/>
+      </w:pPr>
+      <w:r>
+        <w:rPr>
+          <w:rFonts w:ascii="Calibri" w:hAnsi="Calibri"/>
+          <w:color w:val="182420"/>
+          <w:sz w:val="22"/>
+        </w:rPr>
+        <w:t>Chọn giọng đọc, nhạc nền hoặc bài hát.</w:t>
+      </w:r>
+    </w:p>
+    <w:p>
+      <w:pPr>
+        <w:pStyle w:val="ListNumber"/>
+      </w:pPr>
+      <w:r>
+        <w:rPr>
+          <w:rFonts w:ascii="Calibri" w:hAnsi="Calibri"/>
+          <w:color w:val="182420"/>
+          <w:sz w:val="22"/>
+        </w:rPr>
+        <w:t>Gửi nội dung hoặc mô tả phong cách.</w:t>
+      </w:r>
+    </w:p>
+    <w:p>
+      <w:pPr>
+        <w:pStyle w:val="ListNumber"/>
+      </w:pPr>
+      <w:r>
+        <w:rPr>
+          <w:rFonts w:ascii="Calibri" w:hAnsi="Calibri"/>
+          <w:color w:val="182420"/>
+          <w:sz w:val="22"/>
+        </w:rPr>
+        <w:t>Kiểm tra chi phí nếu bước đó có phí.</w:t>
+      </w:r>
+    </w:p>
+    <w:p>
+      <w:pPr>
+        <w:pStyle w:val="ListNumber"/>
+      </w:pPr>
+      <w:r>
+        <w:rPr>
+          <w:rFonts w:ascii="Calibri" w:hAnsi="Calibri"/>
+          <w:color w:val="182420"/>
+          <w:sz w:val="22"/>
+        </w:rPr>
+        <w:t>Xác nhận rồi nhận kết quả trong bot.</w:t>
+      </w:r>
+    </w:p>
+    <w:p>
+      <w:r>
+        <w:rPr>
+          <w:rFonts w:ascii="Calibri" w:hAnsi="Calibri"/>
+          <w:color w:val="182420"/>
+          <w:sz w:val="22"/>
+        </w:rPr>
+        <w:t>Mẹo: nội dung đọc nên ngắn, câu rõ, ít từ khó và có nhịp nghỉ tự nhiên.</w:t>
+      </w:r>
+    </w:p>
+    <w:p>
+      <w:r>
+        <w:rPr>
+          <w:rFonts w:ascii="Calibri" w:hAnsi="Calibri"/>
+          <w:color w:val="182420"/>
+          <w:sz w:val="22"/>
+        </w:rPr>
+        <w:t>Nếu hệ thống đang bảo trì/nâng cấp, TOAN AAS chưa xử lý và chưa trừ Xu. Vui lòng thử lại sau.</w:t>
+      </w:r>
+    </w:p>
+    <w:p>
+      <w:pPr>
+        <w:pStyle w:val="Heading1"/>
+      </w:pPr>
+      <w:r>
+        <w:rPr>
+          <w:rFonts w:ascii="Calibri" w:hAnsi="Calibri"/>
+          <w:color w:val="182420"/>
+          <w:sz w:val="22"/>
+        </w:rPr>
+        <w:t>6. Phụ đề / Dịch / Lồng tiếng</w:t>
+      </w:r>
+    </w:p>
+    <w:p>
+      <w:r>
+        <w:rPr>
+          <w:rFonts w:ascii="Calibri" w:hAnsi="Calibri"/>
+          <w:color w:val="182420"/>
+          <w:sz w:val="22"/>
+        </w:rPr>
+        <w:t>Bạn có thể dùng:</w:t>
+      </w:r>
+    </w:p>
+    <w:p>
+      <w:pPr>
+        <w:pStyle w:val="ListBullet"/>
+      </w:pPr>
+      <w:r>
+        <w:rPr>
+          <w:rFonts w:ascii="Calibri" w:hAnsi="Calibri"/>
+          <w:color w:val="182420"/>
+          <w:sz w:val="22"/>
+        </w:rPr>
+        <w:t>Tạo phụ đề từ video hoặc audio.</w:t>
+      </w:r>
+    </w:p>
+    <w:p>
+      <w:pPr>
+        <w:pStyle w:val="ListBullet"/>
+      </w:pPr>
+      <w:r>
+        <w:rPr>
+          <w:rFonts w:ascii="Calibri" w:hAnsi="Calibri"/>
+          <w:color w:val="182420"/>
+          <w:sz w:val="22"/>
+        </w:rPr>
+        <w:t>Dịch nội dung sang ngôn ngữ khác.</w:t>
+      </w:r>
+    </w:p>
+    <w:p>
+      <w:pPr>
+        <w:pStyle w:val="ListBullet"/>
+      </w:pPr>
+      <w:r>
+        <w:rPr>
+          <w:rFonts w:ascii="Calibri" w:hAnsi="Calibri"/>
+          <w:color w:val="182420"/>
+          <w:sz w:val="22"/>
+        </w:rPr>
+        <w:t>Lồng tiếng lại video bằng giọng phù hợp.</w:t>
+      </w:r>
+    </w:p>
+    <w:p>
+      <w:pPr>
+        <w:pStyle w:val="ListBullet"/>
+      </w:pPr>
+      <w:r>
+        <w:rPr>
+          <w:rFonts w:ascii="Calibri" w:hAnsi="Calibri"/>
+          <w:color w:val="182420"/>
+          <w:sz w:val="22"/>
+        </w:rPr>
+        <w:t>Chuẩn bị bản phụ đề để đăng TikTok, Reels, Shorts hoặc YouTube.</w:t>
+      </w:r>
+    </w:p>
+    <w:p>
+      <w:r>
+        <w:rPr>
+          <w:rFonts w:ascii="Calibri" w:hAnsi="Calibri"/>
+          <w:color w:val="182420"/>
+          <w:sz w:val="22"/>
+        </w:rPr>
+        <w:t>Quy trình:</w:t>
+      </w:r>
+    </w:p>
+    <w:p>
+      <w:pPr>
+        <w:pStyle w:val="ListNumber"/>
+      </w:pPr>
+      <w:r>
+        <w:rPr>
+          <w:rFonts w:ascii="Calibri" w:hAnsi="Calibri"/>
+          <w:color w:val="182420"/>
+          <w:sz w:val="22"/>
+        </w:rPr>
+        <w:t>Mở mục Phụ đề / Dịch / Lồng tiếng.</w:t>
+      </w:r>
+    </w:p>
+    <w:p>
+      <w:pPr>
+        <w:pStyle w:val="ListNumber"/>
+      </w:pPr>
+      <w:r>
+        <w:rPr>
+          <w:rFonts w:ascii="Calibri" w:hAnsi="Calibri"/>
+          <w:color w:val="182420"/>
+          <w:sz w:val="22"/>
+        </w:rPr>
+        <w:t>Gửi video, audio hoặc nội dung cần xử lý.</w:t>
+      </w:r>
+    </w:p>
+    <w:p>
+      <w:pPr>
+        <w:pStyle w:val="ListNumber"/>
+      </w:pPr>
+      <w:r>
+        <w:rPr>
+          <w:rFonts w:ascii="Calibri" w:hAnsi="Calibri"/>
+          <w:color w:val="182420"/>
+          <w:sz w:val="22"/>
+        </w:rPr>
+        <w:t>Chọn tạo phụ đề, dịch hoặc lồng tiếng.</w:t>
+      </w:r>
+    </w:p>
+    <w:p>
+      <w:pPr>
+        <w:pStyle w:val="ListNumber"/>
+      </w:pPr>
+      <w:r>
+        <w:rPr>
+          <w:rFonts w:ascii="Calibri" w:hAnsi="Calibri"/>
+          <w:color w:val="182420"/>
+          <w:sz w:val="22"/>
+        </w:rPr>
+        <w:t>Chọn ngôn ngữ đích nếu cần.</w:t>
+      </w:r>
+    </w:p>
+    <w:p>
+      <w:pPr>
+        <w:pStyle w:val="ListNumber"/>
+      </w:pPr>
+      <w:r>
+        <w:rPr>
+          <w:rFonts w:ascii="Calibri" w:hAnsi="Calibri"/>
+          <w:color w:val="182420"/>
+          <w:sz w:val="22"/>
+        </w:rPr>
+        <w:t>Kiểm tra nội dung, chi phí và xác nhận.</w:t>
+      </w:r>
+    </w:p>
+    <w:p>
+      <w:pPr>
+        <w:pStyle w:val="ListNumber"/>
+      </w:pPr>
+      <w:r>
+        <w:rPr>
+          <w:rFonts w:ascii="Calibri" w:hAnsi="Calibri"/>
+          <w:color w:val="182420"/>
+          <w:sz w:val="22"/>
+        </w:rPr>
+        <w:t>Nhận kết quả, xem lại tên riêng, thuật ngữ sản phẩm và câu bán hàng trước khi đăng.</w:t>
+      </w:r>
+    </w:p>
+    <w:p>
+      <w:r>
+        <w:rPr>
+          <w:rFonts w:ascii="Calibri" w:hAnsi="Calibri"/>
+          <w:color w:val="182420"/>
+          <w:sz w:val="22"/>
+        </w:rPr>
+        <w:t>Mẹo: video có âm thanh rõ, ít tạp âm và ít người nói cùng lúc sẽ cho kết quả tốt hơn.</w:t>
+      </w:r>
+    </w:p>
+    <w:p>
+      <w:r>
+        <w:rPr>
+          <w:rFonts w:ascii="Calibri" w:hAnsi="Calibri"/>
+          <w:color w:val="182420"/>
+          <w:sz w:val="22"/>
+        </w:rPr>
+        <w:t>Nếu hệ thống đang bảo trì/nâng cấp, TOAN AAS chưa xử lý và chưa trừ Xu. Vui lòng thử lại sau.</w:t>
+      </w:r>
+    </w:p>
+    <w:p>
+      <w:pPr>
+        <w:pStyle w:val="Heading1"/>
+      </w:pPr>
+      <w:r>
+        <w:rPr>
+          <w:rFonts w:ascii="Calibri" w:hAnsi="Calibri"/>
+          <w:color w:val="182420"/>
+          <w:sz w:val="22"/>
+        </w:rPr>
+        <w:t>7. Xu &amp; bảng giá</w:t>
+      </w:r>
+    </w:p>
+    <w:p>
       <w:r>
         <w:rPr>
           <w:rFonts w:ascii="Calibri" w:hAnsi="Calibri"/>
@@ -469,7 +1631,6 @@
       <w:r>
         <w:rPr>
           <w:rFonts w:ascii="Calibri" w:hAnsi="Calibri"/>
-          <w:b/>
           <w:color w:val="182420"/>
           <w:sz w:val="22"/>
         </w:rPr>
@@ -483,11 +1644,10 @@
       <w:r>
         <w:rPr>
           <w:rFonts w:ascii="Calibri" w:hAnsi="Calibri"/>
-          <w:b/>
           <w:color w:val="182420"/>
           <w:sz w:val="22"/>
         </w:rPr>
-        <w:t>1.000 Xu = 100.000đ.</w:t>
+        <w:t>1.000 Xu = 100.000đ giá trị sử dụng nội bộ.</w:t>
       </w:r>
     </w:p>
     <w:p>
@@ -517,8 +1677,18 @@
       </w:r>
     </w:p>
     <w:p>
+      <w:r>
+        <w:rPr>
+          <w:rFonts w:ascii="Calibri" w:hAnsi="Calibri"/>
+          <w:color w:val="182420"/>
+          <w:sz w:val="22"/>
+        </w:rPr>
+        <w:t>Nạp Xu:</w:t>
+      </w:r>
+    </w:p>
+    <w:p>
       <w:pPr>
-        <w:pStyle w:val="Heading1"/>
+        <w:pStyle w:val="ListNumber"/>
       </w:pPr>
       <w:r>
         <w:rPr>
@@ -526,7 +1696,78 @@
           <w:color w:val="182420"/>
           <w:sz w:val="22"/>
         </w:rPr>
-        <w:t>4. Nạp Xu nội địa Việt Nam</w:t>
+        <w:t xml:space="preserve">Gõ </w:t>
+      </w:r>
+      <w:r>
+        <w:rPr>
+          <w:rFonts w:ascii="Consolas" w:hAnsi="Consolas"/>
+          <w:color w:val="053B2B"/>
+          <w:sz w:val="20"/>
+        </w:rPr>
+        <w:t>/naptien</w:t>
+      </w:r>
+      <w:r>
+        <w:rPr>
+          <w:rFonts w:ascii="Calibri" w:hAnsi="Calibri"/>
+          <w:color w:val="182420"/>
+          <w:sz w:val="22"/>
+        </w:rPr>
+        <w:t>.</w:t>
+      </w:r>
+    </w:p>
+    <w:p>
+      <w:pPr>
+        <w:pStyle w:val="ListNumber"/>
+      </w:pPr>
+      <w:r>
+        <w:rPr>
+          <w:rFonts w:ascii="Calibri" w:hAnsi="Calibri"/>
+          <w:color w:val="182420"/>
+          <w:sz w:val="22"/>
+        </w:rPr>
+        <w:t>Chọn mệnh giá.</w:t>
+      </w:r>
+    </w:p>
+    <w:p>
+      <w:pPr>
+        <w:pStyle w:val="ListNumber"/>
+      </w:pPr>
+      <w:r>
+        <w:rPr>
+          <w:rFonts w:ascii="Calibri" w:hAnsi="Calibri"/>
+          <w:color w:val="182420"/>
+          <w:sz w:val="22"/>
+        </w:rPr>
+        <w:t>Thanh toán theo hướng dẫn trong bot.</w:t>
+      </w:r>
+    </w:p>
+    <w:p>
+      <w:pPr>
+        <w:pStyle w:val="ListNumber"/>
+      </w:pPr>
+      <w:r>
+        <w:rPr>
+          <w:rFonts w:ascii="Calibri" w:hAnsi="Calibri"/>
+          <w:color w:val="182420"/>
+          <w:sz w:val="22"/>
+        </w:rPr>
+        <w:t xml:space="preserve">Gõ </w:t>
+      </w:r>
+      <w:r>
+        <w:rPr>
+          <w:rFonts w:ascii="Consolas" w:hAnsi="Consolas"/>
+          <w:color w:val="053B2B"/>
+          <w:sz w:val="20"/>
+        </w:rPr>
+        <w:t>/profile</w:t>
+      </w:r>
+      <w:r>
+        <w:rPr>
+          <w:rFonts w:ascii="Calibri" w:hAnsi="Calibri"/>
+          <w:color w:val="182420"/>
+          <w:sz w:val="22"/>
+        </w:rPr>
+        <w:t xml:space="preserve"> để kiểm tra số dư.</w:t>
       </w:r>
     </w:p>
     <w:p>
@@ -536,7 +1777,7 @@
           <w:color w:val="182420"/>
           <w:sz w:val="22"/>
         </w:rPr>
-        <w:t>TOAN AAS hỗ trợ các phương thức VND sau:</w:t>
+        <w:t>Khuyến mãi nạp:</w:t>
       </w:r>
     </w:p>
     <w:p>
@@ -549,7 +1790,7 @@
           <w:color w:val="182420"/>
           <w:sz w:val="22"/>
         </w:rPr>
-        <w:t>PayOS QR tự động.</w:t>
+        <w:t>Khuyến mãi nạp tiền chỉ áp dụng cho PayOS hoặc chuyển khoản ngân hàng Việt Nam nếu chương trình đang mở.</w:t>
       </w:r>
     </w:p>
     <w:p>
@@ -562,7 +1803,7 @@
           <w:color w:val="182420"/>
           <w:sz w:val="22"/>
         </w:rPr>
-        <w:t>QR ngân hàng ACB/VietQR thủ công.</w:t>
+        <w:t>Không áp dụng cho Zalo/MoMo hoặc kênh nạp quốc tế.</w:t>
       </w:r>
     </w:p>
     <w:p>
@@ -575,7 +1816,191 @@
           <w:color w:val="182420"/>
           <w:sz w:val="22"/>
         </w:rPr>
-        <w:t>ZaloPay cá nhân hoặc cửa hàng theo cấu hình hiện hành.</w:t>
+        <w:t>Người dùng quốc tế vẫn có thể nhận quyền lợi hạng thành viên, chiết khấu theo hạng hoặc ưu đãi không gắn với nạp nội địa nếu đủ điều kiện.</w:t>
+      </w:r>
+    </w:p>
+    <w:p>
+      <w:pPr>
+        <w:pStyle w:val="Heading1"/>
+      </w:pPr>
+      <w:r>
+        <w:rPr>
+          <w:rFonts w:ascii="Calibri" w:hAnsi="Calibri"/>
+          <w:color w:val="182420"/>
+          <w:sz w:val="22"/>
+        </w:rPr>
+        <w:t>8. FAQ / Hoàn Xu</w:t>
+      </w:r>
+    </w:p>
+    <w:p>
+      <w:r>
+        <w:rPr>
+          <w:rFonts w:ascii="Calibri" w:hAnsi="Calibri"/>
+          <w:b/>
+          <w:color w:val="182420"/>
+          <w:sz w:val="22"/>
+        </w:rPr>
+        <w:t>1. Tôi chỉ mở menu có bị trừ Xu không?</w:t>
+      </w:r>
+    </w:p>
+    <w:p>
+      <w:r>
+        <w:rPr>
+          <w:rFonts w:ascii="Calibri" w:hAnsi="Calibri"/>
+          <w:color w:val="182420"/>
+          <w:sz w:val="22"/>
+        </w:rPr>
+        <w:t>Không. Xem menu, hướng dẫn, bảng giá hoặc thử nhập mô tả chưa làm mất Xu nếu chưa đến bước xác nhận có phí.</w:t>
+      </w:r>
+    </w:p>
+    <w:p>
+      <w:r>
+        <w:rPr>
+          <w:rFonts w:ascii="Calibri" w:hAnsi="Calibri"/>
+          <w:b/>
+          <w:color w:val="182420"/>
+          <w:sz w:val="22"/>
+        </w:rPr>
+        <w:t>2. Khi nào TOAN AAS trừ Xu?</w:t>
+      </w:r>
+    </w:p>
+    <w:p>
+      <w:r>
+        <w:rPr>
+          <w:rFonts w:ascii="Calibri" w:hAnsi="Calibri"/>
+          <w:color w:val="182420"/>
+          <w:sz w:val="22"/>
+        </w:rPr>
+        <w:t>TOAN AAS chỉ trừ Xu khi bạn chọn bước có phí, xem giá và xác nhận xử lý.</w:t>
+      </w:r>
+    </w:p>
+    <w:p>
+      <w:r>
+        <w:rPr>
+          <w:rFonts w:ascii="Calibri" w:hAnsi="Calibri"/>
+          <w:b/>
+          <w:color w:val="182420"/>
+          <w:sz w:val="22"/>
+        </w:rPr>
+        <w:t>3. Khi nào được hoàn Xu?</w:t>
+      </w:r>
+    </w:p>
+    <w:p>
+      <w:r>
+        <w:rPr>
+          <w:rFonts w:ascii="Calibri" w:hAnsi="Calibri"/>
+          <w:color w:val="182420"/>
+          <w:sz w:val="22"/>
+        </w:rPr>
+        <w:t>Nếu đã trừ Xu nhưng hệ thống lỗi trước khi có kết quả hợp lệ theo chính sách, phần Xu của bước lỗi sẽ được hoàn lại.</w:t>
+      </w:r>
+    </w:p>
+    <w:p>
+      <w:r>
+        <w:rPr>
+          <w:rFonts w:ascii="Calibri" w:hAnsi="Calibri"/>
+          <w:b/>
+          <w:color w:val="182420"/>
+          <w:sz w:val="22"/>
+        </w:rPr>
+        <w:t>4. Thiếu Xu thì sao?</w:t>
+      </w:r>
+    </w:p>
+    <w:p>
+      <w:r>
+        <w:rPr>
+          <w:rFonts w:ascii="Calibri" w:hAnsi="Calibri"/>
+          <w:color w:val="182420"/>
+          <w:sz w:val="22"/>
+        </w:rPr>
+        <w:t xml:space="preserve">Bot sẽ báo thiếu Xu và hướng dẫn nạp thêm. Bạn có thể dùng </w:t>
+      </w:r>
+      <w:r>
+        <w:rPr>
+          <w:rFonts w:ascii="Consolas" w:hAnsi="Consolas"/>
+          <w:color w:val="053B2B"/>
+          <w:sz w:val="20"/>
+        </w:rPr>
+        <w:t>/naptien</w:t>
+      </w:r>
+      <w:r>
+        <w:rPr>
+          <w:rFonts w:ascii="Calibri" w:hAnsi="Calibri"/>
+          <w:color w:val="182420"/>
+          <w:sz w:val="22"/>
+        </w:rPr>
+        <w:t xml:space="preserve"> hoặc xem số dư bằng </w:t>
+      </w:r>
+      <w:r>
+        <w:rPr>
+          <w:rFonts w:ascii="Consolas" w:hAnsi="Consolas"/>
+          <w:color w:val="053B2B"/>
+          <w:sz w:val="20"/>
+        </w:rPr>
+        <w:t>/profile</w:t>
+      </w:r>
+      <w:r>
+        <w:rPr>
+          <w:rFonts w:ascii="Calibri" w:hAnsi="Calibri"/>
+          <w:color w:val="182420"/>
+          <w:sz w:val="22"/>
+        </w:rPr>
+        <w:t>.</w:t>
+      </w:r>
+    </w:p>
+    <w:p>
+      <w:r>
+        <w:rPr>
+          <w:rFonts w:ascii="Calibri" w:hAnsi="Calibri"/>
+          <w:b/>
+          <w:color w:val="182420"/>
+          <w:sz w:val="22"/>
+        </w:rPr>
+        <w:t>5. Có nên bấm tạo nhiều lần khi đang chờ không?</w:t>
+      </w:r>
+    </w:p>
+    <w:p>
+      <w:r>
+        <w:rPr>
+          <w:rFonts w:ascii="Calibri" w:hAnsi="Calibri"/>
+          <w:color w:val="182420"/>
+          <w:sz w:val="22"/>
+        </w:rPr>
+        <w:t>Không nên. Hãy chờ kết quả hoặc dùng nút kiểm tra trạng thái nếu bot hiển thị, để tránh tạo trùng yêu cầu.</w:t>
+      </w:r>
+    </w:p>
+    <w:p>
+      <w:r>
+        <w:rPr>
+          <w:rFonts w:ascii="Calibri" w:hAnsi="Calibri"/>
+          <w:b/>
+          <w:color w:val="182420"/>
+          <w:sz w:val="22"/>
+        </w:rPr>
+        <w:t>6. Cần hỗ trợ thì gửi gì?</w:t>
+      </w:r>
+    </w:p>
+    <w:p>
+      <w:r>
+        <w:rPr>
+          <w:rFonts w:ascii="Calibri" w:hAnsi="Calibri"/>
+          <w:color w:val="182420"/>
+          <w:sz w:val="22"/>
+        </w:rPr>
+        <w:t>Hãy gửi ID Telegram, ảnh chụp màn hình, thời gian giao dịch hoặc nội dung yêu cầu gần nhất để TOAN AAS kiểm tra nhanh hơn.</w:t>
+      </w:r>
+    </w:p>
+    <w:p>
+      <w:pPr>
+        <w:pStyle w:val="Heading1"/>
+      </w:pPr>
+      <w:r>
+        <w:rPr>
+          <w:rFonts w:ascii="Calibri" w:hAnsi="Calibri"/>
+          <w:color w:val="182420"/>
+          <w:sz w:val="22"/>
+        </w:rPr>
+        <w:t>9. Liên hệ</w:t>
       </w:r>
     </w:p>
     <w:p>
@@ -588,50 +2013,7 @@
           <w:color w:val="182420"/>
           <w:sz w:val="22"/>
         </w:rPr>
-        <w:t>MoMo/Túi Thần Tài theo cấu hình hiện hành.</w:t>
-      </w:r>
-    </w:p>
-    <w:p>
-      <w:r>
-        <w:rPr>
-          <w:rFonts w:ascii="Calibri" w:hAnsi="Calibri"/>
-          <w:color w:val="182420"/>
-          <w:sz w:val="22"/>
-        </w:rPr>
-        <w:t>PayOS có thể cộng Xu tự động khi webhook hợp lệ. Với nạp thủ công, ảnh bill hoặc nội dung người dùng gửi không tự động xác nhận giao dịch. Admin chỉ cộng Xu sau khi đối soát tiền thật.</w:t>
-      </w:r>
-    </w:p>
-    <w:p>
-      <w:r>
-        <w:rPr>
-          <w:rFonts w:ascii="Calibri" w:hAnsi="Calibri"/>
-          <w:color w:val="182420"/>
-          <w:sz w:val="22"/>
-        </w:rPr>
-        <w:t>Giao dịch VND nội địa có thể được hưởng ưu đãi nếu đáp ứng đúng điều kiện của chương trình đang áp dụng.</w:t>
-      </w:r>
-    </w:p>
-    <w:p>
-      <w:pPr>
-        <w:pStyle w:val="Heading1"/>
-      </w:pPr>
-      <w:r>
-        <w:rPr>
-          <w:rFonts w:ascii="Calibri" w:hAnsi="Calibri"/>
-          <w:color w:val="182420"/>
-          <w:sz w:val="22"/>
-        </w:rPr>
-        <w:t>5. Nạp Xu quốc tế</w:t>
-      </w:r>
-    </w:p>
-    <w:p>
-      <w:r>
-        <w:rPr>
-          <w:rFonts w:ascii="Calibri" w:hAnsi="Calibri"/>
-          <w:color w:val="182420"/>
-          <w:sz w:val="22"/>
-        </w:rPr>
-        <w:t>TOAN AAS hỗ trợ nạp thủ công bằng USD, CNY hoặc USDT theo cấu hình đang mở.</w:t>
+        <w:t>Admin: @toanaas</w:t>
       </w:r>
     </w:p>
     <w:p>
@@ -644,24 +2026,7 @@
           <w:color w:val="182420"/>
           <w:sz w:val="22"/>
         </w:rPr>
-        <w:t xml:space="preserve">Tỉ giá nội bộ USD: </w:t>
-      </w:r>
-      <w:r>
-        <w:rPr>
-          <w:rFonts w:ascii="Calibri" w:hAnsi="Calibri"/>
-          <w:b/>
-          <w:color w:val="182420"/>
-          <w:sz w:val="22"/>
-        </w:rPr>
-        <w:t>1 USD = 25.000đ</w:t>
-      </w:r>
-      <w:r>
-        <w:rPr>
-          <w:rFonts w:ascii="Calibri" w:hAnsi="Calibri"/>
-          <w:color w:val="182420"/>
-          <w:sz w:val="22"/>
-        </w:rPr>
-        <w:t>.</w:t>
+        <w:t>Bot: @toanaasbot</w:t>
       </w:r>
     </w:p>
     <w:p>
@@ -674,24 +2039,7 @@
           <w:color w:val="182420"/>
           <w:sz w:val="22"/>
         </w:rPr>
-        <w:t xml:space="preserve">Tỉ giá nội bộ CNY: </w:t>
-      </w:r>
-      <w:r>
-        <w:rPr>
-          <w:rFonts w:ascii="Calibri" w:hAnsi="Calibri"/>
-          <w:b/>
-          <w:color w:val="182420"/>
-          <w:sz w:val="22"/>
-        </w:rPr>
-        <w:t>1 CNY = 3.800đ</w:t>
-      </w:r>
-      <w:r>
-        <w:rPr>
-          <w:rFonts w:ascii="Calibri" w:hAnsi="Calibri"/>
-          <w:color w:val="182420"/>
-          <w:sz w:val="22"/>
-        </w:rPr>
-        <w:t>.</w:t>
+        <w:t>Website: www.toanaas.vn</w:t>
       </w:r>
     </w:p>
     <w:p>
@@ -704,1273 +2052,7 @@
           <w:color w:val="182420"/>
           <w:sz w:val="22"/>
         </w:rPr>
-        <w:t xml:space="preserve">Ví dụ: </w:t>
-      </w:r>
-      <w:r>
-        <w:rPr>
-          <w:rFonts w:ascii="Calibri" w:hAnsi="Calibri"/>
-          <w:b/>
-          <w:color w:val="182420"/>
-          <w:sz w:val="22"/>
-        </w:rPr>
-        <w:t>10 USD = 250.000đ = 2.500 Xu</w:t>
-      </w:r>
-      <w:r>
-        <w:rPr>
-          <w:rFonts w:ascii="Calibri" w:hAnsi="Calibri"/>
-          <w:color w:val="182420"/>
-          <w:sz w:val="22"/>
-        </w:rPr>
-        <w:t>.</w:t>
-      </w:r>
-    </w:p>
-    <w:p>
-      <w:pPr>
-        <w:pStyle w:val="ListBullet"/>
-      </w:pPr>
-      <w:r>
-        <w:rPr>
-          <w:rFonts w:ascii="Calibri" w:hAnsi="Calibri"/>
-          <w:color w:val="182420"/>
-          <w:sz w:val="22"/>
-        </w:rPr>
-        <w:t xml:space="preserve">Ví dụ: </w:t>
-      </w:r>
-      <w:r>
-        <w:rPr>
-          <w:rFonts w:ascii="Calibri" w:hAnsi="Calibri"/>
-          <w:b/>
-          <w:color w:val="182420"/>
-          <w:sz w:val="22"/>
-        </w:rPr>
-        <w:t>10 CNY = 38.000đ = 380 Xu</w:t>
-      </w:r>
-      <w:r>
-        <w:rPr>
-          <w:rFonts w:ascii="Calibri" w:hAnsi="Calibri"/>
-          <w:color w:val="182420"/>
-          <w:sz w:val="22"/>
-        </w:rPr>
-        <w:t>.</w:t>
-      </w:r>
-    </w:p>
-    <w:p>
-      <w:pPr>
-        <w:pStyle w:val="ListBullet"/>
-      </w:pPr>
-      <w:r>
-        <w:rPr>
-          <w:rFonts w:ascii="Calibri" w:hAnsi="Calibri"/>
-          <w:color w:val="182420"/>
-          <w:sz w:val="22"/>
-        </w:rPr>
-        <w:t>USDT TRC20 là phương thức dự phòng cuối cùng khi không dùng được phương thức khác.</w:t>
-      </w:r>
-    </w:p>
-    <w:p>
-      <w:r>
-        <w:rPr>
-          <w:rFonts w:ascii="Calibri" w:hAnsi="Calibri"/>
-          <w:color w:val="182420"/>
-          <w:sz w:val="22"/>
-        </w:rPr>
-        <w:t>Người dùng phải kiểm tra đúng địa chỉ ví và đúng mạng TRC20 trước khi chuyển. Gửi sai mạng có thể làm mất tiền và TOAN AAS không thể tự khôi phục giao dịch. TXID hoặc ảnh bill chỉ là dữ liệu để admin đối soát, không phải xác nhận tự động.</w:t>
-      </w:r>
-    </w:p>
-    <w:p>
-      <w:pPr>
-        <w:pStyle w:val="Heading1"/>
-      </w:pPr>
-      <w:r>
-        <w:rPr>
-          <w:rFonts w:ascii="Calibri" w:hAnsi="Calibri"/>
-          <w:color w:val="182420"/>
-          <w:sz w:val="22"/>
-        </w:rPr>
-        <w:t>6. Chính sách ưu đãi</w:t>
-      </w:r>
-    </w:p>
-    <w:p>
-      <w:pPr>
-        <w:pStyle w:val="ListBullet"/>
-      </w:pPr>
-      <w:r>
-        <w:rPr>
-          <w:rFonts w:ascii="Calibri" w:hAnsi="Calibri"/>
-          <w:color w:val="182420"/>
-          <w:sz w:val="22"/>
-        </w:rPr>
-        <w:t>Ưu đãi nạp lần đầu, Launch Bonus mệnh giá 50k/100k/200k/500k và các ưu đãi cộng thêm Xu chỉ áp dụng cho khách nội địa Việt Nam hoặc giao dịch VND qua PayOS, QR ngân hàng Việt Nam, ZaloPay hoặc MoMo.</w:t>
-      </w:r>
-    </w:p>
-    <w:p>
-      <w:pPr>
-        <w:pStyle w:val="ListBullet"/>
-      </w:pPr>
-      <w:r>
-        <w:rPr>
-          <w:rFonts w:ascii="Calibri" w:hAnsi="Calibri"/>
-          <w:color w:val="182420"/>
-          <w:sz w:val="22"/>
-        </w:rPr>
-        <w:t>Nạp quốc tế USD/CNY/USDT không áp dụng bonus cộng Xu.</w:t>
-      </w:r>
-    </w:p>
-    <w:p>
-      <w:pPr>
-        <w:pStyle w:val="ListBullet"/>
-      </w:pPr>
-      <w:r>
-        <w:rPr>
-          <w:rFonts w:ascii="Calibri" w:hAnsi="Calibri"/>
-          <w:color w:val="182420"/>
-          <w:sz w:val="22"/>
-        </w:rPr>
-        <w:t>Khách quốc tế vẫn có thể hưởng chiết khấu phần trăm theo hạng thành viên khi đủ điều kiện.</w:t>
-      </w:r>
-    </w:p>
-    <w:p>
-      <w:pPr>
-        <w:pStyle w:val="ListBullet"/>
-      </w:pPr>
-      <w:r>
-        <w:rPr>
-          <w:rFonts w:ascii="Calibri" w:hAnsi="Calibri"/>
-          <w:color w:val="182420"/>
-          <w:sz w:val="22"/>
-        </w:rPr>
-        <w:t>Nếu admin tặng thêm Xu cho khách quốc tế, khoản tặng phải được thực hiện bằng admin grant riêng và có lý do.</w:t>
-      </w:r>
-    </w:p>
-    <w:p>
-      <w:pPr>
-        <w:pStyle w:val="Heading1"/>
-      </w:pPr>
-      <w:r>
-        <w:rPr>
-          <w:rFonts w:ascii="Calibri" w:hAnsi="Calibri"/>
-          <w:color w:val="182420"/>
-          <w:sz w:val="22"/>
-        </w:rPr>
-        <w:t>7. Menu chính TOAN AAS</w:t>
-      </w:r>
-    </w:p>
-    <w:p>
-      <w:r>
-        <w:rPr>
-          <w:rFonts w:ascii="Calibri" w:hAnsi="Calibri"/>
-          <w:color w:val="182420"/>
-          <w:sz w:val="22"/>
-        </w:rPr>
-        <w:t>Các nhóm chức năng chính có thể gồm:</w:t>
-      </w:r>
-    </w:p>
-    <w:p>
-      <w:pPr>
-        <w:pStyle w:val="ListBullet"/>
-      </w:pPr>
-      <w:r>
-        <w:rPr>
-          <w:rFonts w:ascii="Calibri" w:hAnsi="Calibri"/>
-          <w:b/>
-          <w:color w:val="182420"/>
-          <w:sz w:val="22"/>
-        </w:rPr>
-        <w:t>Hỏi AI / Viết nội dung:</w:t>
-      </w:r>
-      <w:r>
-        <w:rPr>
-          <w:rFonts w:ascii="Calibri" w:hAnsi="Calibri"/>
-          <w:color w:val="182420"/>
-          <w:sz w:val="22"/>
-        </w:rPr>
-        <w:t xml:space="preserve"> hỏi đáp, phân tích, viết nội dung và hỗ trợ ý tưởng.</w:t>
-      </w:r>
-    </w:p>
-    <w:p>
-      <w:pPr>
-        <w:pStyle w:val="ListBullet"/>
-      </w:pPr>
-      <w:r>
-        <w:rPr>
-          <w:rFonts w:ascii="Calibri" w:hAnsi="Calibri"/>
-          <w:b/>
-          <w:color w:val="182420"/>
-          <w:sz w:val="22"/>
-        </w:rPr>
-        <w:t>Ảnh / Media Studio:</w:t>
-      </w:r>
-      <w:r>
-        <w:rPr>
-          <w:rFonts w:ascii="Calibri" w:hAnsi="Calibri"/>
-          <w:color w:val="182420"/>
-          <w:sz w:val="22"/>
-        </w:rPr>
-        <w:t xml:space="preserve"> tạo ảnh, prompt ảnh và công cụ xử lý ảnh.</w:t>
-      </w:r>
-    </w:p>
-    <w:p>
-      <w:pPr>
-        <w:pStyle w:val="ListBullet"/>
-      </w:pPr>
-      <w:r>
-        <w:rPr>
-          <w:rFonts w:ascii="Calibri" w:hAnsi="Calibri"/>
-          <w:b/>
-          <w:color w:val="182420"/>
-          <w:sz w:val="22"/>
-        </w:rPr>
-        <w:t>Video / Content Factory:</w:t>
-      </w:r>
-      <w:r>
-        <w:rPr>
-          <w:rFonts w:ascii="Calibri" w:hAnsi="Calibri"/>
-          <w:color w:val="182420"/>
-          <w:sz w:val="22"/>
-        </w:rPr>
-        <w:t xml:space="preserve"> ý tưởng, kịch bản, storyboard, prompt và tạo video theo công cụ đang mở.</w:t>
-      </w:r>
-    </w:p>
-    <w:p>
-      <w:pPr>
-        <w:pStyle w:val="ListBullet"/>
-      </w:pPr>
-      <w:r>
-        <w:rPr>
-          <w:rFonts w:ascii="Calibri" w:hAnsi="Calibri"/>
-          <w:b/>
-          <w:color w:val="182420"/>
-          <w:sz w:val="22"/>
-        </w:rPr>
-        <w:t>Voice / Phụ đề / Lồng tiếng:</w:t>
-      </w:r>
-      <w:r>
-        <w:rPr>
-          <w:rFonts w:ascii="Calibri" w:hAnsi="Calibri"/>
-          <w:color w:val="182420"/>
-          <w:sz w:val="22"/>
-        </w:rPr>
-        <w:t xml:space="preserve"> TTS, ASR, phụ đề, dịch và ghép giọng.</w:t>
-      </w:r>
-    </w:p>
-    <w:p>
-      <w:pPr>
-        <w:pStyle w:val="ListBullet"/>
-      </w:pPr>
-      <w:r>
-        <w:rPr>
-          <w:rFonts w:ascii="Calibri" w:hAnsi="Calibri"/>
-          <w:b/>
-          <w:color w:val="182420"/>
-          <w:sz w:val="22"/>
-        </w:rPr>
-        <w:t>PDF / Word / Tài liệu:</w:t>
-      </w:r>
-      <w:r>
-        <w:rPr>
-          <w:rFonts w:ascii="Calibri" w:hAnsi="Calibri"/>
-          <w:color w:val="182420"/>
-          <w:sz w:val="22"/>
-        </w:rPr>
-        <w:t xml:space="preserve"> chuyển đổi, nén, tách, gộp hoặc lưu tài liệu theo tính năng đang bật.</w:t>
-      </w:r>
-    </w:p>
-    <w:p>
-      <w:pPr>
-        <w:pStyle w:val="ListBullet"/>
-      </w:pPr>
-      <w:r>
-        <w:rPr>
-          <w:rFonts w:ascii="Calibri" w:hAnsi="Calibri"/>
-          <w:b/>
-          <w:color w:val="182420"/>
-          <w:sz w:val="22"/>
-        </w:rPr>
-        <w:t>Hỗ trợ / Ticket / Đối soát:</w:t>
-      </w:r>
-      <w:r>
-        <w:rPr>
-          <w:rFonts w:ascii="Calibri" w:hAnsi="Calibri"/>
-          <w:color w:val="182420"/>
-          <w:sz w:val="22"/>
-        </w:rPr>
-        <w:t xml:space="preserve"> hỏi đáp, tạo ticket và bổ sung dữ liệu cho admin kiểm tra.</w:t>
-      </w:r>
-    </w:p>
-    <w:p>
-      <w:pPr>
-        <w:pStyle w:val="ListBullet"/>
-      </w:pPr>
-      <w:r>
-        <w:rPr>
-          <w:rFonts w:ascii="Calibri" w:hAnsi="Calibri"/>
-          <w:b/>
-          <w:color w:val="182420"/>
-          <w:sz w:val="22"/>
-        </w:rPr>
-        <w:t>Premium / Bot riêng / Dịch vụ:</w:t>
-      </w:r>
-      <w:r>
-        <w:rPr>
-          <w:rFonts w:ascii="Calibri" w:hAnsi="Calibri"/>
-          <w:color w:val="182420"/>
-          <w:sz w:val="22"/>
-        </w:rPr>
-        <w:t xml:space="preserve"> tư vấn triển khai theo nhu cầu.</w:t>
-      </w:r>
-    </w:p>
-    <w:p>
-      <w:pPr>
-        <w:pStyle w:val="ListBullet"/>
-      </w:pPr>
-      <w:r>
-        <w:rPr>
-          <w:rFonts w:ascii="Calibri" w:hAnsi="Calibri"/>
-          <w:b/>
-          <w:color w:val="182420"/>
-          <w:sz w:val="22"/>
-        </w:rPr>
-        <w:t>Bảng giá / Nạp Xu / Thanh toán:</w:t>
-      </w:r>
-      <w:r>
-        <w:rPr>
-          <w:rFonts w:ascii="Calibri" w:hAnsi="Calibri"/>
-          <w:color w:val="182420"/>
-          <w:sz w:val="22"/>
-        </w:rPr>
-        <w:t xml:space="preserve"> xem giá, số dư và phương thức thanh toán.</w:t>
-      </w:r>
-    </w:p>
-    <w:p>
-      <w:pPr>
-        <w:pStyle w:val="Heading1"/>
-      </w:pPr>
-      <w:r>
-        <w:rPr>
-          <w:rFonts w:ascii="Calibri" w:hAnsi="Calibri"/>
-          <w:color w:val="182420"/>
-          <w:sz w:val="22"/>
-        </w:rPr>
-        <w:t>8. Ảnh / Media Studio</w:t>
-      </w:r>
-    </w:p>
-    <w:p>
-      <w:r>
-        <w:rPr>
-          <w:rFonts w:ascii="Calibri" w:hAnsi="Calibri"/>
-          <w:color w:val="182420"/>
-          <w:sz w:val="22"/>
-        </w:rPr>
-        <w:t>TOAN AAS có thể hỗ trợ:</w:t>
-      </w:r>
-    </w:p>
-    <w:p>
-      <w:pPr>
-        <w:pStyle w:val="ListBullet"/>
-      </w:pPr>
-      <w:r>
-        <w:rPr>
-          <w:rFonts w:ascii="Calibri" w:hAnsi="Calibri"/>
-          <w:color w:val="182420"/>
-          <w:sz w:val="22"/>
-        </w:rPr>
-        <w:t>Tạo ảnh AI theo prompt hoặc gợi ý.</w:t>
-      </w:r>
-    </w:p>
-    <w:p>
-      <w:pPr>
-        <w:pStyle w:val="ListBullet"/>
-      </w:pPr>
-      <w:r>
-        <w:rPr>
-          <w:rFonts w:ascii="Calibri" w:hAnsi="Calibri"/>
-          <w:color w:val="182420"/>
-          <w:sz w:val="22"/>
-        </w:rPr>
-        <w:t>Viết prompt ảnh theo sản phẩm, thương hiệu hoặc nền tảng.</w:t>
-      </w:r>
-    </w:p>
-    <w:p>
-      <w:pPr>
-        <w:pStyle w:val="ListBullet"/>
-      </w:pPr>
-      <w:r>
-        <w:rPr>
-          <w:rFonts w:ascii="Calibri" w:hAnsi="Calibri"/>
-          <w:color w:val="182420"/>
-          <w:sz w:val="22"/>
-        </w:rPr>
-        <w:t>Tạo ảnh sản phẩm, banner và nội dung truyền thông.</w:t>
-      </w:r>
-    </w:p>
-    <w:p>
-      <w:pPr>
-        <w:pStyle w:val="ListBullet"/>
-      </w:pPr>
-      <w:r>
-        <w:rPr>
-          <w:rFonts w:ascii="Calibri" w:hAnsi="Calibri"/>
-          <w:color w:val="182420"/>
-          <w:sz w:val="22"/>
-        </w:rPr>
-        <w:t>Chỉnh màu, nâng nét, crop, resize, thêm chữ/logo khi công cụ tương ứng được mở.</w:t>
-      </w:r>
-    </w:p>
-    <w:p>
-      <w:r>
-        <w:rPr>
-          <w:rFonts w:ascii="Calibri" w:hAnsi="Calibri"/>
-          <w:color w:val="182420"/>
-          <w:sz w:val="22"/>
-        </w:rPr>
-        <w:t>Ảnh có chữ, logo, bàn tay hoặc khuôn mặt có thể cần kiểm tra và tạo lại. Tính năng chưa mở sẽ có guard; bot không gọi provider và không trừ Xu.</w:t>
-      </w:r>
-    </w:p>
-    <w:p>
-      <w:pPr>
-        <w:pStyle w:val="Heading1"/>
-      </w:pPr>
-      <w:r>
-        <w:rPr>
-          <w:rFonts w:ascii="Calibri" w:hAnsi="Calibri"/>
-          <w:color w:val="182420"/>
-          <w:sz w:val="22"/>
-        </w:rPr>
-        <w:t>9. Video / Content Factory</w:t>
-      </w:r>
-    </w:p>
-    <w:p>
-      <w:r>
-        <w:rPr>
-          <w:rFonts w:ascii="Calibri" w:hAnsi="Calibri"/>
-          <w:color w:val="182420"/>
-          <w:sz w:val="22"/>
-        </w:rPr>
-        <w:t>Các quy trình video có thể gồm:</w:t>
-      </w:r>
-    </w:p>
-    <w:p>
-      <w:pPr>
-        <w:pStyle w:val="ListBullet"/>
-      </w:pPr>
-      <w:r>
-        <w:rPr>
-          <w:rFonts w:ascii="Calibri" w:hAnsi="Calibri"/>
-          <w:color w:val="182420"/>
-          <w:sz w:val="22"/>
-        </w:rPr>
-        <w:t>Ý tưởng video và video theo trend.</w:t>
-      </w:r>
-    </w:p>
-    <w:p>
-      <w:pPr>
-        <w:pStyle w:val="ListBullet"/>
-      </w:pPr>
-      <w:r>
-        <w:rPr>
-          <w:rFonts w:ascii="Calibri" w:hAnsi="Calibri"/>
-          <w:color w:val="182420"/>
-          <w:sz w:val="22"/>
-        </w:rPr>
-        <w:t>Ý tưởng quảng cáo hoặc concept cinematic.</w:t>
-      </w:r>
-    </w:p>
-    <w:p>
-      <w:pPr>
-        <w:pStyle w:val="ListBullet"/>
-      </w:pPr>
-      <w:r>
-        <w:rPr>
-          <w:rFonts w:ascii="Calibri" w:hAnsi="Calibri"/>
-          <w:color w:val="182420"/>
-          <w:sz w:val="22"/>
-        </w:rPr>
-        <w:t>Kịch bản -&gt; ảnh -&gt; video.</w:t>
-      </w:r>
-    </w:p>
-    <w:p>
-      <w:pPr>
-        <w:pStyle w:val="ListBullet"/>
-      </w:pPr>
-      <w:r>
-        <w:rPr>
-          <w:rFonts w:ascii="Calibri" w:hAnsi="Calibri"/>
-          <w:color w:val="182420"/>
-          <w:sz w:val="22"/>
-        </w:rPr>
-        <w:t>Ghép ảnh thành video bằng Local Worker/FFmpeg.</w:t>
-      </w:r>
-    </w:p>
-    <w:p>
-      <w:pPr>
-        <w:pStyle w:val="ListBullet"/>
-      </w:pPr>
-      <w:r>
-        <w:rPr>
-          <w:rFonts w:ascii="Calibri" w:hAnsi="Calibri"/>
-          <w:color w:val="182420"/>
-          <w:sz w:val="22"/>
-        </w:rPr>
-        <w:t>Video AI chân thật khi provider sẵn sàng.</w:t>
-      </w:r>
-    </w:p>
-    <w:p>
-      <w:pPr>
-        <w:pStyle w:val="ListBullet"/>
-      </w:pPr>
-      <w:r>
-        <w:rPr>
-          <w:rFonts w:ascii="Calibri" w:hAnsi="Calibri"/>
-          <w:color w:val="182420"/>
-          <w:sz w:val="22"/>
-        </w:rPr>
-        <w:t>Video dài chia đoạn để giảm lỗi và kiểm soát chi phí.</w:t>
-      </w:r>
-    </w:p>
-    <w:p>
-      <w:pPr>
-        <w:pStyle w:val="ListBullet"/>
-      </w:pPr>
-      <w:r>
-        <w:rPr>
-          <w:rFonts w:ascii="Calibri" w:hAnsi="Calibri"/>
-          <w:color w:val="182420"/>
-          <w:sz w:val="22"/>
-        </w:rPr>
-        <w:t>Prompt video, camera motion và hành động theo từng cảnh.</w:t>
-      </w:r>
-    </w:p>
-    <w:p>
-      <w:pPr>
-        <w:pStyle w:val="Heading1"/>
-      </w:pPr>
-      <w:r>
-        <w:rPr>
-          <w:rFonts w:ascii="Calibri" w:hAnsi="Calibri"/>
-          <w:color w:val="182420"/>
-          <w:sz w:val="22"/>
-        </w:rPr>
-        <w:t>10. Giá video</w:t>
-      </w:r>
-    </w:p>
-    <w:p>
-      <w:r>
-        <w:rPr>
-          <w:rFonts w:ascii="Calibri" w:hAnsi="Calibri"/>
-          <w:color w:val="182420"/>
-          <w:sz w:val="22"/>
-        </w:rPr>
-        <w:t>Video không dùng một mức giá chung cho mọi trường hợp. Chi phí có thể phụ thuộc:</w:t>
-      </w:r>
-    </w:p>
-    <w:p>
-      <w:pPr>
-        <w:pStyle w:val="ListBullet"/>
-      </w:pPr>
-      <w:r>
-        <w:rPr>
-          <w:rFonts w:ascii="Calibri" w:hAnsi="Calibri"/>
-          <w:color w:val="182420"/>
-          <w:sz w:val="22"/>
-        </w:rPr>
-        <w:t>Số giây và số đoạn.</w:t>
-      </w:r>
-    </w:p>
-    <w:p>
-      <w:pPr>
-        <w:pStyle w:val="ListBullet"/>
-      </w:pPr>
-      <w:r>
-        <w:rPr>
-          <w:rFonts w:ascii="Calibri" w:hAnsi="Calibri"/>
-          <w:color w:val="182420"/>
-          <w:sz w:val="22"/>
-        </w:rPr>
-        <w:t>Loại xử lý hoặc model/provider.</w:t>
-      </w:r>
-    </w:p>
-    <w:p>
-      <w:pPr>
-        <w:pStyle w:val="ListBullet"/>
-      </w:pPr>
-      <w:r>
-        <w:rPr>
-          <w:rFonts w:ascii="Calibri" w:hAnsi="Calibri"/>
-          <w:color w:val="182420"/>
-          <w:sz w:val="22"/>
-        </w:rPr>
-        <w:t>Chất lượng đầu ra.</w:t>
-      </w:r>
-    </w:p>
-    <w:p>
-      <w:pPr>
-        <w:pStyle w:val="ListBullet"/>
-      </w:pPr>
-      <w:r>
-        <w:rPr>
-          <w:rFonts w:ascii="Calibri" w:hAnsi="Calibri"/>
-          <w:color w:val="182420"/>
-          <w:sz w:val="22"/>
-        </w:rPr>
-        <w:t>Số cảnh hoặc số ảnh đầu vào.</w:t>
-      </w:r>
-    </w:p>
-    <w:p>
-      <w:pPr>
-        <w:pStyle w:val="ListBullet"/>
-      </w:pPr>
-      <w:r>
-        <w:rPr>
-          <w:rFonts w:ascii="Calibri" w:hAnsi="Calibri"/>
-          <w:color w:val="182420"/>
-          <w:sz w:val="22"/>
-        </w:rPr>
-        <w:t>Phụ đề, dịch và lồng tiếng add-on.</w:t>
-      </w:r>
-    </w:p>
-    <w:p>
-      <w:r>
-        <w:rPr>
-          <w:rFonts w:ascii="Calibri" w:hAnsi="Calibri"/>
-          <w:color w:val="182420"/>
-          <w:sz w:val="22"/>
-        </w:rPr>
-        <w:t>Ghép ảnh thành video bằng công cụ local thường rẻ hơn Video AI chân thật. Bot chỉ chạy tác vụ thật sau khi người dùng xem và xác nhận chi phí. Nếu provider chưa sẵn sàng, bot báo rõ và không trừ Xu.</w:t>
-      </w:r>
-    </w:p>
-    <w:p>
-      <w:pPr>
-        <w:pStyle w:val="Heading1"/>
-      </w:pPr>
-      <w:r>
-        <w:rPr>
-          <w:rFonts w:ascii="Calibri" w:hAnsi="Calibri"/>
-          <w:color w:val="182420"/>
-          <w:sz w:val="22"/>
-        </w:rPr>
-        <w:t>11. Voice / Phụ đề / Lồng tiếng</w:t>
-      </w:r>
-    </w:p>
-    <w:p>
-      <w:r>
-        <w:rPr>
-          <w:rFonts w:ascii="Calibri" w:hAnsi="Calibri"/>
-          <w:color w:val="182420"/>
-          <w:sz w:val="22"/>
-        </w:rPr>
-        <w:t>TOAN AAS có thể hỗ trợ:</w:t>
-      </w:r>
-    </w:p>
-    <w:p>
-      <w:pPr>
-        <w:pStyle w:val="ListBullet"/>
-      </w:pPr>
-      <w:r>
-        <w:rPr>
-          <w:rFonts w:ascii="Calibri" w:hAnsi="Calibri"/>
-          <w:color w:val="182420"/>
-          <w:sz w:val="22"/>
-        </w:rPr>
-        <w:t>Tạo giọng đọc TTS.</w:t>
-      </w:r>
-    </w:p>
-    <w:p>
-      <w:pPr>
-        <w:pStyle w:val="ListBullet"/>
-      </w:pPr>
-      <w:r>
-        <w:rPr>
-          <w:rFonts w:ascii="Calibri" w:hAnsi="Calibri"/>
-          <w:color w:val="182420"/>
-          <w:sz w:val="22"/>
-        </w:rPr>
-        <w:t>Tạo phụ đề từ audio/video.</w:t>
-      </w:r>
-    </w:p>
-    <w:p>
-      <w:pPr>
-        <w:pStyle w:val="ListBullet"/>
-      </w:pPr>
-      <w:r>
-        <w:rPr>
-          <w:rFonts w:ascii="Calibri" w:hAnsi="Calibri"/>
-          <w:color w:val="182420"/>
-          <w:sz w:val="22"/>
-        </w:rPr>
-        <w:t>Dịch phụ đề.</w:t>
-      </w:r>
-    </w:p>
-    <w:p>
-      <w:pPr>
-        <w:pStyle w:val="ListBullet"/>
-      </w:pPr>
-      <w:r>
-        <w:rPr>
-          <w:rFonts w:ascii="Calibri" w:hAnsi="Calibri"/>
-          <w:color w:val="182420"/>
-          <w:sz w:val="22"/>
-        </w:rPr>
-        <w:t>Lồng tiếng.</w:t>
-      </w:r>
-    </w:p>
-    <w:p>
-      <w:pPr>
-        <w:pStyle w:val="ListBullet"/>
-      </w:pPr>
-      <w:r>
-        <w:rPr>
-          <w:rFonts w:ascii="Calibri" w:hAnsi="Calibri"/>
-          <w:color w:val="182420"/>
-          <w:sz w:val="22"/>
-        </w:rPr>
-        <w:t>Pipeline phụ đề + dịch + lồng tiếng + ghép audio/video.</w:t>
-      </w:r>
-    </w:p>
-    <w:p>
-      <w:r>
-        <w:rPr>
-          <w:rFonts w:ascii="Calibri" w:hAnsi="Calibri"/>
-          <w:color w:val="182420"/>
-          <w:sz w:val="22"/>
-        </w:rPr>
-        <w:t>Kết quả có thể cần kiểm tra lại nếu âm thanh khó nghe, video dài hoặc có nhiều người nói. Nếu provider hoặc worker chưa sẵn sàng, hệ thống không gọi API và không trừ Xu.</w:t>
-      </w:r>
-    </w:p>
-    <w:p>
-      <w:pPr>
-        <w:pStyle w:val="Heading1"/>
-      </w:pPr>
-      <w:r>
-        <w:rPr>
-          <w:rFonts w:ascii="Calibri" w:hAnsi="Calibri"/>
-          <w:color w:val="182420"/>
-          <w:sz w:val="22"/>
-        </w:rPr>
-        <w:t>12. PDF / Word / Tài liệu</w:t>
-      </w:r>
-    </w:p>
-    <w:p>
-      <w:r>
-        <w:rPr>
-          <w:rFonts w:ascii="Calibri" w:hAnsi="Calibri"/>
-          <w:color w:val="182420"/>
-          <w:sz w:val="22"/>
-        </w:rPr>
-        <w:t>Các công cụ tài liệu có thể gồm xử lý PDF, Word, chuyển đổi, nén, tách, gộp và lưu tài liệu. Công cụ local miễn phí sẽ hiển thị 0 Xu khi chính sách đó đang áp dụng. Người dùng nên gửi từng file một để giảm lỗi; nếu gửi nhiều file, bot sẽ xử lý theo khả năng của công cụ đang mở.</w:t>
-      </w:r>
-    </w:p>
-    <w:p>
-      <w:pPr>
-        <w:pStyle w:val="Heading1"/>
-      </w:pPr>
-      <w:r>
-        <w:rPr>
-          <w:rFonts w:ascii="Calibri" w:hAnsi="Calibri"/>
-          <w:color w:val="182420"/>
-          <w:sz w:val="22"/>
-        </w:rPr>
-        <w:t>13. Hỗ trợ / Ticket / Đối soát</w:t>
-      </w:r>
-    </w:p>
-    <w:p>
-      <w:r>
-        <w:rPr>
-          <w:rFonts w:ascii="Calibri" w:hAnsi="Calibri"/>
-          <w:color w:val="182420"/>
-          <w:sz w:val="22"/>
-        </w:rPr>
-        <w:t>Người dùng có thể:</w:t>
-      </w:r>
-    </w:p>
-    <w:p>
-      <w:pPr>
-        <w:pStyle w:val="ListBullet"/>
-      </w:pPr>
-      <w:r>
-        <w:rPr>
-          <w:rFonts w:ascii="Calibri" w:hAnsi="Calibri"/>
-          <w:color w:val="182420"/>
-          <w:sz w:val="22"/>
-        </w:rPr>
-        <w:t>Hỏi cách sử dụng hoặc cách nạp Xu và nhận trả lời ngay.</w:t>
-      </w:r>
-    </w:p>
-    <w:p>
-      <w:pPr>
-        <w:pStyle w:val="ListBullet"/>
-      </w:pPr>
-      <w:r>
-        <w:rPr>
-          <w:rFonts w:ascii="Calibri" w:hAnsi="Calibri"/>
-          <w:color w:val="182420"/>
-          <w:sz w:val="22"/>
-        </w:rPr>
-        <w:t>Tạo ticket khi cần admin kiểm tra sâu hơn.</w:t>
-      </w:r>
-    </w:p>
-    <w:p>
-      <w:pPr>
-        <w:pStyle w:val="ListBullet"/>
-      </w:pPr>
-      <w:r>
-        <w:rPr>
-          <w:rFonts w:ascii="Calibri" w:hAnsi="Calibri"/>
-          <w:color w:val="182420"/>
-          <w:sz w:val="22"/>
-        </w:rPr>
-        <w:t>Xem ticket của mình và gửi thêm nội dung.</w:t>
-      </w:r>
-    </w:p>
-    <w:p>
-      <w:pPr>
-        <w:pStyle w:val="ListBullet"/>
-      </w:pPr>
-      <w:r>
-        <w:rPr>
-          <w:rFonts w:ascii="Calibri" w:hAnsi="Calibri"/>
-          <w:color w:val="182420"/>
-          <w:sz w:val="22"/>
-        </w:rPr>
-        <w:t>Đối soát nạp thủ công.</w:t>
-      </w:r>
-    </w:p>
-    <w:p>
-      <w:pPr>
-        <w:pStyle w:val="ListBullet"/>
-      </w:pPr>
-      <w:r>
-        <w:rPr>
-          <w:rFonts w:ascii="Calibri" w:hAnsi="Calibri"/>
-          <w:color w:val="182420"/>
-          <w:sz w:val="22"/>
-        </w:rPr>
-        <w:t>Báo lỗi ảnh, video, voice hoặc tài liệu.</w:t>
-      </w:r>
-    </w:p>
-    <w:p>
-      <w:pPr>
-        <w:pStyle w:val="ListBullet"/>
-      </w:pPr>
-      <w:r>
-        <w:rPr>
-          <w:rFonts w:ascii="Calibri" w:hAnsi="Calibri"/>
-          <w:color w:val="182420"/>
-          <w:sz w:val="22"/>
-        </w:rPr>
-        <w:t>Yêu cầu kiểm tra hoàn Xu/refund.</w:t>
-      </w:r>
-    </w:p>
-    <w:p>
-      <w:r>
-        <w:rPr>
-          <w:rFonts w:ascii="Calibri" w:hAnsi="Calibri"/>
-          <w:color w:val="182420"/>
-          <w:sz w:val="22"/>
-        </w:rPr>
-        <w:t xml:space="preserve">Khi cần kiểm tra thanh toán hoặc job, hãy tạo ticket trong bot và cung cấp mã giao dịch/job liên quan. Admin chính thức: </w:t>
-      </w:r>
-      <w:r>
-        <w:rPr>
-          <w:rFonts w:ascii="Calibri" w:hAnsi="Calibri"/>
-          <w:b/>
-          <w:color w:val="08734F"/>
-          <w:sz w:val="22"/>
-        </w:rPr>
-        <w:t>@toanaas (https://t.me/toanaas)</w:t>
-      </w:r>
-      <w:r>
-        <w:rPr>
-          <w:rFonts w:ascii="Calibri" w:hAnsi="Calibri"/>
-          <w:color w:val="182420"/>
-          <w:sz w:val="22"/>
-        </w:rPr>
-        <w:t>.</w:t>
-      </w:r>
-    </w:p>
-    <w:p>
-      <w:pPr>
-        <w:pStyle w:val="Heading1"/>
-      </w:pPr>
-      <w:r>
-        <w:rPr>
-          <w:rFonts w:ascii="Calibri" w:hAnsi="Calibri"/>
-          <w:color w:val="182420"/>
-          <w:sz w:val="22"/>
-        </w:rPr>
-        <w:t>14. Premium / Bot riêng / Dịch vụ</w:t>
-      </w:r>
-    </w:p>
-    <w:p>
-      <w:r>
-        <w:rPr>
-          <w:rFonts w:ascii="Calibri" w:hAnsi="Calibri"/>
-          <w:color w:val="182420"/>
-          <w:sz w:val="22"/>
-        </w:rPr>
-        <w:t>TOAN AAS có thể tư vấn và triển khai:</w:t>
-      </w:r>
-    </w:p>
-    <w:p>
-      <w:pPr>
-        <w:pStyle w:val="ListBullet"/>
-      </w:pPr>
-      <w:r>
-        <w:rPr>
-          <w:rFonts w:ascii="Calibri" w:hAnsi="Calibri"/>
-          <w:color w:val="182420"/>
-          <w:sz w:val="22"/>
-        </w:rPr>
-        <w:t>Premium theo chính sách đang mở.</w:t>
-      </w:r>
-    </w:p>
-    <w:p>
-      <w:pPr>
-        <w:pStyle w:val="ListBullet"/>
-      </w:pPr>
-      <w:r>
-        <w:rPr>
-          <w:rFonts w:ascii="Calibri" w:hAnsi="Calibri"/>
-          <w:color w:val="182420"/>
-          <w:sz w:val="22"/>
-        </w:rPr>
-        <w:t>Bot CSKH/ticket.</w:t>
-      </w:r>
-    </w:p>
-    <w:p>
-      <w:pPr>
-        <w:pStyle w:val="ListBullet"/>
-      </w:pPr>
-      <w:r>
-        <w:rPr>
-          <w:rFonts w:ascii="Calibri" w:hAnsi="Calibri"/>
-          <w:color w:val="182420"/>
-          <w:sz w:val="22"/>
-        </w:rPr>
-        <w:t>Bot bán hàng hoặc shop online.</w:t>
-      </w:r>
-    </w:p>
-    <w:p>
-      <w:pPr>
-        <w:pStyle w:val="ListBullet"/>
-      </w:pPr>
-      <w:r>
-        <w:rPr>
-          <w:rFonts w:ascii="Calibri" w:hAnsi="Calibri"/>
-          <w:color w:val="182420"/>
-          <w:sz w:val="22"/>
-        </w:rPr>
-        <w:t>Bot content/marketing.</w:t>
-      </w:r>
-    </w:p>
-    <w:p>
-      <w:pPr>
-        <w:pStyle w:val="ListBullet"/>
-      </w:pPr>
-      <w:r>
-        <w:rPr>
-          <w:rFonts w:ascii="Calibri" w:hAnsi="Calibri"/>
-          <w:color w:val="182420"/>
-          <w:sz w:val="22"/>
-        </w:rPr>
-        <w:t>Bot nội bộ doanh nghiệp.</w:t>
-      </w:r>
-    </w:p>
-    <w:p>
-      <w:pPr>
-        <w:pStyle w:val="ListBullet"/>
-      </w:pPr>
-      <w:r>
-        <w:rPr>
-          <w:rFonts w:ascii="Calibri" w:hAnsi="Calibri"/>
-          <w:color w:val="182420"/>
-          <w:sz w:val="22"/>
-        </w:rPr>
-        <w:t>Workflow tự động hóa riêng.</w:t>
-      </w:r>
-    </w:p>
-    <w:p>
-      <w:r>
-        <w:rPr>
-          <w:rFonts w:ascii="Calibri" w:hAnsi="Calibri"/>
-          <w:color w:val="182420"/>
-          <w:sz w:val="22"/>
-        </w:rPr>
-        <w:t>Giá và phạm vi triển khai phụ thuộc nhu cầu, quy mô, tích hợp và ngân sách thực tế.</w:t>
-      </w:r>
-    </w:p>
-    <w:p>
-      <w:pPr>
-        <w:pStyle w:val="Heading1"/>
-      </w:pPr>
-      <w:r>
-        <w:rPr>
-          <w:rFonts w:ascii="Calibri" w:hAnsi="Calibri"/>
-          <w:color w:val="182420"/>
-          <w:sz w:val="22"/>
-        </w:rPr>
-        <w:t>15. Mẹo sử dụng hiệu quả</w:t>
-      </w:r>
-    </w:p>
-    <w:p>
-      <w:pPr>
-        <w:pStyle w:val="ListBullet"/>
-      </w:pPr>
-      <w:r>
-        <w:rPr>
-          <w:rFonts w:ascii="Calibri" w:hAnsi="Calibri"/>
-          <w:color w:val="182420"/>
-          <w:sz w:val="22"/>
-        </w:rPr>
-        <w:t>Mô tả rõ sản phẩm, ngách, nền tảng, mục tiêu và thời lượng.</w:t>
-      </w:r>
-    </w:p>
-    <w:p>
-      <w:pPr>
-        <w:pStyle w:val="ListBullet"/>
-      </w:pPr>
-      <w:r>
-        <w:rPr>
-          <w:rFonts w:ascii="Calibri" w:hAnsi="Calibri"/>
-          <w:color w:val="182420"/>
-          <w:sz w:val="22"/>
-        </w:rPr>
-        <w:t>Gửi ảnh/video mẫu nếu bạn có quyền sử dụng.</w:t>
-      </w:r>
-    </w:p>
-    <w:p>
-      <w:pPr>
-        <w:pStyle w:val="ListBullet"/>
-      </w:pPr>
-      <w:r>
-        <w:rPr>
-          <w:rFonts w:ascii="Calibri" w:hAnsi="Calibri"/>
-          <w:color w:val="182420"/>
-          <w:sz w:val="22"/>
-        </w:rPr>
-        <w:t>Kiểm tra prompt trước khi render tác vụ tốn phí.</w:t>
-      </w:r>
-    </w:p>
-    <w:p>
-      <w:pPr>
-        <w:pStyle w:val="ListBullet"/>
-      </w:pPr>
-      <w:r>
-        <w:rPr>
-          <w:rFonts w:ascii="Calibri" w:hAnsi="Calibri"/>
-          <w:color w:val="182420"/>
-          <w:sz w:val="22"/>
-        </w:rPr>
-        <w:t>Với video dài, nên chia đoạn.</w:t>
-      </w:r>
-    </w:p>
-    <w:p>
-      <w:pPr>
-        <w:pStyle w:val="ListBullet"/>
-      </w:pPr>
-      <w:r>
-        <w:rPr>
-          <w:rFonts w:ascii="Calibri" w:hAnsi="Calibri"/>
-          <w:color w:val="182420"/>
-          <w:sz w:val="22"/>
-        </w:rPr>
-        <w:t>Không bấm tạo nhiều lần khi bot đang xử lý.</w:t>
-      </w:r>
-    </w:p>
-    <w:p>
-      <w:pPr>
-        <w:pStyle w:val="ListBullet"/>
-      </w:pPr>
-      <w:r>
-        <w:rPr>
-          <w:rFonts w:ascii="Calibri" w:hAnsi="Calibri"/>
-          <w:color w:val="182420"/>
-          <w:sz w:val="22"/>
-        </w:rPr>
-        <w:t>Nếu bot báo “chưa trừ Xu”, tác vụ đó chưa được tính phí.</w:t>
-      </w:r>
-    </w:p>
-    <w:p>
-      <w:pPr>
-        <w:pStyle w:val="Heading1"/>
-      </w:pPr>
-      <w:r>
-        <w:rPr>
-          <w:rFonts w:ascii="Calibri" w:hAnsi="Calibri"/>
-          <w:color w:val="182420"/>
-          <w:sz w:val="22"/>
-        </w:rPr>
-        <w:t>16. Những gì TOAN AAS chưa cam kết</w:t>
-      </w:r>
-    </w:p>
-    <w:p>
-      <w:pPr>
-        <w:pStyle w:val="ListBullet"/>
-      </w:pPr>
-      <w:r>
-        <w:rPr>
-          <w:rFonts w:ascii="Calibri" w:hAnsi="Calibri"/>
-          <w:color w:val="182420"/>
-          <w:sz w:val="22"/>
-        </w:rPr>
-        <w:t>Không cam kết nội dung sẽ viral hoặc tạo doanh thu.</w:t>
-      </w:r>
-    </w:p>
-    <w:p>
-      <w:pPr>
-        <w:pStyle w:val="ListBullet"/>
-      </w:pPr>
-      <w:r>
-        <w:rPr>
-          <w:rFonts w:ascii="Calibri" w:hAnsi="Calibri"/>
-          <w:color w:val="182420"/>
-          <w:sz w:val="22"/>
-        </w:rPr>
-        <w:t>Không cam kết provider bên thứ ba luôn hoạt động liên tục.</w:t>
-      </w:r>
-    </w:p>
-    <w:p>
-      <w:pPr>
-        <w:pStyle w:val="ListBullet"/>
-      </w:pPr>
-      <w:r>
-        <w:rPr>
-          <w:rFonts w:ascii="Calibri" w:hAnsi="Calibri"/>
-          <w:color w:val="182420"/>
-          <w:sz w:val="22"/>
-        </w:rPr>
-        <w:t>Không tự đăng bài hoặc chạy quảng cáo công khai nếu chưa có quy trình riêng được xác nhận.</w:t>
-      </w:r>
-    </w:p>
-    <w:p>
-      <w:pPr>
-        <w:pStyle w:val="ListBullet"/>
-      </w:pPr>
-      <w:r>
-        <w:rPr>
-          <w:rFonts w:ascii="Calibri" w:hAnsi="Calibri"/>
-          <w:color w:val="182420"/>
-          <w:sz w:val="22"/>
-        </w:rPr>
-        <w:t>Không yêu cầu người dùng gửi mật khẩu mạng xã hội hoặc thông tin thẻ thanh toán qua bot.</w:t>
-      </w:r>
-    </w:p>
-    <w:p>
-      <w:pPr>
-        <w:pStyle w:val="Heading1"/>
-      </w:pPr>
-      <w:r>
-        <w:rPr>
-          <w:rFonts w:ascii="Calibri" w:hAnsi="Calibri"/>
-          <w:color w:val="182420"/>
-          <w:sz w:val="22"/>
-        </w:rPr>
-        <w:t>17. Liên hệ</w:t>
-      </w:r>
-    </w:p>
-    <w:p>
-      <w:pPr>
-        <w:pStyle w:val="ListBullet"/>
-      </w:pPr>
-      <w:r>
-        <w:rPr>
-          <w:rFonts w:ascii="Calibri" w:hAnsi="Calibri"/>
-          <w:b/>
-          <w:color w:val="182420"/>
-          <w:sz w:val="22"/>
-        </w:rPr>
-        <w:t>Admin:</w:t>
-      </w:r>
-      <w:r>
-        <w:rPr>
-          <w:rFonts w:ascii="Calibri" w:hAnsi="Calibri"/>
-          <w:color w:val="182420"/>
-          <w:sz w:val="22"/>
-        </w:rPr>
-        <w:t xml:space="preserve"> </w:t>
-      </w:r>
-      <w:r>
-        <w:rPr>
-          <w:rFonts w:ascii="Calibri" w:hAnsi="Calibri"/>
-          <w:b/>
-          <w:color w:val="08734F"/>
-          <w:sz w:val="22"/>
-        </w:rPr>
-        <w:t>@toanaas (https://t.me/toanaas)</w:t>
-      </w:r>
-    </w:p>
-    <w:p>
-      <w:pPr>
-        <w:pStyle w:val="ListBullet"/>
-      </w:pPr>
-      <w:r>
-        <w:rPr>
-          <w:rFonts w:ascii="Calibri" w:hAnsi="Calibri"/>
-          <w:b/>
-          <w:color w:val="182420"/>
-          <w:sz w:val="22"/>
-        </w:rPr>
-        <w:t>Bot:</w:t>
-      </w:r>
-      <w:r>
-        <w:rPr>
-          <w:rFonts w:ascii="Calibri" w:hAnsi="Calibri"/>
-          <w:color w:val="182420"/>
-          <w:sz w:val="22"/>
-        </w:rPr>
-        <w:t xml:space="preserve"> </w:t>
-      </w:r>
-      <w:r>
-        <w:rPr>
-          <w:rFonts w:ascii="Calibri" w:hAnsi="Calibri"/>
-          <w:b/>
-          <w:color w:val="08734F"/>
-          <w:sz w:val="22"/>
-        </w:rPr>
-        <w:t>@toanaasbot (https://t.me/toanaasbot)</w:t>
-      </w:r>
-    </w:p>
-    <w:p>
-      <w:pPr>
-        <w:pStyle w:val="ListBullet"/>
-      </w:pPr>
-      <w:r>
-        <w:rPr>
-          <w:rFonts w:ascii="Calibri" w:hAnsi="Calibri"/>
-          <w:b/>
-          <w:color w:val="182420"/>
-          <w:sz w:val="22"/>
-        </w:rPr>
-        <w:t>Website:</w:t>
-      </w:r>
-      <w:r>
-        <w:rPr>
-          <w:rFonts w:ascii="Calibri" w:hAnsi="Calibri"/>
-          <w:color w:val="182420"/>
-          <w:sz w:val="22"/>
-        </w:rPr>
-        <w:t xml:space="preserve"> </w:t>
-      </w:r>
-      <w:r>
-        <w:rPr>
-          <w:rFonts w:ascii="Calibri" w:hAnsi="Calibri"/>
-          <w:b/>
-          <w:color w:val="08734F"/>
-          <w:sz w:val="22"/>
-        </w:rPr>
-        <w:t>www.toanaas.vn (https://www.toanaas.vn/)</w:t>
-      </w:r>
-    </w:p>
-    <w:p>
-      <w:pPr>
-        <w:pStyle w:val="ListBullet"/>
-      </w:pPr>
-      <w:r>
-        <w:rPr>
-          <w:rFonts w:ascii="Calibri" w:hAnsi="Calibri"/>
-          <w:color w:val="182420"/>
-          <w:sz w:val="22"/>
-        </w:rPr>
-        <w:t>Khi cần hỗ trợ thanh toán hoặc lỗi job, nên tạo ticket trong bot để có dữ liệu đối soát.</w:t>
+        <w:t>Khi cần hỗ trợ thanh toán hoặc lỗi xử lý, hãy gửi thông tin rõ ràng để TOAN AAS kiểm tra nhanh hơn.</w:t>
       </w:r>
     </w:p>
     <w:sectPr>

</xml_diff>